<commit_message>
feat: embed real screenshots in user manual
</commit_message>
<xml_diff>
--- a/frontend/public/user-manual.docx
+++ b/frontend/public/user-manual.docx
@@ -2315,59 +2315,51 @@
         <w:t xml:space="preserve">2. How to Log In</w:t>
       </w:r>
     </w:p>
-    <w:tbl>
-      <w:tblPr>
-        <w:tblW w:type="dxa" w:w="9360"/>
-        <w:tblBorders>
-          <w:top w:val="single" w:color="auto" w:sz="4"/>
-          <w:left w:val="single" w:color="auto" w:sz="4"/>
-          <w:bottom w:val="single" w:color="auto" w:sz="4"/>
-          <w:right w:val="single" w:color="auto" w:sz="4"/>
-          <w:insideH w:val="single" w:color="auto" w:sz="4"/>
-          <w:insideV w:val="single" w:color="auto" w:sz="4"/>
-        </w:tblBorders>
-      </w:tblPr>
-      <w:tblGrid>
-        <w:gridCol w:w="9360"/>
-      </w:tblGrid>
-      <w:tr>
-        <w:tc>
-          <w:tcPr>
-            <w:tcW w:type="dxa" w:w="9360"/>
-            <w:tcBorders>
-              <w:top w:val="single" w:color="D1D5DB" w:sz="1"/>
-              <w:left w:val="single" w:color="D1D5DB" w:sz="1"/>
-              <w:bottom w:val="single" w:color="D1D5DB" w:sz="1"/>
-              <w:right w:val="single" w:color="D1D5DB" w:sz="1"/>
-            </w:tcBorders>
-            <w:shd w:fill="F3F4F6" w:val="clear"/>
-            <w:tcMar>
-              <w:top w:type="dxa" w:w="200"/>
-              <w:left w:type="dxa" w:w="300"/>
-              <w:bottom w:type="dxa" w:w="200"/>
-              <w:right w:type="dxa" w:w="300"/>
-            </w:tcMar>
-            <w:vAlign w:val="center"/>
-          </w:tcPr>
-          <w:p>
-            <w:pPr>
-              <w:jc w:val="center"/>
-            </w:pPr>
-            <w:r>
-              <w:rPr>
-                <w:rFonts w:ascii="Arial" w:cs="Arial" w:eastAsia="Arial" w:hAnsi="Arial"/>
-                <w:i/>
-                <w:iCs/>
-                <w:color w:val="9CA3AF"/>
-                <w:sz w:val="20"/>
-                <w:szCs w:val="20"/>
-              </w:rPr>
-              <w:t xml:space="preserve">[ Screenshot will be added ]</w:t>
-            </w:r>
-          </w:p>
-        </w:tc>
-      </w:tr>
-    </w:tbl>
+    <w:p>
+      <w:pPr>
+        <w:spacing w:after="160" w:before="80"/>
+      </w:pPr>
+      <w:r>
+        <w:drawing>
+          <wp:inline distT="0" distB="0" distL="0" distR="0">
+            <wp:extent cx="5905500" cy="3333750"/>
+            <wp:effectExtent t="0" r="0" b="0" l="0"/>
+            <wp:docPr id="1" name="01-login" descr="01-login" title="01-login"/>
+            <wp:cNvGraphicFramePr>
+              <a:graphicFrameLocks xmlns:a="http://schemas.openxmlformats.org/drawingml/2006/main" noChangeAspect="1"/>
+            </wp:cNvGraphicFramePr>
+            <a:graphic xmlns:a="http://schemas.openxmlformats.org/drawingml/2006/main">
+              <a:graphicData uri="http://schemas.openxmlformats.org/drawingml/2006/picture">
+                <pic:pic xmlns:pic="http://schemas.openxmlformats.org/drawingml/2006/picture">
+                  <pic:nvPicPr>
+                    <pic:cNvPr id="0" name="" descr=""/>
+                    <pic:cNvPicPr>
+                      <a:picLocks noChangeAspect="1" noChangeArrowheads="1"/>
+                    </pic:cNvPicPr>
+                  </pic:nvPicPr>
+                  <pic:blipFill>
+                    <a:blip r:embed="rId9" cstate="none"/>
+                    <a:srcRect/>
+                    <a:stretch>
+                      <a:fillRect/>
+                    </a:stretch>
+                  </pic:blipFill>
+                  <pic:spPr bwMode="auto">
+                    <a:xfrm>
+                      <a:off x="0" y="0"/>
+                      <a:ext cx="5905500" cy="3333750"/>
+                    </a:xfrm>
+                    <a:prstGeom prst="rect">
+                      <a:avLst/>
+                    </a:prstGeom>
+                  </pic:spPr>
+                </pic:pic>
+              </a:graphicData>
+            </a:graphic>
+          </wp:inline>
+        </w:drawing>
+      </w:r>
+    </w:p>
     <w:p>
       <w:pPr>
         <w:spacing w:after="120"/>
@@ -2587,59 +2579,51 @@
         <w:t xml:space="preserve">Dashboard</w:t>
       </w:r>
     </w:p>
-    <w:tbl>
-      <w:tblPr>
-        <w:tblW w:type="dxa" w:w="9360"/>
-        <w:tblBorders>
-          <w:top w:val="single" w:color="auto" w:sz="4"/>
-          <w:left w:val="single" w:color="auto" w:sz="4"/>
-          <w:bottom w:val="single" w:color="auto" w:sz="4"/>
-          <w:right w:val="single" w:color="auto" w:sz="4"/>
-          <w:insideH w:val="single" w:color="auto" w:sz="4"/>
-          <w:insideV w:val="single" w:color="auto" w:sz="4"/>
-        </w:tblBorders>
-      </w:tblPr>
-      <w:tblGrid>
-        <w:gridCol w:w="9360"/>
-      </w:tblGrid>
-      <w:tr>
-        <w:tc>
-          <w:tcPr>
-            <w:tcW w:type="dxa" w:w="9360"/>
-            <w:tcBorders>
-              <w:top w:val="single" w:color="D1D5DB" w:sz="1"/>
-              <w:left w:val="single" w:color="D1D5DB" w:sz="1"/>
-              <w:bottom w:val="single" w:color="D1D5DB" w:sz="1"/>
-              <w:right w:val="single" w:color="D1D5DB" w:sz="1"/>
-            </w:tcBorders>
-            <w:shd w:fill="F3F4F6" w:val="clear"/>
-            <w:tcMar>
-              <w:top w:type="dxa" w:w="200"/>
-              <w:left w:type="dxa" w:w="300"/>
-              <w:bottom w:type="dxa" w:w="200"/>
-              <w:right w:type="dxa" w:w="300"/>
-            </w:tcMar>
-            <w:vAlign w:val="center"/>
-          </w:tcPr>
-          <w:p>
-            <w:pPr>
-              <w:jc w:val="center"/>
-            </w:pPr>
-            <w:r>
-              <w:rPr>
-                <w:rFonts w:ascii="Arial" w:cs="Arial" w:eastAsia="Arial" w:hAnsi="Arial"/>
-                <w:i/>
-                <w:iCs/>
-                <w:color w:val="9CA3AF"/>
-                <w:sz w:val="20"/>
-                <w:szCs w:val="20"/>
-              </w:rPr>
-              <w:t xml:space="preserve">[ Screenshot will be added ]</w:t>
-            </w:r>
-          </w:p>
-        </w:tc>
-      </w:tr>
-    </w:tbl>
+    <w:p>
+      <w:pPr>
+        <w:spacing w:after="160" w:before="80"/>
+      </w:pPr>
+      <w:r>
+        <w:drawing>
+          <wp:inline distT="0" distB="0" distL="0" distR="0">
+            <wp:extent cx="5905500" cy="3333750"/>
+            <wp:effectExtent t="0" r="0" b="0" l="0"/>
+            <wp:docPr id="1" name="19-employee-dashboard" descr="19-employee-dashboard" title="19-employee-dashboard"/>
+            <wp:cNvGraphicFramePr>
+              <a:graphicFrameLocks xmlns:a="http://schemas.openxmlformats.org/drawingml/2006/main" noChangeAspect="1"/>
+            </wp:cNvGraphicFramePr>
+            <a:graphic xmlns:a="http://schemas.openxmlformats.org/drawingml/2006/main">
+              <a:graphicData uri="http://schemas.openxmlformats.org/drawingml/2006/picture">
+                <pic:pic xmlns:pic="http://schemas.openxmlformats.org/drawingml/2006/picture">
+                  <pic:nvPicPr>
+                    <pic:cNvPr id="0" name="" descr=""/>
+                    <pic:cNvPicPr>
+                      <a:picLocks noChangeAspect="1" noChangeArrowheads="1"/>
+                    </pic:cNvPicPr>
+                  </pic:nvPicPr>
+                  <pic:blipFill>
+                    <a:blip r:embed="rId9" cstate="none"/>
+                    <a:srcRect/>
+                    <a:stretch>
+                      <a:fillRect/>
+                    </a:stretch>
+                  </pic:blipFill>
+                  <pic:spPr bwMode="auto">
+                    <a:xfrm>
+                      <a:off x="0" y="0"/>
+                      <a:ext cx="5905500" cy="3333750"/>
+                    </a:xfrm>
+                    <a:prstGeom prst="rect">
+                      <a:avLst/>
+                    </a:prstGeom>
+                  </pic:spPr>
+                </pic:pic>
+              </a:graphicData>
+            </a:graphic>
+          </wp:inline>
+        </w:drawing>
+      </w:r>
+    </w:p>
     <w:p>
       <w:pPr>
         <w:spacing w:after="80"/>
@@ -2675,59 +2659,51 @@
         <w:t xml:space="preserve">My Timecard</w:t>
       </w:r>
     </w:p>
-    <w:tbl>
-      <w:tblPr>
-        <w:tblW w:type="dxa" w:w="9360"/>
-        <w:tblBorders>
-          <w:top w:val="single" w:color="auto" w:sz="4"/>
-          <w:left w:val="single" w:color="auto" w:sz="4"/>
-          <w:bottom w:val="single" w:color="auto" w:sz="4"/>
-          <w:right w:val="single" w:color="auto" w:sz="4"/>
-          <w:insideH w:val="single" w:color="auto" w:sz="4"/>
-          <w:insideV w:val="single" w:color="auto" w:sz="4"/>
-        </w:tblBorders>
-      </w:tblPr>
-      <w:tblGrid>
-        <w:gridCol w:w="9360"/>
-      </w:tblGrid>
-      <w:tr>
-        <w:tc>
-          <w:tcPr>
-            <w:tcW w:type="dxa" w:w="9360"/>
-            <w:tcBorders>
-              <w:top w:val="single" w:color="D1D5DB" w:sz="1"/>
-              <w:left w:val="single" w:color="D1D5DB" w:sz="1"/>
-              <w:bottom w:val="single" w:color="D1D5DB" w:sz="1"/>
-              <w:right w:val="single" w:color="D1D5DB" w:sz="1"/>
-            </w:tcBorders>
-            <w:shd w:fill="F3F4F6" w:val="clear"/>
-            <w:tcMar>
-              <w:top w:type="dxa" w:w="200"/>
-              <w:left w:type="dxa" w:w="300"/>
-              <w:bottom w:type="dxa" w:w="200"/>
-              <w:right w:type="dxa" w:w="300"/>
-            </w:tcMar>
-            <w:vAlign w:val="center"/>
-          </w:tcPr>
-          <w:p>
-            <w:pPr>
-              <w:jc w:val="center"/>
-            </w:pPr>
-            <w:r>
-              <w:rPr>
-                <w:rFonts w:ascii="Arial" w:cs="Arial" w:eastAsia="Arial" w:hAnsi="Arial"/>
-                <w:i/>
-                <w:iCs/>
-                <w:color w:val="9CA3AF"/>
-                <w:sz w:val="20"/>
-                <w:szCs w:val="20"/>
-              </w:rPr>
-              <w:t xml:space="preserve">[ Screenshot will be added ]</w:t>
-            </w:r>
-          </w:p>
-        </w:tc>
-      </w:tr>
-    </w:tbl>
+    <w:p>
+      <w:pPr>
+        <w:spacing w:after="160" w:before="80"/>
+      </w:pPr>
+      <w:r>
+        <w:drawing>
+          <wp:inline distT="0" distB="0" distL="0" distR="0">
+            <wp:extent cx="5905500" cy="3333750"/>
+            <wp:effectExtent t="0" r="0" b="0" l="0"/>
+            <wp:docPr id="1" name="14-my-timecard" descr="14-my-timecard" title="14-my-timecard"/>
+            <wp:cNvGraphicFramePr>
+              <a:graphicFrameLocks xmlns:a="http://schemas.openxmlformats.org/drawingml/2006/main" noChangeAspect="1"/>
+            </wp:cNvGraphicFramePr>
+            <a:graphic xmlns:a="http://schemas.openxmlformats.org/drawingml/2006/main">
+              <a:graphicData uri="http://schemas.openxmlformats.org/drawingml/2006/picture">
+                <pic:pic xmlns:pic="http://schemas.openxmlformats.org/drawingml/2006/picture">
+                  <pic:nvPicPr>
+                    <pic:cNvPr id="0" name="" descr=""/>
+                    <pic:cNvPicPr>
+                      <a:picLocks noChangeAspect="1" noChangeArrowheads="1"/>
+                    </pic:cNvPicPr>
+                  </pic:nvPicPr>
+                  <pic:blipFill>
+                    <a:blip r:embed="rId9" cstate="none"/>
+                    <a:srcRect/>
+                    <a:stretch>
+                      <a:fillRect/>
+                    </a:stretch>
+                  </pic:blipFill>
+                  <pic:spPr bwMode="auto">
+                    <a:xfrm>
+                      <a:off x="0" y="0"/>
+                      <a:ext cx="5905500" cy="3333750"/>
+                    </a:xfrm>
+                    <a:prstGeom prst="rect">
+                      <a:avLst/>
+                    </a:prstGeom>
+                  </pic:spPr>
+                </pic:pic>
+              </a:graphicData>
+            </a:graphic>
+          </wp:inline>
+        </w:drawing>
+      </w:r>
+    </w:p>
     <w:p>
       <w:pPr>
         <w:spacing w:after="80"/>
@@ -2835,59 +2811,51 @@
         <w:t xml:space="preserve">Overtime</w:t>
       </w:r>
     </w:p>
-    <w:tbl>
-      <w:tblPr>
-        <w:tblW w:type="dxa" w:w="9360"/>
-        <w:tblBorders>
-          <w:top w:val="single" w:color="auto" w:sz="4"/>
-          <w:left w:val="single" w:color="auto" w:sz="4"/>
-          <w:bottom w:val="single" w:color="auto" w:sz="4"/>
-          <w:right w:val="single" w:color="auto" w:sz="4"/>
-          <w:insideH w:val="single" w:color="auto" w:sz="4"/>
-          <w:insideV w:val="single" w:color="auto" w:sz="4"/>
-        </w:tblBorders>
-      </w:tblPr>
-      <w:tblGrid>
-        <w:gridCol w:w="9360"/>
-      </w:tblGrid>
-      <w:tr>
-        <w:tc>
-          <w:tcPr>
-            <w:tcW w:type="dxa" w:w="9360"/>
-            <w:tcBorders>
-              <w:top w:val="single" w:color="D1D5DB" w:sz="1"/>
-              <w:left w:val="single" w:color="D1D5DB" w:sz="1"/>
-              <w:bottom w:val="single" w:color="D1D5DB" w:sz="1"/>
-              <w:right w:val="single" w:color="D1D5DB" w:sz="1"/>
-            </w:tcBorders>
-            <w:shd w:fill="F3F4F6" w:val="clear"/>
-            <w:tcMar>
-              <w:top w:type="dxa" w:w="200"/>
-              <w:left w:type="dxa" w:w="300"/>
-              <w:bottom w:type="dxa" w:w="200"/>
-              <w:right w:type="dxa" w:w="300"/>
-            </w:tcMar>
-            <w:vAlign w:val="center"/>
-          </w:tcPr>
-          <w:p>
-            <w:pPr>
-              <w:jc w:val="center"/>
-            </w:pPr>
-            <w:r>
-              <w:rPr>
-                <w:rFonts w:ascii="Arial" w:cs="Arial" w:eastAsia="Arial" w:hAnsi="Arial"/>
-                <w:i/>
-                <w:iCs/>
-                <w:color w:val="9CA3AF"/>
-                <w:sz w:val="20"/>
-                <w:szCs w:val="20"/>
-              </w:rPr>
-              <w:t xml:space="preserve">[ Screenshot will be added ]</w:t>
-            </w:r>
-          </w:p>
-        </w:tc>
-      </w:tr>
-    </w:tbl>
+    <w:p>
+      <w:pPr>
+        <w:spacing w:after="160" w:before="80"/>
+      </w:pPr>
+      <w:r>
+        <w:drawing>
+          <wp:inline distT="0" distB="0" distL="0" distR="0">
+            <wp:extent cx="5905500" cy="3333750"/>
+            <wp:effectExtent t="0" r="0" b="0" l="0"/>
+            <wp:docPr id="1" name="14-my-timecard" descr="14-my-timecard" title="14-my-timecard"/>
+            <wp:cNvGraphicFramePr>
+              <a:graphicFrameLocks xmlns:a="http://schemas.openxmlformats.org/drawingml/2006/main" noChangeAspect="1"/>
+            </wp:cNvGraphicFramePr>
+            <a:graphic xmlns:a="http://schemas.openxmlformats.org/drawingml/2006/main">
+              <a:graphicData uri="http://schemas.openxmlformats.org/drawingml/2006/picture">
+                <pic:pic xmlns:pic="http://schemas.openxmlformats.org/drawingml/2006/picture">
+                  <pic:nvPicPr>
+                    <pic:cNvPr id="0" name="" descr=""/>
+                    <pic:cNvPicPr>
+                      <a:picLocks noChangeAspect="1" noChangeArrowheads="1"/>
+                    </pic:cNvPicPr>
+                  </pic:nvPicPr>
+                  <pic:blipFill>
+                    <a:blip r:embed="rId9" cstate="none"/>
+                    <a:srcRect/>
+                    <a:stretch>
+                      <a:fillRect/>
+                    </a:stretch>
+                  </pic:blipFill>
+                  <pic:spPr bwMode="auto">
+                    <a:xfrm>
+                      <a:off x="0" y="0"/>
+                      <a:ext cx="5905500" cy="3333750"/>
+                    </a:xfrm>
+                    <a:prstGeom prst="rect">
+                      <a:avLst/>
+                    </a:prstGeom>
+                  </pic:spPr>
+                </pic:pic>
+              </a:graphicData>
+            </a:graphic>
+          </wp:inline>
+        </w:drawing>
+      </w:r>
+    </w:p>
     <w:p>
       <w:pPr>
         <w:spacing w:after="80"/>
@@ -2959,59 +2927,51 @@
         <w:t xml:space="preserve">My Leave</w:t>
       </w:r>
     </w:p>
-    <w:tbl>
-      <w:tblPr>
-        <w:tblW w:type="dxa" w:w="9360"/>
-        <w:tblBorders>
-          <w:top w:val="single" w:color="auto" w:sz="4"/>
-          <w:left w:val="single" w:color="auto" w:sz="4"/>
-          <w:bottom w:val="single" w:color="auto" w:sz="4"/>
-          <w:right w:val="single" w:color="auto" w:sz="4"/>
-          <w:insideH w:val="single" w:color="auto" w:sz="4"/>
-          <w:insideV w:val="single" w:color="auto" w:sz="4"/>
-        </w:tblBorders>
-      </w:tblPr>
-      <w:tblGrid>
-        <w:gridCol w:w="9360"/>
-      </w:tblGrid>
-      <w:tr>
-        <w:tc>
-          <w:tcPr>
-            <w:tcW w:type="dxa" w:w="9360"/>
-            <w:tcBorders>
-              <w:top w:val="single" w:color="D1D5DB" w:sz="1"/>
-              <w:left w:val="single" w:color="D1D5DB" w:sz="1"/>
-              <w:bottom w:val="single" w:color="D1D5DB" w:sz="1"/>
-              <w:right w:val="single" w:color="D1D5DB" w:sz="1"/>
-            </w:tcBorders>
-            <w:shd w:fill="F3F4F6" w:val="clear"/>
-            <w:tcMar>
-              <w:top w:type="dxa" w:w="200"/>
-              <w:left w:type="dxa" w:w="300"/>
-              <w:bottom w:type="dxa" w:w="200"/>
-              <w:right w:type="dxa" w:w="300"/>
-            </w:tcMar>
-            <w:vAlign w:val="center"/>
-          </w:tcPr>
-          <w:p>
-            <w:pPr>
-              <w:jc w:val="center"/>
-            </w:pPr>
-            <w:r>
-              <w:rPr>
-                <w:rFonts w:ascii="Arial" w:cs="Arial" w:eastAsia="Arial" w:hAnsi="Arial"/>
-                <w:i/>
-                <w:iCs/>
-                <w:color w:val="9CA3AF"/>
-                <w:sz w:val="20"/>
-                <w:szCs w:val="20"/>
-              </w:rPr>
-              <w:t xml:space="preserve">[ Screenshot will be added ]</w:t>
-            </w:r>
-          </w:p>
-        </w:tc>
-      </w:tr>
-    </w:tbl>
+    <w:p>
+      <w:pPr>
+        <w:spacing w:after="160" w:before="80"/>
+      </w:pPr>
+      <w:r>
+        <w:drawing>
+          <wp:inline distT="0" distB="0" distL="0" distR="0">
+            <wp:extent cx="5905500" cy="3333750"/>
+            <wp:effectExtent t="0" r="0" b="0" l="0"/>
+            <wp:docPr id="1" name="15-my-leave" descr="15-my-leave" title="15-my-leave"/>
+            <wp:cNvGraphicFramePr>
+              <a:graphicFrameLocks xmlns:a="http://schemas.openxmlformats.org/drawingml/2006/main" noChangeAspect="1"/>
+            </wp:cNvGraphicFramePr>
+            <a:graphic xmlns:a="http://schemas.openxmlformats.org/drawingml/2006/main">
+              <a:graphicData uri="http://schemas.openxmlformats.org/drawingml/2006/picture">
+                <pic:pic xmlns:pic="http://schemas.openxmlformats.org/drawingml/2006/picture">
+                  <pic:nvPicPr>
+                    <pic:cNvPr id="0" name="" descr=""/>
+                    <pic:cNvPicPr>
+                      <a:picLocks noChangeAspect="1" noChangeArrowheads="1"/>
+                    </pic:cNvPicPr>
+                  </pic:nvPicPr>
+                  <pic:blipFill>
+                    <a:blip r:embed="rId9" cstate="none"/>
+                    <a:srcRect/>
+                    <a:stretch>
+                      <a:fillRect/>
+                    </a:stretch>
+                  </pic:blipFill>
+                  <pic:spPr bwMode="auto">
+                    <a:xfrm>
+                      <a:off x="0" y="0"/>
+                      <a:ext cx="5905500" cy="3333750"/>
+                    </a:xfrm>
+                    <a:prstGeom prst="rect">
+                      <a:avLst/>
+                    </a:prstGeom>
+                  </pic:spPr>
+                </pic:pic>
+              </a:graphicData>
+            </a:graphic>
+          </wp:inline>
+        </w:drawing>
+      </w:r>
+    </w:p>
     <w:p>
       <w:pPr>
         <w:spacing w:after="80"/>
@@ -3119,59 +3079,51 @@
         <w:t xml:space="preserve">My Calendar</w:t>
       </w:r>
     </w:p>
-    <w:tbl>
-      <w:tblPr>
-        <w:tblW w:type="dxa" w:w="9360"/>
-        <w:tblBorders>
-          <w:top w:val="single" w:color="auto" w:sz="4"/>
-          <w:left w:val="single" w:color="auto" w:sz="4"/>
-          <w:bottom w:val="single" w:color="auto" w:sz="4"/>
-          <w:right w:val="single" w:color="auto" w:sz="4"/>
-          <w:insideH w:val="single" w:color="auto" w:sz="4"/>
-          <w:insideV w:val="single" w:color="auto" w:sz="4"/>
-        </w:tblBorders>
-      </w:tblPr>
-      <w:tblGrid>
-        <w:gridCol w:w="9360"/>
-      </w:tblGrid>
-      <w:tr>
-        <w:tc>
-          <w:tcPr>
-            <w:tcW w:type="dxa" w:w="9360"/>
-            <w:tcBorders>
-              <w:top w:val="single" w:color="D1D5DB" w:sz="1"/>
-              <w:left w:val="single" w:color="D1D5DB" w:sz="1"/>
-              <w:bottom w:val="single" w:color="D1D5DB" w:sz="1"/>
-              <w:right w:val="single" w:color="D1D5DB" w:sz="1"/>
-            </w:tcBorders>
-            <w:shd w:fill="F3F4F6" w:val="clear"/>
-            <w:tcMar>
-              <w:top w:type="dxa" w:w="200"/>
-              <w:left w:type="dxa" w:w="300"/>
-              <w:bottom w:type="dxa" w:w="200"/>
-              <w:right w:type="dxa" w:w="300"/>
-            </w:tcMar>
-            <w:vAlign w:val="center"/>
-          </w:tcPr>
-          <w:p>
-            <w:pPr>
-              <w:jc w:val="center"/>
-            </w:pPr>
-            <w:r>
-              <w:rPr>
-                <w:rFonts w:ascii="Arial" w:cs="Arial" w:eastAsia="Arial" w:hAnsi="Arial"/>
-                <w:i/>
-                <w:iCs/>
-                <w:color w:val="9CA3AF"/>
-                <w:sz w:val="20"/>
-                <w:szCs w:val="20"/>
-              </w:rPr>
-              <w:t xml:space="preserve">[ Screenshot will be added ]</w:t>
-            </w:r>
-          </w:p>
-        </w:tc>
-      </w:tr>
-    </w:tbl>
+    <w:p>
+      <w:pPr>
+        <w:spacing w:after="160" w:before="80"/>
+      </w:pPr>
+      <w:r>
+        <w:drawing>
+          <wp:inline distT="0" distB="0" distL="0" distR="0">
+            <wp:extent cx="5905500" cy="3333750"/>
+            <wp:effectExtent t="0" r="0" b="0" l="0"/>
+            <wp:docPr id="1" name="16-my-calendar" descr="16-my-calendar" title="16-my-calendar"/>
+            <wp:cNvGraphicFramePr>
+              <a:graphicFrameLocks xmlns:a="http://schemas.openxmlformats.org/drawingml/2006/main" noChangeAspect="1"/>
+            </wp:cNvGraphicFramePr>
+            <a:graphic xmlns:a="http://schemas.openxmlformats.org/drawingml/2006/main">
+              <a:graphicData uri="http://schemas.openxmlformats.org/drawingml/2006/picture">
+                <pic:pic xmlns:pic="http://schemas.openxmlformats.org/drawingml/2006/picture">
+                  <pic:nvPicPr>
+                    <pic:cNvPr id="0" name="" descr=""/>
+                    <pic:cNvPicPr>
+                      <a:picLocks noChangeAspect="1" noChangeArrowheads="1"/>
+                    </pic:cNvPicPr>
+                  </pic:nvPicPr>
+                  <pic:blipFill>
+                    <a:blip r:embed="rId9" cstate="none"/>
+                    <a:srcRect/>
+                    <a:stretch>
+                      <a:fillRect/>
+                    </a:stretch>
+                  </pic:blipFill>
+                  <pic:spPr bwMode="auto">
+                    <a:xfrm>
+                      <a:off x="0" y="0"/>
+                      <a:ext cx="5905500" cy="3333750"/>
+                    </a:xfrm>
+                    <a:prstGeom prst="rect">
+                      <a:avLst/>
+                    </a:prstGeom>
+                  </pic:spPr>
+                </pic:pic>
+              </a:graphicData>
+            </a:graphic>
+          </wp:inline>
+        </w:drawing>
+      </w:r>
+    </w:p>
     <w:p>
       <w:pPr>
         <w:spacing w:after="80"/>
@@ -3297,59 +3249,51 @@
         <w:t xml:space="preserve">Inventory</w:t>
       </w:r>
     </w:p>
-    <w:tbl>
-      <w:tblPr>
-        <w:tblW w:type="dxa" w:w="9360"/>
-        <w:tblBorders>
-          <w:top w:val="single" w:color="auto" w:sz="4"/>
-          <w:left w:val="single" w:color="auto" w:sz="4"/>
-          <w:bottom w:val="single" w:color="auto" w:sz="4"/>
-          <w:right w:val="single" w:color="auto" w:sz="4"/>
-          <w:insideH w:val="single" w:color="auto" w:sz="4"/>
-          <w:insideV w:val="single" w:color="auto" w:sz="4"/>
-        </w:tblBorders>
-      </w:tblPr>
-      <w:tblGrid>
-        <w:gridCol w:w="9360"/>
-      </w:tblGrid>
-      <w:tr>
-        <w:tc>
-          <w:tcPr>
-            <w:tcW w:type="dxa" w:w="9360"/>
-            <w:tcBorders>
-              <w:top w:val="single" w:color="D1D5DB" w:sz="1"/>
-              <w:left w:val="single" w:color="D1D5DB" w:sz="1"/>
-              <w:bottom w:val="single" w:color="D1D5DB" w:sz="1"/>
-              <w:right w:val="single" w:color="D1D5DB" w:sz="1"/>
-            </w:tcBorders>
-            <w:shd w:fill="F3F4F6" w:val="clear"/>
-            <w:tcMar>
-              <w:top w:type="dxa" w:w="200"/>
-              <w:left w:type="dxa" w:w="300"/>
-              <w:bottom w:type="dxa" w:w="200"/>
-              <w:right w:type="dxa" w:w="300"/>
-            </w:tcMar>
-            <w:vAlign w:val="center"/>
-          </w:tcPr>
-          <w:p>
-            <w:pPr>
-              <w:jc w:val="center"/>
-            </w:pPr>
-            <w:r>
-              <w:rPr>
-                <w:rFonts w:ascii="Arial" w:cs="Arial" w:eastAsia="Arial" w:hAnsi="Arial"/>
-                <w:i/>
-                <w:iCs/>
-                <w:color w:val="9CA3AF"/>
-                <w:sz w:val="20"/>
-                <w:szCs w:val="20"/>
-              </w:rPr>
-              <w:t xml:space="preserve">[ Screenshot will be added ]</w:t>
-            </w:r>
-          </w:p>
-        </w:tc>
-      </w:tr>
-    </w:tbl>
+    <w:p>
+      <w:pPr>
+        <w:spacing w:after="160" w:before="80"/>
+      </w:pPr>
+      <w:r>
+        <w:drawing>
+          <wp:inline distT="0" distB="0" distL="0" distR="0">
+            <wp:extent cx="5905500" cy="3333750"/>
+            <wp:effectExtent t="0" r="0" b="0" l="0"/>
+            <wp:docPr id="1" name="04-inventory" descr="04-inventory" title="04-inventory"/>
+            <wp:cNvGraphicFramePr>
+              <a:graphicFrameLocks xmlns:a="http://schemas.openxmlformats.org/drawingml/2006/main" noChangeAspect="1"/>
+            </wp:cNvGraphicFramePr>
+            <a:graphic xmlns:a="http://schemas.openxmlformats.org/drawingml/2006/main">
+              <a:graphicData uri="http://schemas.openxmlformats.org/drawingml/2006/picture">
+                <pic:pic xmlns:pic="http://schemas.openxmlformats.org/drawingml/2006/picture">
+                  <pic:nvPicPr>
+                    <pic:cNvPr id="0" name="" descr=""/>
+                    <pic:cNvPicPr>
+                      <a:picLocks noChangeAspect="1" noChangeArrowheads="1"/>
+                    </pic:cNvPicPr>
+                  </pic:nvPicPr>
+                  <pic:blipFill>
+                    <a:blip r:embed="rId9" cstate="none"/>
+                    <a:srcRect/>
+                    <a:stretch>
+                      <a:fillRect/>
+                    </a:stretch>
+                  </pic:blipFill>
+                  <pic:spPr bwMode="auto">
+                    <a:xfrm>
+                      <a:off x="0" y="0"/>
+                      <a:ext cx="5905500" cy="3333750"/>
+                    </a:xfrm>
+                    <a:prstGeom prst="rect">
+                      <a:avLst/>
+                    </a:prstGeom>
+                  </pic:spPr>
+                </pic:pic>
+              </a:graphicData>
+            </a:graphic>
+          </wp:inline>
+        </w:drawing>
+      </w:r>
+    </w:p>
     <w:p>
       <w:pPr>
         <w:spacing w:after="80"/>
@@ -3385,59 +3329,51 @@
         <w:t xml:space="preserve">Quotations</w:t>
       </w:r>
     </w:p>
-    <w:tbl>
-      <w:tblPr>
-        <w:tblW w:type="dxa" w:w="9360"/>
-        <w:tblBorders>
-          <w:top w:val="single" w:color="auto" w:sz="4"/>
-          <w:left w:val="single" w:color="auto" w:sz="4"/>
-          <w:bottom w:val="single" w:color="auto" w:sz="4"/>
-          <w:right w:val="single" w:color="auto" w:sz="4"/>
-          <w:insideH w:val="single" w:color="auto" w:sz="4"/>
-          <w:insideV w:val="single" w:color="auto" w:sz="4"/>
-        </w:tblBorders>
-      </w:tblPr>
-      <w:tblGrid>
-        <w:gridCol w:w="9360"/>
-      </w:tblGrid>
-      <w:tr>
-        <w:tc>
-          <w:tcPr>
-            <w:tcW w:type="dxa" w:w="9360"/>
-            <w:tcBorders>
-              <w:top w:val="single" w:color="D1D5DB" w:sz="1"/>
-              <w:left w:val="single" w:color="D1D5DB" w:sz="1"/>
-              <w:bottom w:val="single" w:color="D1D5DB" w:sz="1"/>
-              <w:right w:val="single" w:color="D1D5DB" w:sz="1"/>
-            </w:tcBorders>
-            <w:shd w:fill="F3F4F6" w:val="clear"/>
-            <w:tcMar>
-              <w:top w:type="dxa" w:w="200"/>
-              <w:left w:type="dxa" w:w="300"/>
-              <w:bottom w:type="dxa" w:w="200"/>
-              <w:right w:type="dxa" w:w="300"/>
-            </w:tcMar>
-            <w:vAlign w:val="center"/>
-          </w:tcPr>
-          <w:p>
-            <w:pPr>
-              <w:jc w:val="center"/>
-            </w:pPr>
-            <w:r>
-              <w:rPr>
-                <w:rFonts w:ascii="Arial" w:cs="Arial" w:eastAsia="Arial" w:hAnsi="Arial"/>
-                <w:i/>
-                <w:iCs/>
-                <w:color w:val="9CA3AF"/>
-                <w:sz w:val="20"/>
-                <w:szCs w:val="20"/>
-              </w:rPr>
-              <w:t xml:space="preserve">[ Screenshot will be added ]</w:t>
-            </w:r>
-          </w:p>
-        </w:tc>
-      </w:tr>
-    </w:tbl>
+    <w:p>
+      <w:pPr>
+        <w:spacing w:after="160" w:before="80"/>
+      </w:pPr>
+      <w:r>
+        <w:drawing>
+          <wp:inline distT="0" distB="0" distL="0" distR="0">
+            <wp:extent cx="5905500" cy="3333750"/>
+            <wp:effectExtent t="0" r="0" b="0" l="0"/>
+            <wp:docPr id="1" name="05-quotations" descr="05-quotations" title="05-quotations"/>
+            <wp:cNvGraphicFramePr>
+              <a:graphicFrameLocks xmlns:a="http://schemas.openxmlformats.org/drawingml/2006/main" noChangeAspect="1"/>
+            </wp:cNvGraphicFramePr>
+            <a:graphic xmlns:a="http://schemas.openxmlformats.org/drawingml/2006/main">
+              <a:graphicData uri="http://schemas.openxmlformats.org/drawingml/2006/picture">
+                <pic:pic xmlns:pic="http://schemas.openxmlformats.org/drawingml/2006/picture">
+                  <pic:nvPicPr>
+                    <pic:cNvPr id="0" name="" descr=""/>
+                    <pic:cNvPicPr>
+                      <a:picLocks noChangeAspect="1" noChangeArrowheads="1"/>
+                    </pic:cNvPicPr>
+                  </pic:nvPicPr>
+                  <pic:blipFill>
+                    <a:blip r:embed="rId9" cstate="none"/>
+                    <a:srcRect/>
+                    <a:stretch>
+                      <a:fillRect/>
+                    </a:stretch>
+                  </pic:blipFill>
+                  <pic:spPr bwMode="auto">
+                    <a:xfrm>
+                      <a:off x="0" y="0"/>
+                      <a:ext cx="5905500" cy="3333750"/>
+                    </a:xfrm>
+                    <a:prstGeom prst="rect">
+                      <a:avLst/>
+                    </a:prstGeom>
+                  </pic:spPr>
+                </pic:pic>
+              </a:graphicData>
+            </a:graphic>
+          </wp:inline>
+        </w:drawing>
+      </w:r>
+    </w:p>
     <w:p>
       <w:pPr>
         <w:spacing w:after="80"/>
@@ -3563,59 +3499,51 @@
         <w:t xml:space="preserve">Offers</w:t>
       </w:r>
     </w:p>
-    <w:tbl>
-      <w:tblPr>
-        <w:tblW w:type="dxa" w:w="9360"/>
-        <w:tblBorders>
-          <w:top w:val="single" w:color="auto" w:sz="4"/>
-          <w:left w:val="single" w:color="auto" w:sz="4"/>
-          <w:bottom w:val="single" w:color="auto" w:sz="4"/>
-          <w:right w:val="single" w:color="auto" w:sz="4"/>
-          <w:insideH w:val="single" w:color="auto" w:sz="4"/>
-          <w:insideV w:val="single" w:color="auto" w:sz="4"/>
-        </w:tblBorders>
-      </w:tblPr>
-      <w:tblGrid>
-        <w:gridCol w:w="9360"/>
-      </w:tblGrid>
-      <w:tr>
-        <w:tc>
-          <w:tcPr>
-            <w:tcW w:type="dxa" w:w="9360"/>
-            <w:tcBorders>
-              <w:top w:val="single" w:color="D1D5DB" w:sz="1"/>
-              <w:left w:val="single" w:color="D1D5DB" w:sz="1"/>
-              <w:bottom w:val="single" w:color="D1D5DB" w:sz="1"/>
-              <w:right w:val="single" w:color="D1D5DB" w:sz="1"/>
-            </w:tcBorders>
-            <w:shd w:fill="F3F4F6" w:val="clear"/>
-            <w:tcMar>
-              <w:top w:type="dxa" w:w="200"/>
-              <w:left w:type="dxa" w:w="300"/>
-              <w:bottom w:type="dxa" w:w="200"/>
-              <w:right w:type="dxa" w:w="300"/>
-            </w:tcMar>
-            <w:vAlign w:val="center"/>
-          </w:tcPr>
-          <w:p>
-            <w:pPr>
-              <w:jc w:val="center"/>
-            </w:pPr>
-            <w:r>
-              <w:rPr>
-                <w:rFonts w:ascii="Arial" w:cs="Arial" w:eastAsia="Arial" w:hAnsi="Arial"/>
-                <w:i/>
-                <w:iCs/>
-                <w:color w:val="9CA3AF"/>
-                <w:sz w:val="20"/>
-                <w:szCs w:val="20"/>
-              </w:rPr>
-              <w:t xml:space="preserve">[ Screenshot will be added ]</w:t>
-            </w:r>
-          </w:p>
-        </w:tc>
-      </w:tr>
-    </w:tbl>
+    <w:p>
+      <w:pPr>
+        <w:spacing w:after="160" w:before="80"/>
+      </w:pPr>
+      <w:r>
+        <w:drawing>
+          <wp:inline distT="0" distB="0" distL="0" distR="0">
+            <wp:extent cx="5905500" cy="3333750"/>
+            <wp:effectExtent t="0" r="0" b="0" l="0"/>
+            <wp:docPr id="1" name="06-offers" descr="06-offers" title="06-offers"/>
+            <wp:cNvGraphicFramePr>
+              <a:graphicFrameLocks xmlns:a="http://schemas.openxmlformats.org/drawingml/2006/main" noChangeAspect="1"/>
+            </wp:cNvGraphicFramePr>
+            <a:graphic xmlns:a="http://schemas.openxmlformats.org/drawingml/2006/main">
+              <a:graphicData uri="http://schemas.openxmlformats.org/drawingml/2006/picture">
+                <pic:pic xmlns:pic="http://schemas.openxmlformats.org/drawingml/2006/picture">
+                  <pic:nvPicPr>
+                    <pic:cNvPr id="0" name="" descr=""/>
+                    <pic:cNvPicPr>
+                      <a:picLocks noChangeAspect="1" noChangeArrowheads="1"/>
+                    </pic:cNvPicPr>
+                  </pic:nvPicPr>
+                  <pic:blipFill>
+                    <a:blip r:embed="rId9" cstate="none"/>
+                    <a:srcRect/>
+                    <a:stretch>
+                      <a:fillRect/>
+                    </a:stretch>
+                  </pic:blipFill>
+                  <pic:spPr bwMode="auto">
+                    <a:xfrm>
+                      <a:off x="0" y="0"/>
+                      <a:ext cx="5905500" cy="3333750"/>
+                    </a:xfrm>
+                    <a:prstGeom prst="rect">
+                      <a:avLst/>
+                    </a:prstGeom>
+                  </pic:spPr>
+                </pic:pic>
+              </a:graphicData>
+            </a:graphic>
+          </wp:inline>
+        </w:drawing>
+      </w:r>
+    </w:p>
     <w:p>
       <w:pPr>
         <w:spacing w:after="80"/>
@@ -3651,59 +3579,51 @@
         <w:t xml:space="preserve">My Payslips</w:t>
       </w:r>
     </w:p>
-    <w:tbl>
-      <w:tblPr>
-        <w:tblW w:type="dxa" w:w="9360"/>
-        <w:tblBorders>
-          <w:top w:val="single" w:color="auto" w:sz="4"/>
-          <w:left w:val="single" w:color="auto" w:sz="4"/>
-          <w:bottom w:val="single" w:color="auto" w:sz="4"/>
-          <w:right w:val="single" w:color="auto" w:sz="4"/>
-          <w:insideH w:val="single" w:color="auto" w:sz="4"/>
-          <w:insideV w:val="single" w:color="auto" w:sz="4"/>
-        </w:tblBorders>
-      </w:tblPr>
-      <w:tblGrid>
-        <w:gridCol w:w="9360"/>
-      </w:tblGrid>
-      <w:tr>
-        <w:tc>
-          <w:tcPr>
-            <w:tcW w:type="dxa" w:w="9360"/>
-            <w:tcBorders>
-              <w:top w:val="single" w:color="D1D5DB" w:sz="1"/>
-              <w:left w:val="single" w:color="D1D5DB" w:sz="1"/>
-              <w:bottom w:val="single" w:color="D1D5DB" w:sz="1"/>
-              <w:right w:val="single" w:color="D1D5DB" w:sz="1"/>
-            </w:tcBorders>
-            <w:shd w:fill="F3F4F6" w:val="clear"/>
-            <w:tcMar>
-              <w:top w:type="dxa" w:w="200"/>
-              <w:left w:type="dxa" w:w="300"/>
-              <w:bottom w:type="dxa" w:w="200"/>
-              <w:right w:type="dxa" w:w="300"/>
-            </w:tcMar>
-            <w:vAlign w:val="center"/>
-          </w:tcPr>
-          <w:p>
-            <w:pPr>
-              <w:jc w:val="center"/>
-            </w:pPr>
-            <w:r>
-              <w:rPr>
-                <w:rFonts w:ascii="Arial" w:cs="Arial" w:eastAsia="Arial" w:hAnsi="Arial"/>
-                <w:i/>
-                <w:iCs/>
-                <w:color w:val="9CA3AF"/>
-                <w:sz w:val="20"/>
-                <w:szCs w:val="20"/>
-              </w:rPr>
-              <w:t xml:space="preserve">[ Screenshot will be added ]</w:t>
-            </w:r>
-          </w:p>
-        </w:tc>
-      </w:tr>
-    </w:tbl>
+    <w:p>
+      <w:pPr>
+        <w:spacing w:after="160" w:before="80"/>
+      </w:pPr>
+      <w:r>
+        <w:drawing>
+          <wp:inline distT="0" distB="0" distL="0" distR="0">
+            <wp:extent cx="5905500" cy="3333750"/>
+            <wp:effectExtent t="0" r="0" b="0" l="0"/>
+            <wp:docPr id="1" name="20-employee-payslips" descr="20-employee-payslips" title="20-employee-payslips"/>
+            <wp:cNvGraphicFramePr>
+              <a:graphicFrameLocks xmlns:a="http://schemas.openxmlformats.org/drawingml/2006/main" noChangeAspect="1"/>
+            </wp:cNvGraphicFramePr>
+            <a:graphic xmlns:a="http://schemas.openxmlformats.org/drawingml/2006/main">
+              <a:graphicData uri="http://schemas.openxmlformats.org/drawingml/2006/picture">
+                <pic:pic xmlns:pic="http://schemas.openxmlformats.org/drawingml/2006/picture">
+                  <pic:nvPicPr>
+                    <pic:cNvPr id="0" name="" descr=""/>
+                    <pic:cNvPicPr>
+                      <a:picLocks noChangeAspect="1" noChangeArrowheads="1"/>
+                    </pic:cNvPicPr>
+                  </pic:nvPicPr>
+                  <pic:blipFill>
+                    <a:blip r:embed="rId9" cstate="none"/>
+                    <a:srcRect/>
+                    <a:stretch>
+                      <a:fillRect/>
+                    </a:stretch>
+                  </pic:blipFill>
+                  <pic:spPr bwMode="auto">
+                    <a:xfrm>
+                      <a:off x="0" y="0"/>
+                      <a:ext cx="5905500" cy="3333750"/>
+                    </a:xfrm>
+                    <a:prstGeom prst="rect">
+                      <a:avLst/>
+                    </a:prstGeom>
+                  </pic:spPr>
+                </pic:pic>
+              </a:graphicData>
+            </a:graphic>
+          </wp:inline>
+        </w:drawing>
+      </w:r>
+    </w:p>
     <w:p>
       <w:pPr>
         <w:spacing w:after="80"/>
@@ -3795,59 +3715,51 @@
         <w:t xml:space="preserve">Timecard Approvals</w:t>
       </w:r>
     </w:p>
-    <w:tbl>
-      <w:tblPr>
-        <w:tblW w:type="dxa" w:w="9360"/>
-        <w:tblBorders>
-          <w:top w:val="single" w:color="auto" w:sz="4"/>
-          <w:left w:val="single" w:color="auto" w:sz="4"/>
-          <w:bottom w:val="single" w:color="auto" w:sz="4"/>
-          <w:right w:val="single" w:color="auto" w:sz="4"/>
-          <w:insideH w:val="single" w:color="auto" w:sz="4"/>
-          <w:insideV w:val="single" w:color="auto" w:sz="4"/>
-        </w:tblBorders>
-      </w:tblPr>
-      <w:tblGrid>
-        <w:gridCol w:w="9360"/>
-      </w:tblGrid>
-      <w:tr>
-        <w:tc>
-          <w:tcPr>
-            <w:tcW w:type="dxa" w:w="9360"/>
-            <w:tcBorders>
-              <w:top w:val="single" w:color="D1D5DB" w:sz="1"/>
-              <w:left w:val="single" w:color="D1D5DB" w:sz="1"/>
-              <w:bottom w:val="single" w:color="D1D5DB" w:sz="1"/>
-              <w:right w:val="single" w:color="D1D5DB" w:sz="1"/>
-            </w:tcBorders>
-            <w:shd w:fill="F3F4F6" w:val="clear"/>
-            <w:tcMar>
-              <w:top w:type="dxa" w:w="200"/>
-              <w:left w:type="dxa" w:w="300"/>
-              <w:bottom w:type="dxa" w:w="200"/>
-              <w:right w:type="dxa" w:w="300"/>
-            </w:tcMar>
-            <w:vAlign w:val="center"/>
-          </w:tcPr>
-          <w:p>
-            <w:pPr>
-              <w:jc w:val="center"/>
-            </w:pPr>
-            <w:r>
-              <w:rPr>
-                <w:rFonts w:ascii="Arial" w:cs="Arial" w:eastAsia="Arial" w:hAnsi="Arial"/>
-                <w:i/>
-                <w:iCs/>
-                <w:color w:val="9CA3AF"/>
-                <w:sz w:val="20"/>
-                <w:szCs w:val="20"/>
-              </w:rPr>
-              <w:t xml:space="preserve">[ Screenshot will be added ]</w:t>
-            </w:r>
-          </w:p>
-        </w:tc>
-      </w:tr>
-    </w:tbl>
+    <w:p>
+      <w:pPr>
+        <w:spacing w:after="160" w:before="80"/>
+      </w:pPr>
+      <w:r>
+        <w:drawing>
+          <wp:inline distT="0" distB="0" distL="0" distR="0">
+            <wp:extent cx="5905500" cy="3333750"/>
+            <wp:effectExtent t="0" r="0" b="0" l="0"/>
+            <wp:docPr id="1" name="17-manager-timecard-approvals" descr="17-manager-timecard-approvals" title="17-manager-timecard-approvals"/>
+            <wp:cNvGraphicFramePr>
+              <a:graphicFrameLocks xmlns:a="http://schemas.openxmlformats.org/drawingml/2006/main" noChangeAspect="1"/>
+            </wp:cNvGraphicFramePr>
+            <a:graphic xmlns:a="http://schemas.openxmlformats.org/drawingml/2006/main">
+              <a:graphicData uri="http://schemas.openxmlformats.org/drawingml/2006/picture">
+                <pic:pic xmlns:pic="http://schemas.openxmlformats.org/drawingml/2006/picture">
+                  <pic:nvPicPr>
+                    <pic:cNvPr id="0" name="" descr=""/>
+                    <pic:cNvPicPr>
+                      <a:picLocks noChangeAspect="1" noChangeArrowheads="1"/>
+                    </pic:cNvPicPr>
+                  </pic:nvPicPr>
+                  <pic:blipFill>
+                    <a:blip r:embed="rId9" cstate="none"/>
+                    <a:srcRect/>
+                    <a:stretch>
+                      <a:fillRect/>
+                    </a:stretch>
+                  </pic:blipFill>
+                  <pic:spPr bwMode="auto">
+                    <a:xfrm>
+                      <a:off x="0" y="0"/>
+                      <a:ext cx="5905500" cy="3333750"/>
+                    </a:xfrm>
+                    <a:prstGeom prst="rect">
+                      <a:avLst/>
+                    </a:prstGeom>
+                  </pic:spPr>
+                </pic:pic>
+              </a:graphicData>
+            </a:graphic>
+          </wp:inline>
+        </w:drawing>
+      </w:r>
+    </w:p>
     <w:p>
       <w:pPr>
         <w:spacing w:after="80"/>
@@ -3937,59 +3849,51 @@
         <w:t xml:space="preserve">Leave Approvals</w:t>
       </w:r>
     </w:p>
-    <w:tbl>
-      <w:tblPr>
-        <w:tblW w:type="dxa" w:w="9360"/>
-        <w:tblBorders>
-          <w:top w:val="single" w:color="auto" w:sz="4"/>
-          <w:left w:val="single" w:color="auto" w:sz="4"/>
-          <w:bottom w:val="single" w:color="auto" w:sz="4"/>
-          <w:right w:val="single" w:color="auto" w:sz="4"/>
-          <w:insideH w:val="single" w:color="auto" w:sz="4"/>
-          <w:insideV w:val="single" w:color="auto" w:sz="4"/>
-        </w:tblBorders>
-      </w:tblPr>
-      <w:tblGrid>
-        <w:gridCol w:w="9360"/>
-      </w:tblGrid>
-      <w:tr>
-        <w:tc>
-          <w:tcPr>
-            <w:tcW w:type="dxa" w:w="9360"/>
-            <w:tcBorders>
-              <w:top w:val="single" w:color="D1D5DB" w:sz="1"/>
-              <w:left w:val="single" w:color="D1D5DB" w:sz="1"/>
-              <w:bottom w:val="single" w:color="D1D5DB" w:sz="1"/>
-              <w:right w:val="single" w:color="D1D5DB" w:sz="1"/>
-            </w:tcBorders>
-            <w:shd w:fill="F3F4F6" w:val="clear"/>
-            <w:tcMar>
-              <w:top w:type="dxa" w:w="200"/>
-              <w:left w:type="dxa" w:w="300"/>
-              <w:bottom w:type="dxa" w:w="200"/>
-              <w:right w:type="dxa" w:w="300"/>
-            </w:tcMar>
-            <w:vAlign w:val="center"/>
-          </w:tcPr>
-          <w:p>
-            <w:pPr>
-              <w:jc w:val="center"/>
-            </w:pPr>
-            <w:r>
-              <w:rPr>
-                <w:rFonts w:ascii="Arial" w:cs="Arial" w:eastAsia="Arial" w:hAnsi="Arial"/>
-                <w:i/>
-                <w:iCs/>
-                <w:color w:val="9CA3AF"/>
-                <w:sz w:val="20"/>
-                <w:szCs w:val="20"/>
-              </w:rPr>
-              <w:t xml:space="preserve">[ Screenshot will be added ]</w:t>
-            </w:r>
-          </w:p>
-        </w:tc>
-      </w:tr>
-    </w:tbl>
+    <w:p>
+      <w:pPr>
+        <w:spacing w:after="160" w:before="80"/>
+      </w:pPr>
+      <w:r>
+        <w:drawing>
+          <wp:inline distT="0" distB="0" distL="0" distR="0">
+            <wp:extent cx="5905500" cy="3333750"/>
+            <wp:effectExtent t="0" r="0" b="0" l="0"/>
+            <wp:docPr id="1" name="18-manager-leave-approvals" descr="18-manager-leave-approvals" title="18-manager-leave-approvals"/>
+            <wp:cNvGraphicFramePr>
+              <a:graphicFrameLocks xmlns:a="http://schemas.openxmlformats.org/drawingml/2006/main" noChangeAspect="1"/>
+            </wp:cNvGraphicFramePr>
+            <a:graphic xmlns:a="http://schemas.openxmlformats.org/drawingml/2006/main">
+              <a:graphicData uri="http://schemas.openxmlformats.org/drawingml/2006/picture">
+                <pic:pic xmlns:pic="http://schemas.openxmlformats.org/drawingml/2006/picture">
+                  <pic:nvPicPr>
+                    <pic:cNvPr id="0" name="" descr=""/>
+                    <pic:cNvPicPr>
+                      <a:picLocks noChangeAspect="1" noChangeArrowheads="1"/>
+                    </pic:cNvPicPr>
+                  </pic:nvPicPr>
+                  <pic:blipFill>
+                    <a:blip r:embed="rId9" cstate="none"/>
+                    <a:srcRect/>
+                    <a:stretch>
+                      <a:fillRect/>
+                    </a:stretch>
+                  </pic:blipFill>
+                  <pic:spPr bwMode="auto">
+                    <a:xfrm>
+                      <a:off x="0" y="0"/>
+                      <a:ext cx="5905500" cy="3333750"/>
+                    </a:xfrm>
+                    <a:prstGeom prst="rect">
+                      <a:avLst/>
+                    </a:prstGeom>
+                  </pic:spPr>
+                </pic:pic>
+              </a:graphicData>
+            </a:graphic>
+          </wp:inline>
+        </w:drawing>
+      </w:r>
+    </w:p>
     <w:p>
       <w:pPr>
         <w:spacing w:after="80"/>
@@ -4061,59 +3965,51 @@
         <w:t xml:space="preserve">Payroll</w:t>
       </w:r>
     </w:p>
-    <w:tbl>
-      <w:tblPr>
-        <w:tblW w:type="dxa" w:w="9360"/>
-        <w:tblBorders>
-          <w:top w:val="single" w:color="auto" w:sz="4"/>
-          <w:left w:val="single" w:color="auto" w:sz="4"/>
-          <w:bottom w:val="single" w:color="auto" w:sz="4"/>
-          <w:right w:val="single" w:color="auto" w:sz="4"/>
-          <w:insideH w:val="single" w:color="auto" w:sz="4"/>
-          <w:insideV w:val="single" w:color="auto" w:sz="4"/>
-        </w:tblBorders>
-      </w:tblPr>
-      <w:tblGrid>
-        <w:gridCol w:w="9360"/>
-      </w:tblGrid>
-      <w:tr>
-        <w:tc>
-          <w:tcPr>
-            <w:tcW w:type="dxa" w:w="9360"/>
-            <w:tcBorders>
-              <w:top w:val="single" w:color="D1D5DB" w:sz="1"/>
-              <w:left w:val="single" w:color="D1D5DB" w:sz="1"/>
-              <w:bottom w:val="single" w:color="D1D5DB" w:sz="1"/>
-              <w:right w:val="single" w:color="D1D5DB" w:sz="1"/>
-            </w:tcBorders>
-            <w:shd w:fill="F3F4F6" w:val="clear"/>
-            <w:tcMar>
-              <w:top w:type="dxa" w:w="200"/>
-              <w:left w:type="dxa" w:w="300"/>
-              <w:bottom w:type="dxa" w:w="200"/>
-              <w:right w:type="dxa" w:w="300"/>
-            </w:tcMar>
-            <w:vAlign w:val="center"/>
-          </w:tcPr>
-          <w:p>
-            <w:pPr>
-              <w:jc w:val="center"/>
-            </w:pPr>
-            <w:r>
-              <w:rPr>
-                <w:rFonts w:ascii="Arial" w:cs="Arial" w:eastAsia="Arial" w:hAnsi="Arial"/>
-                <w:i/>
-                <w:iCs/>
-                <w:color w:val="9CA3AF"/>
-                <w:sz w:val="20"/>
-                <w:szCs w:val="20"/>
-              </w:rPr>
-              <w:t xml:space="preserve">[ Screenshot will be added ]</w:t>
-            </w:r>
-          </w:p>
-        </w:tc>
-      </w:tr>
-    </w:tbl>
+    <w:p>
+      <w:pPr>
+        <w:spacing w:after="160" w:before="80"/>
+      </w:pPr>
+      <w:r>
+        <w:drawing>
+          <wp:inline distT="0" distB="0" distL="0" distR="0">
+            <wp:extent cx="5905500" cy="3333750"/>
+            <wp:effectExtent t="0" r="0" b="0" l="0"/>
+            <wp:docPr id="1" name="08-payroll" descr="08-payroll" title="08-payroll"/>
+            <wp:cNvGraphicFramePr>
+              <a:graphicFrameLocks xmlns:a="http://schemas.openxmlformats.org/drawingml/2006/main" noChangeAspect="1"/>
+            </wp:cNvGraphicFramePr>
+            <a:graphic xmlns:a="http://schemas.openxmlformats.org/drawingml/2006/main">
+              <a:graphicData uri="http://schemas.openxmlformats.org/drawingml/2006/picture">
+                <pic:pic xmlns:pic="http://schemas.openxmlformats.org/drawingml/2006/picture">
+                  <pic:nvPicPr>
+                    <pic:cNvPr id="0" name="" descr=""/>
+                    <pic:cNvPicPr>
+                      <a:picLocks noChangeAspect="1" noChangeArrowheads="1"/>
+                    </pic:cNvPicPr>
+                  </pic:nvPicPr>
+                  <pic:blipFill>
+                    <a:blip r:embed="rId9" cstate="none"/>
+                    <a:srcRect/>
+                    <a:stretch>
+                      <a:fillRect/>
+                    </a:stretch>
+                  </pic:blipFill>
+                  <pic:spPr bwMode="auto">
+                    <a:xfrm>
+                      <a:off x="0" y="0"/>
+                      <a:ext cx="5905500" cy="3333750"/>
+                    </a:xfrm>
+                    <a:prstGeom prst="rect">
+                      <a:avLst/>
+                    </a:prstGeom>
+                  </pic:spPr>
+                </pic:pic>
+              </a:graphicData>
+            </a:graphic>
+          </wp:inline>
+        </w:drawing>
+      </w:r>
+    </w:p>
     <w:p>
       <w:pPr>
         <w:spacing w:after="80"/>
@@ -4241,59 +4137,51 @@
         <w:t xml:space="preserve">Dashboard</w:t>
       </w:r>
     </w:p>
-    <w:tbl>
-      <w:tblPr>
-        <w:tblW w:type="dxa" w:w="9360"/>
-        <w:tblBorders>
-          <w:top w:val="single" w:color="auto" w:sz="4"/>
-          <w:left w:val="single" w:color="auto" w:sz="4"/>
-          <w:bottom w:val="single" w:color="auto" w:sz="4"/>
-          <w:right w:val="single" w:color="auto" w:sz="4"/>
-          <w:insideH w:val="single" w:color="auto" w:sz="4"/>
-          <w:insideV w:val="single" w:color="auto" w:sz="4"/>
-        </w:tblBorders>
-      </w:tblPr>
-      <w:tblGrid>
-        <w:gridCol w:w="9360"/>
-      </w:tblGrid>
-      <w:tr>
-        <w:tc>
-          <w:tcPr>
-            <w:tcW w:type="dxa" w:w="9360"/>
-            <w:tcBorders>
-              <w:top w:val="single" w:color="D1D5DB" w:sz="1"/>
-              <w:left w:val="single" w:color="D1D5DB" w:sz="1"/>
-              <w:bottom w:val="single" w:color="D1D5DB" w:sz="1"/>
-              <w:right w:val="single" w:color="D1D5DB" w:sz="1"/>
-            </w:tcBorders>
-            <w:shd w:fill="F3F4F6" w:val="clear"/>
-            <w:tcMar>
-              <w:top w:type="dxa" w:w="200"/>
-              <w:left w:type="dxa" w:w="300"/>
-              <w:bottom w:type="dxa" w:w="200"/>
-              <w:right w:type="dxa" w:w="300"/>
-            </w:tcMar>
-            <w:vAlign w:val="center"/>
-          </w:tcPr>
-          <w:p>
-            <w:pPr>
-              <w:jc w:val="center"/>
-            </w:pPr>
-            <w:r>
-              <w:rPr>
-                <w:rFonts w:ascii="Arial" w:cs="Arial" w:eastAsia="Arial" w:hAnsi="Arial"/>
-                <w:i/>
-                <w:iCs/>
-                <w:color w:val="9CA3AF"/>
-                <w:sz w:val="20"/>
-                <w:szCs w:val="20"/>
-              </w:rPr>
-              <w:t xml:space="preserve">[ Screenshot will be added ]</w:t>
-            </w:r>
-          </w:p>
-        </w:tc>
-      </w:tr>
-    </w:tbl>
+    <w:p>
+      <w:pPr>
+        <w:spacing w:after="160" w:before="80"/>
+      </w:pPr>
+      <w:r>
+        <w:drawing>
+          <wp:inline distT="0" distB="0" distL="0" distR="0">
+            <wp:extent cx="5905500" cy="3333750"/>
+            <wp:effectExtent t="0" r="0" b="0" l="0"/>
+            <wp:docPr id="1" name="02-owner-dashboard" descr="02-owner-dashboard" title="02-owner-dashboard"/>
+            <wp:cNvGraphicFramePr>
+              <a:graphicFrameLocks xmlns:a="http://schemas.openxmlformats.org/drawingml/2006/main" noChangeAspect="1"/>
+            </wp:cNvGraphicFramePr>
+            <a:graphic xmlns:a="http://schemas.openxmlformats.org/drawingml/2006/main">
+              <a:graphicData uri="http://schemas.openxmlformats.org/drawingml/2006/picture">
+                <pic:pic xmlns:pic="http://schemas.openxmlformats.org/drawingml/2006/picture">
+                  <pic:nvPicPr>
+                    <pic:cNvPr id="0" name="" descr=""/>
+                    <pic:cNvPicPr>
+                      <a:picLocks noChangeAspect="1" noChangeArrowheads="1"/>
+                    </pic:cNvPicPr>
+                  </pic:nvPicPr>
+                  <pic:blipFill>
+                    <a:blip r:embed="rId10" cstate="none"/>
+                    <a:srcRect/>
+                    <a:stretch>
+                      <a:fillRect/>
+                    </a:stretch>
+                  </pic:blipFill>
+                  <pic:spPr bwMode="auto">
+                    <a:xfrm>
+                      <a:off x="0" y="0"/>
+                      <a:ext cx="5905500" cy="3333750"/>
+                    </a:xfrm>
+                    <a:prstGeom prst="rect">
+                      <a:avLst/>
+                    </a:prstGeom>
+                  </pic:spPr>
+                </pic:pic>
+              </a:graphicData>
+            </a:graphic>
+          </wp:inline>
+        </w:drawing>
+      </w:r>
+    </w:p>
     <w:p>
       <w:pPr>
         <w:spacing w:after="80"/>
@@ -4329,59 +4217,51 @@
         <w:t xml:space="preserve">Products</w:t>
       </w:r>
     </w:p>
-    <w:tbl>
-      <w:tblPr>
-        <w:tblW w:type="dxa" w:w="9360"/>
-        <w:tblBorders>
-          <w:top w:val="single" w:color="auto" w:sz="4"/>
-          <w:left w:val="single" w:color="auto" w:sz="4"/>
-          <w:bottom w:val="single" w:color="auto" w:sz="4"/>
-          <w:right w:val="single" w:color="auto" w:sz="4"/>
-          <w:insideH w:val="single" w:color="auto" w:sz="4"/>
-          <w:insideV w:val="single" w:color="auto" w:sz="4"/>
-        </w:tblBorders>
-      </w:tblPr>
-      <w:tblGrid>
-        <w:gridCol w:w="9360"/>
-      </w:tblGrid>
-      <w:tr>
-        <w:tc>
-          <w:tcPr>
-            <w:tcW w:type="dxa" w:w="9360"/>
-            <w:tcBorders>
-              <w:top w:val="single" w:color="D1D5DB" w:sz="1"/>
-              <w:left w:val="single" w:color="D1D5DB" w:sz="1"/>
-              <w:bottom w:val="single" w:color="D1D5DB" w:sz="1"/>
-              <w:right w:val="single" w:color="D1D5DB" w:sz="1"/>
-            </w:tcBorders>
-            <w:shd w:fill="F3F4F6" w:val="clear"/>
-            <w:tcMar>
-              <w:top w:type="dxa" w:w="200"/>
-              <w:left w:type="dxa" w:w="300"/>
-              <w:bottom w:type="dxa" w:w="200"/>
-              <w:right w:type="dxa" w:w="300"/>
-            </w:tcMar>
-            <w:vAlign w:val="center"/>
-          </w:tcPr>
-          <w:p>
-            <w:pPr>
-              <w:jc w:val="center"/>
-            </w:pPr>
-            <w:r>
-              <w:rPr>
-                <w:rFonts w:ascii="Arial" w:cs="Arial" w:eastAsia="Arial" w:hAnsi="Arial"/>
-                <w:i/>
-                <w:iCs/>
-                <w:color w:val="9CA3AF"/>
-                <w:sz w:val="20"/>
-                <w:szCs w:val="20"/>
-              </w:rPr>
-              <w:t xml:space="preserve">[ Screenshot will be added ]</w:t>
-            </w:r>
-          </w:p>
-        </w:tc>
-      </w:tr>
-    </w:tbl>
+    <w:p>
+      <w:pPr>
+        <w:spacing w:after="160" w:before="80"/>
+      </w:pPr>
+      <w:r>
+        <w:drawing>
+          <wp:inline distT="0" distB="0" distL="0" distR="0">
+            <wp:extent cx="5905500" cy="3333750"/>
+            <wp:effectExtent t="0" r="0" b="0" l="0"/>
+            <wp:docPr id="1" name="03-owner-products" descr="03-owner-products" title="03-owner-products"/>
+            <wp:cNvGraphicFramePr>
+              <a:graphicFrameLocks xmlns:a="http://schemas.openxmlformats.org/drawingml/2006/main" noChangeAspect="1"/>
+            </wp:cNvGraphicFramePr>
+            <a:graphic xmlns:a="http://schemas.openxmlformats.org/drawingml/2006/main">
+              <a:graphicData uri="http://schemas.openxmlformats.org/drawingml/2006/picture">
+                <pic:pic xmlns:pic="http://schemas.openxmlformats.org/drawingml/2006/picture">
+                  <pic:nvPicPr>
+                    <pic:cNvPr id="0" name="" descr=""/>
+                    <pic:cNvPicPr>
+                      <a:picLocks noChangeAspect="1" noChangeArrowheads="1"/>
+                    </pic:cNvPicPr>
+                  </pic:nvPicPr>
+                  <pic:blipFill>
+                    <a:blip r:embed="rId9" cstate="none"/>
+                    <a:srcRect/>
+                    <a:stretch>
+                      <a:fillRect/>
+                    </a:stretch>
+                  </pic:blipFill>
+                  <pic:spPr bwMode="auto">
+                    <a:xfrm>
+                      <a:off x="0" y="0"/>
+                      <a:ext cx="5905500" cy="3333750"/>
+                    </a:xfrm>
+                    <a:prstGeom prst="rect">
+                      <a:avLst/>
+                    </a:prstGeom>
+                  </pic:spPr>
+                </pic:pic>
+              </a:graphicData>
+            </a:graphic>
+          </wp:inline>
+        </w:drawing>
+      </w:r>
+    </w:p>
     <w:p>
       <w:pPr>
         <w:spacing w:after="80"/>
@@ -4471,59 +4351,51 @@
         <w:t xml:space="preserve">Inventory</w:t>
       </w:r>
     </w:p>
-    <w:tbl>
-      <w:tblPr>
-        <w:tblW w:type="dxa" w:w="9360"/>
-        <w:tblBorders>
-          <w:top w:val="single" w:color="auto" w:sz="4"/>
-          <w:left w:val="single" w:color="auto" w:sz="4"/>
-          <w:bottom w:val="single" w:color="auto" w:sz="4"/>
-          <w:right w:val="single" w:color="auto" w:sz="4"/>
-          <w:insideH w:val="single" w:color="auto" w:sz="4"/>
-          <w:insideV w:val="single" w:color="auto" w:sz="4"/>
-        </w:tblBorders>
-      </w:tblPr>
-      <w:tblGrid>
-        <w:gridCol w:w="9360"/>
-      </w:tblGrid>
-      <w:tr>
-        <w:tc>
-          <w:tcPr>
-            <w:tcW w:type="dxa" w:w="9360"/>
-            <w:tcBorders>
-              <w:top w:val="single" w:color="D1D5DB" w:sz="1"/>
-              <w:left w:val="single" w:color="D1D5DB" w:sz="1"/>
-              <w:bottom w:val="single" w:color="D1D5DB" w:sz="1"/>
-              <w:right w:val="single" w:color="D1D5DB" w:sz="1"/>
-            </w:tcBorders>
-            <w:shd w:fill="F3F4F6" w:val="clear"/>
-            <w:tcMar>
-              <w:top w:type="dxa" w:w="200"/>
-              <w:left w:type="dxa" w:w="300"/>
-              <w:bottom w:type="dxa" w:w="200"/>
-              <w:right w:type="dxa" w:w="300"/>
-            </w:tcMar>
-            <w:vAlign w:val="center"/>
-          </w:tcPr>
-          <w:p>
-            <w:pPr>
-              <w:jc w:val="center"/>
-            </w:pPr>
-            <w:r>
-              <w:rPr>
-                <w:rFonts w:ascii="Arial" w:cs="Arial" w:eastAsia="Arial" w:hAnsi="Arial"/>
-                <w:i/>
-                <w:iCs/>
-                <w:color w:val="9CA3AF"/>
-                <w:sz w:val="20"/>
-                <w:szCs w:val="20"/>
-              </w:rPr>
-              <w:t xml:space="preserve">[ Screenshot will be added ]</w:t>
-            </w:r>
-          </w:p>
-        </w:tc>
-      </w:tr>
-    </w:tbl>
+    <w:p>
+      <w:pPr>
+        <w:spacing w:after="160" w:before="80"/>
+      </w:pPr>
+      <w:r>
+        <w:drawing>
+          <wp:inline distT="0" distB="0" distL="0" distR="0">
+            <wp:extent cx="5905500" cy="3333750"/>
+            <wp:effectExtent t="0" r="0" b="0" l="0"/>
+            <wp:docPr id="1" name="04-inventory" descr="04-inventory" title="04-inventory"/>
+            <wp:cNvGraphicFramePr>
+              <a:graphicFrameLocks xmlns:a="http://schemas.openxmlformats.org/drawingml/2006/main" noChangeAspect="1"/>
+            </wp:cNvGraphicFramePr>
+            <a:graphic xmlns:a="http://schemas.openxmlformats.org/drawingml/2006/main">
+              <a:graphicData uri="http://schemas.openxmlformats.org/drawingml/2006/picture">
+                <pic:pic xmlns:pic="http://schemas.openxmlformats.org/drawingml/2006/picture">
+                  <pic:nvPicPr>
+                    <pic:cNvPr id="0" name="" descr=""/>
+                    <pic:cNvPicPr>
+                      <a:picLocks noChangeAspect="1" noChangeArrowheads="1"/>
+                    </pic:cNvPicPr>
+                  </pic:nvPicPr>
+                  <pic:blipFill>
+                    <a:blip r:embed="rId9" cstate="none"/>
+                    <a:srcRect/>
+                    <a:stretch>
+                      <a:fillRect/>
+                    </a:stretch>
+                  </pic:blipFill>
+                  <pic:spPr bwMode="auto">
+                    <a:xfrm>
+                      <a:off x="0" y="0"/>
+                      <a:ext cx="5905500" cy="3333750"/>
+                    </a:xfrm>
+                    <a:prstGeom prst="rect">
+                      <a:avLst/>
+                    </a:prstGeom>
+                  </pic:spPr>
+                </pic:pic>
+              </a:graphicData>
+            </a:graphic>
+          </wp:inline>
+        </w:drawing>
+      </w:r>
+    </w:p>
     <w:p>
       <w:pPr>
         <w:spacing w:after="80"/>
@@ -4631,59 +4503,51 @@
         <w:t xml:space="preserve">Users</w:t>
       </w:r>
     </w:p>
-    <w:tbl>
-      <w:tblPr>
-        <w:tblW w:type="dxa" w:w="9360"/>
-        <w:tblBorders>
-          <w:top w:val="single" w:color="auto" w:sz="4"/>
-          <w:left w:val="single" w:color="auto" w:sz="4"/>
-          <w:bottom w:val="single" w:color="auto" w:sz="4"/>
-          <w:right w:val="single" w:color="auto" w:sz="4"/>
-          <w:insideH w:val="single" w:color="auto" w:sz="4"/>
-          <w:insideV w:val="single" w:color="auto" w:sz="4"/>
-        </w:tblBorders>
-      </w:tblPr>
-      <w:tblGrid>
-        <w:gridCol w:w="9360"/>
-      </w:tblGrid>
-      <w:tr>
-        <w:tc>
-          <w:tcPr>
-            <w:tcW w:type="dxa" w:w="9360"/>
-            <w:tcBorders>
-              <w:top w:val="single" w:color="D1D5DB" w:sz="1"/>
-              <w:left w:val="single" w:color="D1D5DB" w:sz="1"/>
-              <w:bottom w:val="single" w:color="D1D5DB" w:sz="1"/>
-              <w:right w:val="single" w:color="D1D5DB" w:sz="1"/>
-            </w:tcBorders>
-            <w:shd w:fill="F3F4F6" w:val="clear"/>
-            <w:tcMar>
-              <w:top w:type="dxa" w:w="200"/>
-              <w:left w:type="dxa" w:w="300"/>
-              <w:bottom w:type="dxa" w:w="200"/>
-              <w:right w:type="dxa" w:w="300"/>
-            </w:tcMar>
-            <w:vAlign w:val="center"/>
-          </w:tcPr>
-          <w:p>
-            <w:pPr>
-              <w:jc w:val="center"/>
-            </w:pPr>
-            <w:r>
-              <w:rPr>
-                <w:rFonts w:ascii="Arial" w:cs="Arial" w:eastAsia="Arial" w:hAnsi="Arial"/>
-                <w:i/>
-                <w:iCs/>
-                <w:color w:val="9CA3AF"/>
-                <w:sz w:val="20"/>
-                <w:szCs w:val="20"/>
-              </w:rPr>
-              <w:t xml:space="preserve">[ Screenshot will be added ]</w:t>
-            </w:r>
-          </w:p>
-        </w:tc>
-      </w:tr>
-    </w:tbl>
+    <w:p>
+      <w:pPr>
+        <w:spacing w:after="160" w:before="80"/>
+      </w:pPr>
+      <w:r>
+        <w:drawing>
+          <wp:inline distT="0" distB="0" distL="0" distR="0">
+            <wp:extent cx="5905500" cy="3333750"/>
+            <wp:effectExtent t="0" r="0" b="0" l="0"/>
+            <wp:docPr id="1" name="07-owner-users" descr="07-owner-users" title="07-owner-users"/>
+            <wp:cNvGraphicFramePr>
+              <a:graphicFrameLocks xmlns:a="http://schemas.openxmlformats.org/drawingml/2006/main" noChangeAspect="1"/>
+            </wp:cNvGraphicFramePr>
+            <a:graphic xmlns:a="http://schemas.openxmlformats.org/drawingml/2006/main">
+              <a:graphicData uri="http://schemas.openxmlformats.org/drawingml/2006/picture">
+                <pic:pic xmlns:pic="http://schemas.openxmlformats.org/drawingml/2006/picture">
+                  <pic:nvPicPr>
+                    <pic:cNvPr id="0" name="" descr=""/>
+                    <pic:cNvPicPr>
+                      <a:picLocks noChangeAspect="1" noChangeArrowheads="1"/>
+                    </pic:cNvPicPr>
+                  </pic:nvPicPr>
+                  <pic:blipFill>
+                    <a:blip r:embed="rId9" cstate="none"/>
+                    <a:srcRect/>
+                    <a:stretch>
+                      <a:fillRect/>
+                    </a:stretch>
+                  </pic:blipFill>
+                  <pic:spPr bwMode="auto">
+                    <a:xfrm>
+                      <a:off x="0" y="0"/>
+                      <a:ext cx="5905500" cy="3333750"/>
+                    </a:xfrm>
+                    <a:prstGeom prst="rect">
+                      <a:avLst/>
+                    </a:prstGeom>
+                  </pic:spPr>
+                </pic:pic>
+              </a:graphicData>
+            </a:graphic>
+          </wp:inline>
+        </w:drawing>
+      </w:r>
+    </w:p>
     <w:p>
       <w:pPr>
         <w:spacing w:after="80"/>
@@ -4773,59 +4637,51 @@
         <w:t xml:space="preserve">Timecard Approvals</w:t>
       </w:r>
     </w:p>
-    <w:tbl>
-      <w:tblPr>
-        <w:tblW w:type="dxa" w:w="9360"/>
-        <w:tblBorders>
-          <w:top w:val="single" w:color="auto" w:sz="4"/>
-          <w:left w:val="single" w:color="auto" w:sz="4"/>
-          <w:bottom w:val="single" w:color="auto" w:sz="4"/>
-          <w:right w:val="single" w:color="auto" w:sz="4"/>
-          <w:insideH w:val="single" w:color="auto" w:sz="4"/>
-          <w:insideV w:val="single" w:color="auto" w:sz="4"/>
-        </w:tblBorders>
-      </w:tblPr>
-      <w:tblGrid>
-        <w:gridCol w:w="9360"/>
-      </w:tblGrid>
-      <w:tr>
-        <w:tc>
-          <w:tcPr>
-            <w:tcW w:type="dxa" w:w="9360"/>
-            <w:tcBorders>
-              <w:top w:val="single" w:color="D1D5DB" w:sz="1"/>
-              <w:left w:val="single" w:color="D1D5DB" w:sz="1"/>
-              <w:bottom w:val="single" w:color="D1D5DB" w:sz="1"/>
-              <w:right w:val="single" w:color="D1D5DB" w:sz="1"/>
-            </w:tcBorders>
-            <w:shd w:fill="F3F4F6" w:val="clear"/>
-            <w:tcMar>
-              <w:top w:type="dxa" w:w="200"/>
-              <w:left w:type="dxa" w:w="300"/>
-              <w:bottom w:type="dxa" w:w="200"/>
-              <w:right w:type="dxa" w:w="300"/>
-            </w:tcMar>
-            <w:vAlign w:val="center"/>
-          </w:tcPr>
-          <w:p>
-            <w:pPr>
-              <w:jc w:val="center"/>
-            </w:pPr>
-            <w:r>
-              <w:rPr>
-                <w:rFonts w:ascii="Arial" w:cs="Arial" w:eastAsia="Arial" w:hAnsi="Arial"/>
-                <w:i/>
-                <w:iCs/>
-                <w:color w:val="9CA3AF"/>
-                <w:sz w:val="20"/>
-                <w:szCs w:val="20"/>
-              </w:rPr>
-              <w:t xml:space="preserve">[ Screenshot will be added ]</w:t>
-            </w:r>
-          </w:p>
-        </w:tc>
-      </w:tr>
-    </w:tbl>
+    <w:p>
+      <w:pPr>
+        <w:spacing w:after="160" w:before="80"/>
+      </w:pPr>
+      <w:r>
+        <w:drawing>
+          <wp:inline distT="0" distB="0" distL="0" distR="0">
+            <wp:extent cx="5905500" cy="3333750"/>
+            <wp:effectExtent t="0" r="0" b="0" l="0"/>
+            <wp:docPr id="1" name="09-owner-timecard-approvals" descr="09-owner-timecard-approvals" title="09-owner-timecard-approvals"/>
+            <wp:cNvGraphicFramePr>
+              <a:graphicFrameLocks xmlns:a="http://schemas.openxmlformats.org/drawingml/2006/main" noChangeAspect="1"/>
+            </wp:cNvGraphicFramePr>
+            <a:graphic xmlns:a="http://schemas.openxmlformats.org/drawingml/2006/main">
+              <a:graphicData uri="http://schemas.openxmlformats.org/drawingml/2006/picture">
+                <pic:pic xmlns:pic="http://schemas.openxmlformats.org/drawingml/2006/picture">
+                  <pic:nvPicPr>
+                    <pic:cNvPr id="0" name="" descr=""/>
+                    <pic:cNvPicPr>
+                      <a:picLocks noChangeAspect="1" noChangeArrowheads="1"/>
+                    </pic:cNvPicPr>
+                  </pic:nvPicPr>
+                  <pic:blipFill>
+                    <a:blip r:embed="rId9" cstate="none"/>
+                    <a:srcRect/>
+                    <a:stretch>
+                      <a:fillRect/>
+                    </a:stretch>
+                  </pic:blipFill>
+                  <pic:spPr bwMode="auto">
+                    <a:xfrm>
+                      <a:off x="0" y="0"/>
+                      <a:ext cx="5905500" cy="3333750"/>
+                    </a:xfrm>
+                    <a:prstGeom prst="rect">
+                      <a:avLst/>
+                    </a:prstGeom>
+                  </pic:spPr>
+                </pic:pic>
+              </a:graphicData>
+            </a:graphic>
+          </wp:inline>
+        </w:drawing>
+      </w:r>
+    </w:p>
     <w:p>
       <w:pPr>
         <w:spacing w:after="80"/>
@@ -4861,59 +4717,51 @@
         <w:t xml:space="preserve">Leave Approvals</w:t>
       </w:r>
     </w:p>
-    <w:tbl>
-      <w:tblPr>
-        <w:tblW w:type="dxa" w:w="9360"/>
-        <w:tblBorders>
-          <w:top w:val="single" w:color="auto" w:sz="4"/>
-          <w:left w:val="single" w:color="auto" w:sz="4"/>
-          <w:bottom w:val="single" w:color="auto" w:sz="4"/>
-          <w:right w:val="single" w:color="auto" w:sz="4"/>
-          <w:insideH w:val="single" w:color="auto" w:sz="4"/>
-          <w:insideV w:val="single" w:color="auto" w:sz="4"/>
-        </w:tblBorders>
-      </w:tblPr>
-      <w:tblGrid>
-        <w:gridCol w:w="9360"/>
-      </w:tblGrid>
-      <w:tr>
-        <w:tc>
-          <w:tcPr>
-            <w:tcW w:type="dxa" w:w="9360"/>
-            <w:tcBorders>
-              <w:top w:val="single" w:color="D1D5DB" w:sz="1"/>
-              <w:left w:val="single" w:color="D1D5DB" w:sz="1"/>
-              <w:bottom w:val="single" w:color="D1D5DB" w:sz="1"/>
-              <w:right w:val="single" w:color="D1D5DB" w:sz="1"/>
-            </w:tcBorders>
-            <w:shd w:fill="F3F4F6" w:val="clear"/>
-            <w:tcMar>
-              <w:top w:type="dxa" w:w="200"/>
-              <w:left w:type="dxa" w:w="300"/>
-              <w:bottom w:type="dxa" w:w="200"/>
-              <w:right w:type="dxa" w:w="300"/>
-            </w:tcMar>
-            <w:vAlign w:val="center"/>
-          </w:tcPr>
-          <w:p>
-            <w:pPr>
-              <w:jc w:val="center"/>
-            </w:pPr>
-            <w:r>
-              <w:rPr>
-                <w:rFonts w:ascii="Arial" w:cs="Arial" w:eastAsia="Arial" w:hAnsi="Arial"/>
-                <w:i/>
-                <w:iCs/>
-                <w:color w:val="9CA3AF"/>
-                <w:sz w:val="20"/>
-                <w:szCs w:val="20"/>
-              </w:rPr>
-              <w:t xml:space="preserve">[ Screenshot will be added ]</w:t>
-            </w:r>
-          </w:p>
-        </w:tc>
-      </w:tr>
-    </w:tbl>
+    <w:p>
+      <w:pPr>
+        <w:spacing w:after="160" w:before="80"/>
+      </w:pPr>
+      <w:r>
+        <w:drawing>
+          <wp:inline distT="0" distB="0" distL="0" distR="0">
+            <wp:extent cx="5905500" cy="3333750"/>
+            <wp:effectExtent t="0" r="0" b="0" l="0"/>
+            <wp:docPr id="1" name="10-owner-leave-approvals" descr="10-owner-leave-approvals" title="10-owner-leave-approvals"/>
+            <wp:cNvGraphicFramePr>
+              <a:graphicFrameLocks xmlns:a="http://schemas.openxmlformats.org/drawingml/2006/main" noChangeAspect="1"/>
+            </wp:cNvGraphicFramePr>
+            <a:graphic xmlns:a="http://schemas.openxmlformats.org/drawingml/2006/main">
+              <a:graphicData uri="http://schemas.openxmlformats.org/drawingml/2006/picture">
+                <pic:pic xmlns:pic="http://schemas.openxmlformats.org/drawingml/2006/picture">
+                  <pic:nvPicPr>
+                    <pic:cNvPr id="0" name="" descr=""/>
+                    <pic:cNvPicPr>
+                      <a:picLocks noChangeAspect="1" noChangeArrowheads="1"/>
+                    </pic:cNvPicPr>
+                  </pic:nvPicPr>
+                  <pic:blipFill>
+                    <a:blip r:embed="rId9" cstate="none"/>
+                    <a:srcRect/>
+                    <a:stretch>
+                      <a:fillRect/>
+                    </a:stretch>
+                  </pic:blipFill>
+                  <pic:spPr bwMode="auto">
+                    <a:xfrm>
+                      <a:off x="0" y="0"/>
+                      <a:ext cx="5905500" cy="3333750"/>
+                    </a:xfrm>
+                    <a:prstGeom prst="rect">
+                      <a:avLst/>
+                    </a:prstGeom>
+                  </pic:spPr>
+                </pic:pic>
+              </a:graphicData>
+            </a:graphic>
+          </wp:inline>
+        </w:drawing>
+      </w:r>
+    </w:p>
     <w:p>
       <w:pPr>
         <w:spacing w:after="80"/>
@@ -4949,59 +4797,51 @@
         <w:t xml:space="preserve">Team Calendar</w:t>
       </w:r>
     </w:p>
-    <w:tbl>
-      <w:tblPr>
-        <w:tblW w:type="dxa" w:w="9360"/>
-        <w:tblBorders>
-          <w:top w:val="single" w:color="auto" w:sz="4"/>
-          <w:left w:val="single" w:color="auto" w:sz="4"/>
-          <w:bottom w:val="single" w:color="auto" w:sz="4"/>
-          <w:right w:val="single" w:color="auto" w:sz="4"/>
-          <w:insideH w:val="single" w:color="auto" w:sz="4"/>
-          <w:insideV w:val="single" w:color="auto" w:sz="4"/>
-        </w:tblBorders>
-      </w:tblPr>
-      <w:tblGrid>
-        <w:gridCol w:w="9360"/>
-      </w:tblGrid>
-      <w:tr>
-        <w:tc>
-          <w:tcPr>
-            <w:tcW w:type="dxa" w:w="9360"/>
-            <w:tcBorders>
-              <w:top w:val="single" w:color="D1D5DB" w:sz="1"/>
-              <w:left w:val="single" w:color="D1D5DB" w:sz="1"/>
-              <w:bottom w:val="single" w:color="D1D5DB" w:sz="1"/>
-              <w:right w:val="single" w:color="D1D5DB" w:sz="1"/>
-            </w:tcBorders>
-            <w:shd w:fill="F3F4F6" w:val="clear"/>
-            <w:tcMar>
-              <w:top w:type="dxa" w:w="200"/>
-              <w:left w:type="dxa" w:w="300"/>
-              <w:bottom w:type="dxa" w:w="200"/>
-              <w:right w:type="dxa" w:w="300"/>
-            </w:tcMar>
-            <w:vAlign w:val="center"/>
-          </w:tcPr>
-          <w:p>
-            <w:pPr>
-              <w:jc w:val="center"/>
-            </w:pPr>
-            <w:r>
-              <w:rPr>
-                <w:rFonts w:ascii="Arial" w:cs="Arial" w:eastAsia="Arial" w:hAnsi="Arial"/>
-                <w:i/>
-                <w:iCs/>
-                <w:color w:val="9CA3AF"/>
-                <w:sz w:val="20"/>
-                <w:szCs w:val="20"/>
-              </w:rPr>
-              <w:t xml:space="preserve">[ Screenshot will be added ]</w:t>
-            </w:r>
-          </w:p>
-        </w:tc>
-      </w:tr>
-    </w:tbl>
+    <w:p>
+      <w:pPr>
+        <w:spacing w:after="160" w:before="80"/>
+      </w:pPr>
+      <w:r>
+        <w:drawing>
+          <wp:inline distT="0" distB="0" distL="0" distR="0">
+            <wp:extent cx="5905500" cy="3333750"/>
+            <wp:effectExtent t="0" r="0" b="0" l="0"/>
+            <wp:docPr id="1" name="11-owner-team-calendar" descr="11-owner-team-calendar" title="11-owner-team-calendar"/>
+            <wp:cNvGraphicFramePr>
+              <a:graphicFrameLocks xmlns:a="http://schemas.openxmlformats.org/drawingml/2006/main" noChangeAspect="1"/>
+            </wp:cNvGraphicFramePr>
+            <a:graphic xmlns:a="http://schemas.openxmlformats.org/drawingml/2006/main">
+              <a:graphicData uri="http://schemas.openxmlformats.org/drawingml/2006/picture">
+                <pic:pic xmlns:pic="http://schemas.openxmlformats.org/drawingml/2006/picture">
+                  <pic:nvPicPr>
+                    <pic:cNvPr id="0" name="" descr=""/>
+                    <pic:cNvPicPr>
+                      <a:picLocks noChangeAspect="1" noChangeArrowheads="1"/>
+                    </pic:cNvPicPr>
+                  </pic:nvPicPr>
+                  <pic:blipFill>
+                    <a:blip r:embed="rId9" cstate="none"/>
+                    <a:srcRect/>
+                    <a:stretch>
+                      <a:fillRect/>
+                    </a:stretch>
+                  </pic:blipFill>
+                  <pic:spPr bwMode="auto">
+                    <a:xfrm>
+                      <a:off x="0" y="0"/>
+                      <a:ext cx="5905500" cy="3333750"/>
+                    </a:xfrm>
+                    <a:prstGeom prst="rect">
+                      <a:avLst/>
+                    </a:prstGeom>
+                  </pic:spPr>
+                </pic:pic>
+              </a:graphicData>
+            </a:graphic>
+          </wp:inline>
+        </w:drawing>
+      </w:r>
+    </w:p>
     <w:p>
       <w:pPr>
         <w:spacing w:after="80"/>
@@ -5091,59 +4931,51 @@
         <w:t xml:space="preserve">System Config</w:t>
       </w:r>
     </w:p>
-    <w:tbl>
-      <w:tblPr>
-        <w:tblW w:type="dxa" w:w="9360"/>
-        <w:tblBorders>
-          <w:top w:val="single" w:color="auto" w:sz="4"/>
-          <w:left w:val="single" w:color="auto" w:sz="4"/>
-          <w:bottom w:val="single" w:color="auto" w:sz="4"/>
-          <w:right w:val="single" w:color="auto" w:sz="4"/>
-          <w:insideH w:val="single" w:color="auto" w:sz="4"/>
-          <w:insideV w:val="single" w:color="auto" w:sz="4"/>
-        </w:tblBorders>
-      </w:tblPr>
-      <w:tblGrid>
-        <w:gridCol w:w="9360"/>
-      </w:tblGrid>
-      <w:tr>
-        <w:tc>
-          <w:tcPr>
-            <w:tcW w:type="dxa" w:w="9360"/>
-            <w:tcBorders>
-              <w:top w:val="single" w:color="D1D5DB" w:sz="1"/>
-              <w:left w:val="single" w:color="D1D5DB" w:sz="1"/>
-              <w:bottom w:val="single" w:color="D1D5DB" w:sz="1"/>
-              <w:right w:val="single" w:color="D1D5DB" w:sz="1"/>
-            </w:tcBorders>
-            <w:shd w:fill="F3F4F6" w:val="clear"/>
-            <w:tcMar>
-              <w:top w:type="dxa" w:w="200"/>
-              <w:left w:type="dxa" w:w="300"/>
-              <w:bottom w:type="dxa" w:w="200"/>
-              <w:right w:type="dxa" w:w="300"/>
-            </w:tcMar>
-            <w:vAlign w:val="center"/>
-          </w:tcPr>
-          <w:p>
-            <w:pPr>
-              <w:jc w:val="center"/>
-            </w:pPr>
-            <w:r>
-              <w:rPr>
-                <w:rFonts w:ascii="Arial" w:cs="Arial" w:eastAsia="Arial" w:hAnsi="Arial"/>
-                <w:i/>
-                <w:iCs/>
-                <w:color w:val="9CA3AF"/>
-                <w:sz w:val="20"/>
-                <w:szCs w:val="20"/>
-              </w:rPr>
-              <w:t xml:space="preserve">[ Screenshot will be added ]</w:t>
-            </w:r>
-          </w:p>
-        </w:tc>
-      </w:tr>
-    </w:tbl>
+    <w:p>
+      <w:pPr>
+        <w:spacing w:after="160" w:before="80"/>
+      </w:pPr>
+      <w:r>
+        <w:drawing>
+          <wp:inline distT="0" distB="0" distL="0" distR="0">
+            <wp:extent cx="5905500" cy="3333750"/>
+            <wp:effectExtent t="0" r="0" b="0" l="0"/>
+            <wp:docPr id="1" name="12-owner-config" descr="12-owner-config" title="12-owner-config"/>
+            <wp:cNvGraphicFramePr>
+              <a:graphicFrameLocks xmlns:a="http://schemas.openxmlformats.org/drawingml/2006/main" noChangeAspect="1"/>
+            </wp:cNvGraphicFramePr>
+            <a:graphic xmlns:a="http://schemas.openxmlformats.org/drawingml/2006/main">
+              <a:graphicData uri="http://schemas.openxmlformats.org/drawingml/2006/picture">
+                <pic:pic xmlns:pic="http://schemas.openxmlformats.org/drawingml/2006/picture">
+                  <pic:nvPicPr>
+                    <pic:cNvPr id="0" name="" descr=""/>
+                    <pic:cNvPicPr>
+                      <a:picLocks noChangeAspect="1" noChangeArrowheads="1"/>
+                    </pic:cNvPicPr>
+                  </pic:nvPicPr>
+                  <pic:blipFill>
+                    <a:blip r:embed="rId9" cstate="none"/>
+                    <a:srcRect/>
+                    <a:stretch>
+                      <a:fillRect/>
+                    </a:stretch>
+                  </pic:blipFill>
+                  <pic:spPr bwMode="auto">
+                    <a:xfrm>
+                      <a:off x="0" y="0"/>
+                      <a:ext cx="5905500" cy="3333750"/>
+                    </a:xfrm>
+                    <a:prstGeom prst="rect">
+                      <a:avLst/>
+                    </a:prstGeom>
+                  </pic:spPr>
+                </pic:pic>
+              </a:graphicData>
+            </a:graphic>
+          </wp:inline>
+        </w:drawing>
+      </w:r>
+    </w:p>
     <w:p>
       <w:pPr>
         <w:spacing w:after="80"/>
@@ -5269,59 +5101,51 @@
         <w:t xml:space="preserve">Payroll</w:t>
       </w:r>
     </w:p>
-    <w:tbl>
-      <w:tblPr>
-        <w:tblW w:type="dxa" w:w="9360"/>
-        <w:tblBorders>
-          <w:top w:val="single" w:color="auto" w:sz="4"/>
-          <w:left w:val="single" w:color="auto" w:sz="4"/>
-          <w:bottom w:val="single" w:color="auto" w:sz="4"/>
-          <w:right w:val="single" w:color="auto" w:sz="4"/>
-          <w:insideH w:val="single" w:color="auto" w:sz="4"/>
-          <w:insideV w:val="single" w:color="auto" w:sz="4"/>
-        </w:tblBorders>
-      </w:tblPr>
-      <w:tblGrid>
-        <w:gridCol w:w="9360"/>
-      </w:tblGrid>
-      <w:tr>
-        <w:tc>
-          <w:tcPr>
-            <w:tcW w:type="dxa" w:w="9360"/>
-            <w:tcBorders>
-              <w:top w:val="single" w:color="D1D5DB" w:sz="1"/>
-              <w:left w:val="single" w:color="D1D5DB" w:sz="1"/>
-              <w:bottom w:val="single" w:color="D1D5DB" w:sz="1"/>
-              <w:right w:val="single" w:color="D1D5DB" w:sz="1"/>
-            </w:tcBorders>
-            <w:shd w:fill="F3F4F6" w:val="clear"/>
-            <w:tcMar>
-              <w:top w:type="dxa" w:w="200"/>
-              <w:left w:type="dxa" w:w="300"/>
-              <w:bottom w:type="dxa" w:w="200"/>
-              <w:right w:type="dxa" w:w="300"/>
-            </w:tcMar>
-            <w:vAlign w:val="center"/>
-          </w:tcPr>
-          <w:p>
-            <w:pPr>
-              <w:jc w:val="center"/>
-            </w:pPr>
-            <w:r>
-              <w:rPr>
-                <w:rFonts w:ascii="Arial" w:cs="Arial" w:eastAsia="Arial" w:hAnsi="Arial"/>
-                <w:i/>
-                <w:iCs/>
-                <w:color w:val="9CA3AF"/>
-                <w:sz w:val="20"/>
-                <w:szCs w:val="20"/>
-              </w:rPr>
-              <w:t xml:space="preserve">[ Screenshot will be added ]</w:t>
-            </w:r>
-          </w:p>
-        </w:tc>
-      </w:tr>
-    </w:tbl>
+    <w:p>
+      <w:pPr>
+        <w:spacing w:after="160" w:before="80"/>
+      </w:pPr>
+      <w:r>
+        <w:drawing>
+          <wp:inline distT="0" distB="0" distL="0" distR="0">
+            <wp:extent cx="5905500" cy="3333750"/>
+            <wp:effectExtent t="0" r="0" b="0" l="0"/>
+            <wp:docPr id="1" name="08-payroll" descr="08-payroll" title="08-payroll"/>
+            <wp:cNvGraphicFramePr>
+              <a:graphicFrameLocks xmlns:a="http://schemas.openxmlformats.org/drawingml/2006/main" noChangeAspect="1"/>
+            </wp:cNvGraphicFramePr>
+            <a:graphic xmlns:a="http://schemas.openxmlformats.org/drawingml/2006/main">
+              <a:graphicData uri="http://schemas.openxmlformats.org/drawingml/2006/picture">
+                <pic:pic xmlns:pic="http://schemas.openxmlformats.org/drawingml/2006/picture">
+                  <pic:nvPicPr>
+                    <pic:cNvPr id="0" name="" descr=""/>
+                    <pic:cNvPicPr>
+                      <a:picLocks noChangeAspect="1" noChangeArrowheads="1"/>
+                    </pic:cNvPicPr>
+                  </pic:nvPicPr>
+                  <pic:blipFill>
+                    <a:blip r:embed="rId9" cstate="none"/>
+                    <a:srcRect/>
+                    <a:stretch>
+                      <a:fillRect/>
+                    </a:stretch>
+                  </pic:blipFill>
+                  <pic:spPr bwMode="auto">
+                    <a:xfrm>
+                      <a:off x="0" y="0"/>
+                      <a:ext cx="5905500" cy="3333750"/>
+                    </a:xfrm>
+                    <a:prstGeom prst="rect">
+                      <a:avLst/>
+                    </a:prstGeom>
+                  </pic:spPr>
+                </pic:pic>
+              </a:graphicData>
+            </a:graphic>
+          </wp:inline>
+        </w:drawing>
+      </w:r>
+    </w:p>
     <w:p>
       <w:pPr>
         <w:spacing w:after="80"/>

</xml_diff>

<commit_message>
fix: correct screenshots in user manual + fix Login change-password redirect bug
- Rewrote capture-screenshots.mjs to use window.__navigate (exposed in App.tsx)
  for client-side navigation after login, preventing JWT loss from page reloads.
  Now creates fresh demo users via owner API so credentials are always known.
- Fixed Login.tsx onChangePassword: was missing updateUser({ is_default_password: false })
  after successful password change, causing ProtectedRoute to redirect back to
  /change-password instead of the dashboard.
- Regenerated user-manual.docx with correct per-page screenshots (each section
  now shows its own page, not the login page).

Co-Authored-By: Claude Sonnet 4.6 <noreply@anthropic.com>
</commit_message>
<xml_diff>
--- a/frontend/public/user-manual.docx
+++ b/frontend/public/user-manual.docx
@@ -2602,1564 +2602,6 @@
                     </pic:cNvPicPr>
                   </pic:nvPicPr>
                   <pic:blipFill>
-                    <a:blip r:embed="rId9" cstate="none"/>
-                    <a:srcRect/>
-                    <a:stretch>
-                      <a:fillRect/>
-                    </a:stretch>
-                  </pic:blipFill>
-                  <pic:spPr bwMode="auto">
-                    <a:xfrm>
-                      <a:off x="0" y="0"/>
-                      <a:ext cx="5905500" cy="3333750"/>
-                    </a:xfrm>
-                    <a:prstGeom prst="rect">
-                      <a:avLst/>
-                    </a:prstGeom>
-                  </pic:spPr>
-                </pic:pic>
-              </a:graphicData>
-            </a:graphic>
-          </wp:inline>
-        </w:drawing>
-      </w:r>
-    </w:p>
-    <w:p>
-      <w:pPr>
-        <w:spacing w:after="80"/>
-      </w:pPr>
-    </w:p>
-    <w:p>
-      <w:pPr>
-        <w:spacing w:after="120" w:line="276"/>
-      </w:pPr>
-      <w:r>
-        <w:rPr>
-          <w:rFonts w:ascii="Arial" w:cs="Arial" w:eastAsia="Arial" w:hAnsi="Arial"/>
-          <w:sz w:val="22"/>
-          <w:szCs w:val="22"/>
-        </w:rPr>
-        <w:t xml:space="preserve">Your home screen. Shows how many timecards you have logged this month, how many leave days you have used, and your remaining leave balance. Use this to get a quick overview of your activity.</w:t>
-      </w:r>
-    </w:p>
-    <w:p>
-      <w:pPr>
-        <w:pStyle w:val="Heading3"/>
-        <w:spacing w:after="80" w:before="220"/>
-      </w:pPr>
-      <w:r>
-        <w:rPr>
-          <w:rFonts w:ascii="Arial" w:cs="Arial" w:eastAsia="Arial" w:hAnsi="Arial"/>
-          <w:b/>
-          <w:bCs/>
-          <w:color w:val="374151"/>
-          <w:sz w:val="24"/>
-          <w:szCs w:val="24"/>
-        </w:rPr>
-        <w:t xml:space="preserve">My Timecard</w:t>
-      </w:r>
-    </w:p>
-    <w:p>
-      <w:pPr>
-        <w:spacing w:after="160" w:before="80"/>
-      </w:pPr>
-      <w:r>
-        <w:drawing>
-          <wp:inline distT="0" distB="0" distL="0" distR="0">
-            <wp:extent cx="5905500" cy="3333750"/>
-            <wp:effectExtent t="0" r="0" b="0" l="0"/>
-            <wp:docPr id="1" name="14-my-timecard" descr="14-my-timecard" title="14-my-timecard"/>
-            <wp:cNvGraphicFramePr>
-              <a:graphicFrameLocks xmlns:a="http://schemas.openxmlformats.org/drawingml/2006/main" noChangeAspect="1"/>
-            </wp:cNvGraphicFramePr>
-            <a:graphic xmlns:a="http://schemas.openxmlformats.org/drawingml/2006/main">
-              <a:graphicData uri="http://schemas.openxmlformats.org/drawingml/2006/picture">
-                <pic:pic xmlns:pic="http://schemas.openxmlformats.org/drawingml/2006/picture">
-                  <pic:nvPicPr>
-                    <pic:cNvPr id="0" name="" descr=""/>
-                    <pic:cNvPicPr>
-                      <a:picLocks noChangeAspect="1" noChangeArrowheads="1"/>
-                    </pic:cNvPicPr>
-                  </pic:nvPicPr>
-                  <pic:blipFill>
-                    <a:blip r:embed="rId9" cstate="none"/>
-                    <a:srcRect/>
-                    <a:stretch>
-                      <a:fillRect/>
-                    </a:stretch>
-                  </pic:blipFill>
-                  <pic:spPr bwMode="auto">
-                    <a:xfrm>
-                      <a:off x="0" y="0"/>
-                      <a:ext cx="5905500" cy="3333750"/>
-                    </a:xfrm>
-                    <a:prstGeom prst="rect">
-                      <a:avLst/>
-                    </a:prstGeom>
-                  </pic:spPr>
-                </pic:pic>
-              </a:graphicData>
-            </a:graphic>
-          </wp:inline>
-        </w:drawing>
-      </w:r>
-    </w:p>
-    <w:p>
-      <w:pPr>
-        <w:spacing w:after="80"/>
-      </w:pPr>
-    </w:p>
-    <w:p>
-      <w:pPr>
-        <w:spacing w:after="120" w:line="276"/>
-      </w:pPr>
-      <w:r>
-        <w:rPr>
-          <w:rFonts w:ascii="Arial" w:cs="Arial" w:eastAsia="Arial" w:hAnsi="Arial"/>
-          <w:sz w:val="22"/>
-          <w:szCs w:val="22"/>
-        </w:rPr>
-        <w:t xml:space="preserve">This is where you record your daily attendance.</w:t>
-      </w:r>
-    </w:p>
-    <w:p>
-      <w:pPr>
-        <w:pStyle w:val="ListParagraph"/>
-        <w:numPr>
-          <w:ilvl w:val="0"/>
-          <w:numId w:val="3"/>
-        </w:numPr>
-        <w:spacing w:after="80"/>
-      </w:pPr>
-      <w:r>
-        <w:rPr>
-          <w:rFonts w:ascii="Arial" w:cs="Arial" w:eastAsia="Arial" w:hAnsi="Arial"/>
-          <w:sz w:val="22"/>
-          <w:szCs w:val="22"/>
-        </w:rPr>
-        <w:t xml:space="preserve">Click "+ Add Timecard" to log attendance for a single day</w:t>
-      </w:r>
-    </w:p>
-    <w:p>
-      <w:pPr>
-        <w:pStyle w:val="ListParagraph"/>
-        <w:numPr>
-          <w:ilvl w:val="0"/>
-          <w:numId w:val="3"/>
-        </w:numPr>
-        <w:spacing w:after="80"/>
-      </w:pPr>
-      <w:r>
-        <w:rPr>
-          <w:rFonts w:ascii="Arial" w:cs="Arial" w:eastAsia="Arial" w:hAnsi="Arial"/>
-          <w:sz w:val="22"/>
-          <w:szCs w:val="22"/>
-        </w:rPr>
-        <w:t xml:space="preserve">Select the date, write a short note about your work for the day, and click Save</w:t>
-      </w:r>
-    </w:p>
-    <w:p>
-      <w:pPr>
-        <w:pStyle w:val="ListParagraph"/>
-        <w:numPr>
-          <w:ilvl w:val="0"/>
-          <w:numId w:val="3"/>
-        </w:numPr>
-        <w:spacing w:after="80"/>
-      </w:pPr>
-      <w:r>
-        <w:rPr>
-          <w:rFonts w:ascii="Arial" w:cs="Arial" w:eastAsia="Arial" w:hAnsi="Arial"/>
-          <w:sz w:val="22"/>
-          <w:szCs w:val="22"/>
-        </w:rPr>
-        <w:t xml:space="preserve">Use "Bulk Add Timecard" to log attendance for a range of dates at once — the system will automatically skip Sundays and public holidays</w:t>
-      </w:r>
-    </w:p>
-    <w:p>
-      <w:pPr>
-        <w:pStyle w:val="ListParagraph"/>
-        <w:numPr>
-          <w:ilvl w:val="0"/>
-          <w:numId w:val="3"/>
-        </w:numPr>
-        <w:spacing w:after="80"/>
-      </w:pPr>
-      <w:r>
-        <w:rPr>
-          <w:rFonts w:ascii="Arial" w:cs="Arial" w:eastAsia="Arial" w:hAnsi="Arial"/>
-          <w:sz w:val="22"/>
-          <w:szCs w:val="22"/>
-        </w:rPr>
-        <w:t xml:space="preserve">You can edit or delete a timecard as long as it has not been approved yet</w:t>
-      </w:r>
-    </w:p>
-    <w:p>
-      <w:pPr>
-        <w:pStyle w:val="Heading3"/>
-        <w:spacing w:after="80" w:before="220"/>
-      </w:pPr>
-      <w:r>
-        <w:rPr>
-          <w:rFonts w:ascii="Arial" w:cs="Arial" w:eastAsia="Arial" w:hAnsi="Arial"/>
-          <w:b/>
-          <w:bCs/>
-          <w:color w:val="374151"/>
-          <w:sz w:val="24"/>
-          <w:szCs w:val="24"/>
-        </w:rPr>
-        <w:t xml:space="preserve">Overtime</w:t>
-      </w:r>
-    </w:p>
-    <w:p>
-      <w:pPr>
-        <w:spacing w:after="160" w:before="80"/>
-      </w:pPr>
-      <w:r>
-        <w:drawing>
-          <wp:inline distT="0" distB="0" distL="0" distR="0">
-            <wp:extent cx="5905500" cy="3333750"/>
-            <wp:effectExtent t="0" r="0" b="0" l="0"/>
-            <wp:docPr id="1" name="14-my-timecard" descr="14-my-timecard" title="14-my-timecard"/>
-            <wp:cNvGraphicFramePr>
-              <a:graphicFrameLocks xmlns:a="http://schemas.openxmlformats.org/drawingml/2006/main" noChangeAspect="1"/>
-            </wp:cNvGraphicFramePr>
-            <a:graphic xmlns:a="http://schemas.openxmlformats.org/drawingml/2006/main">
-              <a:graphicData uri="http://schemas.openxmlformats.org/drawingml/2006/picture">
-                <pic:pic xmlns:pic="http://schemas.openxmlformats.org/drawingml/2006/picture">
-                  <pic:nvPicPr>
-                    <pic:cNvPr id="0" name="" descr=""/>
-                    <pic:cNvPicPr>
-                      <a:picLocks noChangeAspect="1" noChangeArrowheads="1"/>
-                    </pic:cNvPicPr>
-                  </pic:nvPicPr>
-                  <pic:blipFill>
-                    <a:blip r:embed="rId9" cstate="none"/>
-                    <a:srcRect/>
-                    <a:stretch>
-                      <a:fillRect/>
-                    </a:stretch>
-                  </pic:blipFill>
-                  <pic:spPr bwMode="auto">
-                    <a:xfrm>
-                      <a:off x="0" y="0"/>
-                      <a:ext cx="5905500" cy="3333750"/>
-                    </a:xfrm>
-                    <a:prstGeom prst="rect">
-                      <a:avLst/>
-                    </a:prstGeom>
-                  </pic:spPr>
-                </pic:pic>
-              </a:graphicData>
-            </a:graphic>
-          </wp:inline>
-        </w:drawing>
-      </w:r>
-    </w:p>
-    <w:p>
-      <w:pPr>
-        <w:spacing w:after="80"/>
-      </w:pPr>
-    </w:p>
-    <w:p>
-      <w:pPr>
-        <w:spacing w:after="120" w:line="276"/>
-      </w:pPr>
-      <w:r>
-        <w:rPr>
-          <w:rFonts w:ascii="Arial" w:cs="Arial" w:eastAsia="Arial" w:hAnsi="Arial"/>
-          <w:sz w:val="22"/>
-          <w:szCs w:val="22"/>
-        </w:rPr>
-        <w:t xml:space="preserve">Log extra hours you have worked beyond your regular shift.</w:t>
-      </w:r>
-    </w:p>
-    <w:p>
-      <w:pPr>
-        <w:pStyle w:val="ListParagraph"/>
-        <w:numPr>
-          <w:ilvl w:val="0"/>
-          <w:numId w:val="3"/>
-        </w:numPr>
-        <w:spacing w:after="80"/>
-      </w:pPr>
-      <w:r>
-        <w:rPr>
-          <w:rFonts w:ascii="Arial" w:cs="Arial" w:eastAsia="Arial" w:hAnsi="Arial"/>
-          <w:sz w:val="22"/>
-          <w:szCs w:val="22"/>
-        </w:rPr>
-        <w:t xml:space="preserve">Click "+ Add Overtime", pick the date, enter the number of hours, and save</w:t>
-      </w:r>
-    </w:p>
-    <w:p>
-      <w:pPr>
-        <w:pStyle w:val="ListParagraph"/>
-        <w:numPr>
-          <w:ilvl w:val="0"/>
-          <w:numId w:val="3"/>
-        </w:numPr>
-        <w:spacing w:after="80"/>
-      </w:pPr>
-      <w:r>
-        <w:rPr>
-          <w:rFonts w:ascii="Arial" w:cs="Arial" w:eastAsia="Arial" w:hAnsi="Arial"/>
-          <w:sz w:val="22"/>
-          <w:szCs w:val="22"/>
-        </w:rPr>
-        <w:t xml:space="preserve">Your overtime payout is calculated automatically based on the company rate</w:t>
-      </w:r>
-    </w:p>
-    <w:p>
-      <w:pPr>
-        <w:pStyle w:val="Heading3"/>
-        <w:spacing w:after="80" w:before="220"/>
-      </w:pPr>
-      <w:r>
-        <w:rPr>
-          <w:rFonts w:ascii="Arial" w:cs="Arial" w:eastAsia="Arial" w:hAnsi="Arial"/>
-          <w:b/>
-          <w:bCs/>
-          <w:color w:val="374151"/>
-          <w:sz w:val="24"/>
-          <w:szCs w:val="24"/>
-        </w:rPr>
-        <w:t xml:space="preserve">My Leave</w:t>
-      </w:r>
-    </w:p>
-    <w:p>
-      <w:pPr>
-        <w:spacing w:after="160" w:before="80"/>
-      </w:pPr>
-      <w:r>
-        <w:drawing>
-          <wp:inline distT="0" distB="0" distL="0" distR="0">
-            <wp:extent cx="5905500" cy="3333750"/>
-            <wp:effectExtent t="0" r="0" b="0" l="0"/>
-            <wp:docPr id="1" name="15-my-leave" descr="15-my-leave" title="15-my-leave"/>
-            <wp:cNvGraphicFramePr>
-              <a:graphicFrameLocks xmlns:a="http://schemas.openxmlformats.org/drawingml/2006/main" noChangeAspect="1"/>
-            </wp:cNvGraphicFramePr>
-            <a:graphic xmlns:a="http://schemas.openxmlformats.org/drawingml/2006/main">
-              <a:graphicData uri="http://schemas.openxmlformats.org/drawingml/2006/picture">
-                <pic:pic xmlns:pic="http://schemas.openxmlformats.org/drawingml/2006/picture">
-                  <pic:nvPicPr>
-                    <pic:cNvPr id="0" name="" descr=""/>
-                    <pic:cNvPicPr>
-                      <a:picLocks noChangeAspect="1" noChangeArrowheads="1"/>
-                    </pic:cNvPicPr>
-                  </pic:nvPicPr>
-                  <pic:blipFill>
-                    <a:blip r:embed="rId9" cstate="none"/>
-                    <a:srcRect/>
-                    <a:stretch>
-                      <a:fillRect/>
-                    </a:stretch>
-                  </pic:blipFill>
-                  <pic:spPr bwMode="auto">
-                    <a:xfrm>
-                      <a:off x="0" y="0"/>
-                      <a:ext cx="5905500" cy="3333750"/>
-                    </a:xfrm>
-                    <a:prstGeom prst="rect">
-                      <a:avLst/>
-                    </a:prstGeom>
-                  </pic:spPr>
-                </pic:pic>
-              </a:graphicData>
-            </a:graphic>
-          </wp:inline>
-        </w:drawing>
-      </w:r>
-    </w:p>
-    <w:p>
-      <w:pPr>
-        <w:spacing w:after="80"/>
-      </w:pPr>
-    </w:p>
-    <w:p>
-      <w:pPr>
-        <w:spacing w:after="120" w:line="276"/>
-      </w:pPr>
-      <w:r>
-        <w:rPr>
-          <w:rFonts w:ascii="Arial" w:cs="Arial" w:eastAsia="Arial" w:hAnsi="Arial"/>
-          <w:sz w:val="22"/>
-          <w:szCs w:val="22"/>
-        </w:rPr>
-        <w:t xml:space="preserve">Apply for planned leave (day off).</w:t>
-      </w:r>
-    </w:p>
-    <w:p>
-      <w:pPr>
-        <w:pStyle w:val="ListParagraph"/>
-        <w:numPr>
-          <w:ilvl w:val="0"/>
-          <w:numId w:val="3"/>
-        </w:numPr>
-        <w:spacing w:after="80"/>
-      </w:pPr>
-      <w:r>
-        <w:rPr>
-          <w:rFonts w:ascii="Arial" w:cs="Arial" w:eastAsia="Arial" w:hAnsi="Arial"/>
-          <w:sz w:val="22"/>
-          <w:szCs w:val="22"/>
-        </w:rPr>
-        <w:t xml:space="preserve">Click "Apply Leave", pick the date and write a reason, then submit</w:t>
-      </w:r>
-    </w:p>
-    <w:p>
-      <w:pPr>
-        <w:pStyle w:val="ListParagraph"/>
-        <w:numPr>
-          <w:ilvl w:val="0"/>
-          <w:numId w:val="3"/>
-        </w:numPr>
-        <w:spacing w:after="80"/>
-      </w:pPr>
-      <w:r>
-        <w:rPr>
-          <w:rFonts w:ascii="Arial" w:cs="Arial" w:eastAsia="Arial" w:hAnsi="Arial"/>
-          <w:sz w:val="22"/>
-          <w:szCs w:val="22"/>
-        </w:rPr>
-        <w:t xml:space="preserve">Your leave balance shows how many days you have remaining</w:t>
-      </w:r>
-    </w:p>
-    <w:p>
-      <w:pPr>
-        <w:pStyle w:val="ListParagraph"/>
-        <w:numPr>
-          <w:ilvl w:val="0"/>
-          <w:numId w:val="3"/>
-        </w:numPr>
-        <w:spacing w:after="80"/>
-      </w:pPr>
-      <w:r>
-        <w:rPr>
-          <w:rFonts w:ascii="Arial" w:cs="Arial" w:eastAsia="Arial" w:hAnsi="Arial"/>
-          <w:sz w:val="22"/>
-          <w:szCs w:val="22"/>
-        </w:rPr>
-        <w:t xml:space="preserve">You can apply for multiple days at once using the date range option</w:t>
-      </w:r>
-    </w:p>
-    <w:p>
-      <w:pPr>
-        <w:pStyle w:val="ListParagraph"/>
-        <w:numPr>
-          <w:ilvl w:val="0"/>
-          <w:numId w:val="3"/>
-        </w:numPr>
-        <w:spacing w:after="80"/>
-      </w:pPr>
-      <w:r>
-        <w:rPr>
-          <w:rFonts w:ascii="Arial" w:cs="Arial" w:eastAsia="Arial" w:hAnsi="Arial"/>
-          <w:sz w:val="22"/>
-          <w:szCs w:val="22"/>
-        </w:rPr>
-        <w:t xml:space="preserve">Once a leave is approved by your manager, it cannot be cancelled — contact your manager if needed</w:t>
-      </w:r>
-    </w:p>
-    <w:p>
-      <w:pPr>
-        <w:pStyle w:val="Heading3"/>
-        <w:spacing w:after="80" w:before="220"/>
-      </w:pPr>
-      <w:r>
-        <w:rPr>
-          <w:rFonts w:ascii="Arial" w:cs="Arial" w:eastAsia="Arial" w:hAnsi="Arial"/>
-          <w:b/>
-          <w:bCs/>
-          <w:color w:val="374151"/>
-          <w:sz w:val="24"/>
-          <w:szCs w:val="24"/>
-        </w:rPr>
-        <w:t xml:space="preserve">My Calendar</w:t>
-      </w:r>
-    </w:p>
-    <w:p>
-      <w:pPr>
-        <w:spacing w:after="160" w:before="80"/>
-      </w:pPr>
-      <w:r>
-        <w:drawing>
-          <wp:inline distT="0" distB="0" distL="0" distR="0">
-            <wp:extent cx="5905500" cy="3333750"/>
-            <wp:effectExtent t="0" r="0" b="0" l="0"/>
-            <wp:docPr id="1" name="16-my-calendar" descr="16-my-calendar" title="16-my-calendar"/>
-            <wp:cNvGraphicFramePr>
-              <a:graphicFrameLocks xmlns:a="http://schemas.openxmlformats.org/drawingml/2006/main" noChangeAspect="1"/>
-            </wp:cNvGraphicFramePr>
-            <a:graphic xmlns:a="http://schemas.openxmlformats.org/drawingml/2006/main">
-              <a:graphicData uri="http://schemas.openxmlformats.org/drawingml/2006/picture">
-                <pic:pic xmlns:pic="http://schemas.openxmlformats.org/drawingml/2006/picture">
-                  <pic:nvPicPr>
-                    <pic:cNvPr id="0" name="" descr=""/>
-                    <pic:cNvPicPr>
-                      <a:picLocks noChangeAspect="1" noChangeArrowheads="1"/>
-                    </pic:cNvPicPr>
-                  </pic:nvPicPr>
-                  <pic:blipFill>
-                    <a:blip r:embed="rId9" cstate="none"/>
-                    <a:srcRect/>
-                    <a:stretch>
-                      <a:fillRect/>
-                    </a:stretch>
-                  </pic:blipFill>
-                  <pic:spPr bwMode="auto">
-                    <a:xfrm>
-                      <a:off x="0" y="0"/>
-                      <a:ext cx="5905500" cy="3333750"/>
-                    </a:xfrm>
-                    <a:prstGeom prst="rect">
-                      <a:avLst/>
-                    </a:prstGeom>
-                  </pic:spPr>
-                </pic:pic>
-              </a:graphicData>
-            </a:graphic>
-          </wp:inline>
-        </w:drawing>
-      </w:r>
-    </w:p>
-    <w:p>
-      <w:pPr>
-        <w:spacing w:after="80"/>
-      </w:pPr>
-    </w:p>
-    <w:p>
-      <w:pPr>
-        <w:spacing w:after="120" w:line="276"/>
-      </w:pPr>
-      <w:r>
-        <w:rPr>
-          <w:rFonts w:ascii="Arial" w:cs="Arial" w:eastAsia="Arial" w:hAnsi="Arial"/>
-          <w:sz w:val="22"/>
-          <w:szCs w:val="22"/>
-        </w:rPr>
-        <w:t xml:space="preserve">A monthly calendar view of your attendance.</w:t>
-      </w:r>
-    </w:p>
-    <w:p>
-      <w:pPr>
-        <w:pStyle w:val="ListParagraph"/>
-        <w:numPr>
-          <w:ilvl w:val="0"/>
-          <w:numId w:val="3"/>
-        </w:numPr>
-        <w:spacing w:after="80"/>
-      </w:pPr>
-      <w:r>
-        <w:rPr>
-          <w:rFonts w:ascii="Arial" w:cs="Arial" w:eastAsia="Arial" w:hAnsi="Arial"/>
-          <w:sz w:val="22"/>
-          <w:szCs w:val="22"/>
-        </w:rPr>
-        <w:t xml:space="preserve">Green days = attendance approved</w:t>
-      </w:r>
-    </w:p>
-    <w:p>
-      <w:pPr>
-        <w:pStyle w:val="ListParagraph"/>
-        <w:numPr>
-          <w:ilvl w:val="0"/>
-          <w:numId w:val="3"/>
-        </w:numPr>
-        <w:spacing w:after="80"/>
-      </w:pPr>
-      <w:r>
-        <w:rPr>
-          <w:rFonts w:ascii="Arial" w:cs="Arial" w:eastAsia="Arial" w:hAnsi="Arial"/>
-          <w:sz w:val="22"/>
-          <w:szCs w:val="22"/>
-        </w:rPr>
-        <w:t xml:space="preserve">Yellow days = attendance submitted, waiting for approval</w:t>
-      </w:r>
-    </w:p>
-    <w:p>
-      <w:pPr>
-        <w:pStyle w:val="ListParagraph"/>
-        <w:numPr>
-          <w:ilvl w:val="0"/>
-          <w:numId w:val="3"/>
-        </w:numPr>
-        <w:spacing w:after="80"/>
-      </w:pPr>
-      <w:r>
-        <w:rPr>
-          <w:rFonts w:ascii="Arial" w:cs="Arial" w:eastAsia="Arial" w:hAnsi="Arial"/>
-          <w:sz w:val="22"/>
-          <w:szCs w:val="22"/>
-        </w:rPr>
-        <w:t xml:space="preserve">Blue days = leave</w:t>
-      </w:r>
-    </w:p>
-    <w:p>
-      <w:pPr>
-        <w:pStyle w:val="ListParagraph"/>
-        <w:numPr>
-          <w:ilvl w:val="0"/>
-          <w:numId w:val="3"/>
-        </w:numPr>
-        <w:spacing w:after="80"/>
-      </w:pPr>
-      <w:r>
-        <w:rPr>
-          <w:rFonts w:ascii="Arial" w:cs="Arial" w:eastAsia="Arial" w:hAnsi="Arial"/>
-          <w:sz w:val="22"/>
-          <w:szCs w:val="22"/>
-        </w:rPr>
-        <w:t xml:space="preserve">Grey days = public holiday</w:t>
-      </w:r>
-    </w:p>
-    <w:p>
-      <w:pPr>
-        <w:pStyle w:val="ListParagraph"/>
-        <w:numPr>
-          <w:ilvl w:val="0"/>
-          <w:numId w:val="3"/>
-        </w:numPr>
-        <w:spacing w:after="80"/>
-      </w:pPr>
-      <w:r>
-        <w:rPr>
-          <w:rFonts w:ascii="Arial" w:cs="Arial" w:eastAsia="Arial" w:hAnsi="Arial"/>
-          <w:sz w:val="22"/>
-          <w:szCs w:val="22"/>
-        </w:rPr>
-        <w:t xml:space="preserve">Navigate between months using the arrows at the top</w:t>
-      </w:r>
-    </w:p>
-    <w:p>
-      <w:pPr>
-        <w:pStyle w:val="Heading3"/>
-        <w:spacing w:after="80" w:before="220"/>
-      </w:pPr>
-      <w:r>
-        <w:rPr>
-          <w:rFonts w:ascii="Arial" w:cs="Arial" w:eastAsia="Arial" w:hAnsi="Arial"/>
-          <w:b/>
-          <w:bCs/>
-          <w:color w:val="374151"/>
-          <w:sz w:val="24"/>
-          <w:szCs w:val="24"/>
-        </w:rPr>
-        <w:t xml:space="preserve">Inventory</w:t>
-      </w:r>
-    </w:p>
-    <w:p>
-      <w:pPr>
-        <w:spacing w:after="160" w:before="80"/>
-      </w:pPr>
-      <w:r>
-        <w:drawing>
-          <wp:inline distT="0" distB="0" distL="0" distR="0">
-            <wp:extent cx="5905500" cy="3333750"/>
-            <wp:effectExtent t="0" r="0" b="0" l="0"/>
-            <wp:docPr id="1" name="04-inventory" descr="04-inventory" title="04-inventory"/>
-            <wp:cNvGraphicFramePr>
-              <a:graphicFrameLocks xmlns:a="http://schemas.openxmlformats.org/drawingml/2006/main" noChangeAspect="1"/>
-            </wp:cNvGraphicFramePr>
-            <a:graphic xmlns:a="http://schemas.openxmlformats.org/drawingml/2006/main">
-              <a:graphicData uri="http://schemas.openxmlformats.org/drawingml/2006/picture">
-                <pic:pic xmlns:pic="http://schemas.openxmlformats.org/drawingml/2006/picture">
-                  <pic:nvPicPr>
-                    <pic:cNvPr id="0" name="" descr=""/>
-                    <pic:cNvPicPr>
-                      <a:picLocks noChangeAspect="1" noChangeArrowheads="1"/>
-                    </pic:cNvPicPr>
-                  </pic:nvPicPr>
-                  <pic:blipFill>
-                    <a:blip r:embed="rId9" cstate="none"/>
-                    <a:srcRect/>
-                    <a:stretch>
-                      <a:fillRect/>
-                    </a:stretch>
-                  </pic:blipFill>
-                  <pic:spPr bwMode="auto">
-                    <a:xfrm>
-                      <a:off x="0" y="0"/>
-                      <a:ext cx="5905500" cy="3333750"/>
-                    </a:xfrm>
-                    <a:prstGeom prst="rect">
-                      <a:avLst/>
-                    </a:prstGeom>
-                  </pic:spPr>
-                </pic:pic>
-              </a:graphicData>
-            </a:graphic>
-          </wp:inline>
-        </w:drawing>
-      </w:r>
-    </w:p>
-    <w:p>
-      <w:pPr>
-        <w:spacing w:after="80"/>
-      </w:pPr>
-    </w:p>
-    <w:p>
-      <w:pPr>
-        <w:spacing w:after="120" w:line="276"/>
-      </w:pPr>
-      <w:r>
-        <w:rPr>
-          <w:rFonts w:ascii="Arial" w:cs="Arial" w:eastAsia="Arial" w:hAnsi="Arial"/>
-          <w:sz w:val="22"/>
-          <w:szCs w:val="22"/>
-        </w:rPr>
-        <w:t xml:space="preserve">View the current stock levels of all products. You can see how many units are available, reserved, and consumed. This is a read-only view — you cannot make changes here.</w:t>
-      </w:r>
-    </w:p>
-    <w:p>
-      <w:pPr>
-        <w:pStyle w:val="Heading3"/>
-        <w:spacing w:after="80" w:before="220"/>
-      </w:pPr>
-      <w:r>
-        <w:rPr>
-          <w:rFonts w:ascii="Arial" w:cs="Arial" w:eastAsia="Arial" w:hAnsi="Arial"/>
-          <w:b/>
-          <w:bCs/>
-          <w:color w:val="374151"/>
-          <w:sz w:val="24"/>
-          <w:szCs w:val="24"/>
-        </w:rPr>
-        <w:t xml:space="preserve">Quotations</w:t>
-      </w:r>
-    </w:p>
-    <w:p>
-      <w:pPr>
-        <w:spacing w:after="160" w:before="80"/>
-      </w:pPr>
-      <w:r>
-        <w:drawing>
-          <wp:inline distT="0" distB="0" distL="0" distR="0">
-            <wp:extent cx="5905500" cy="3333750"/>
-            <wp:effectExtent t="0" r="0" b="0" l="0"/>
-            <wp:docPr id="1" name="05-quotations" descr="05-quotations" title="05-quotations"/>
-            <wp:cNvGraphicFramePr>
-              <a:graphicFrameLocks xmlns:a="http://schemas.openxmlformats.org/drawingml/2006/main" noChangeAspect="1"/>
-            </wp:cNvGraphicFramePr>
-            <a:graphic xmlns:a="http://schemas.openxmlformats.org/drawingml/2006/main">
-              <a:graphicData uri="http://schemas.openxmlformats.org/drawingml/2006/picture">
-                <pic:pic xmlns:pic="http://schemas.openxmlformats.org/drawingml/2006/picture">
-                  <pic:nvPicPr>
-                    <pic:cNvPr id="0" name="" descr=""/>
-                    <pic:cNvPicPr>
-                      <a:picLocks noChangeAspect="1" noChangeArrowheads="1"/>
-                    </pic:cNvPicPr>
-                  </pic:nvPicPr>
-                  <pic:blipFill>
-                    <a:blip r:embed="rId9" cstate="none"/>
-                    <a:srcRect/>
-                    <a:stretch>
-                      <a:fillRect/>
-                    </a:stretch>
-                  </pic:blipFill>
-                  <pic:spPr bwMode="auto">
-                    <a:xfrm>
-                      <a:off x="0" y="0"/>
-                      <a:ext cx="5905500" cy="3333750"/>
-                    </a:xfrm>
-                    <a:prstGeom prst="rect">
-                      <a:avLst/>
-                    </a:prstGeom>
-                  </pic:spPr>
-                </pic:pic>
-              </a:graphicData>
-            </a:graphic>
-          </wp:inline>
-        </w:drawing>
-      </w:r>
-    </w:p>
-    <w:p>
-      <w:pPr>
-        <w:spacing w:after="80"/>
-      </w:pPr>
-    </w:p>
-    <w:p>
-      <w:pPr>
-        <w:spacing w:after="120" w:line="276"/>
-      </w:pPr>
-      <w:r>
-        <w:rPr>
-          <w:rFonts w:ascii="Arial" w:cs="Arial" w:eastAsia="Arial" w:hAnsi="Arial"/>
-          <w:sz w:val="22"/>
-          <w:szCs w:val="22"/>
-        </w:rPr>
-        <w:t xml:space="preserve">Create a price quotation to send to a customer.</w:t>
-      </w:r>
-    </w:p>
-    <w:p>
-      <w:pPr>
-        <w:pStyle w:val="ListParagraph"/>
-        <w:numPr>
-          <w:ilvl w:val="0"/>
-          <w:numId w:val="3"/>
-        </w:numPr>
-        <w:spacing w:after="80"/>
-      </w:pPr>
-      <w:r>
-        <w:rPr>
-          <w:rFonts w:ascii="Arial" w:cs="Arial" w:eastAsia="Arial" w:hAnsi="Arial"/>
-          <w:sz w:val="22"/>
-          <w:szCs w:val="22"/>
-        </w:rPr>
-        <w:t xml:space="preserve">Click "New Quotation" to start</w:t>
-      </w:r>
-    </w:p>
-    <w:p>
-      <w:pPr>
-        <w:pStyle w:val="ListParagraph"/>
-        <w:numPr>
-          <w:ilvl w:val="0"/>
-          <w:numId w:val="3"/>
-        </w:numPr>
-        <w:spacing w:after="80"/>
-      </w:pPr>
-      <w:r>
-        <w:rPr>
-          <w:rFonts w:ascii="Arial" w:cs="Arial" w:eastAsia="Arial" w:hAnsi="Arial"/>
-          <w:sz w:val="22"/>
-          <w:szCs w:val="22"/>
-        </w:rPr>
-        <w:t xml:space="preserve">Fill in the customer's name, phone, email, and address</w:t>
-      </w:r>
-    </w:p>
-    <w:p>
-      <w:pPr>
-        <w:pStyle w:val="ListParagraph"/>
-        <w:numPr>
-          <w:ilvl w:val="0"/>
-          <w:numId w:val="3"/>
-        </w:numPr>
-        <w:spacing w:after="80"/>
-      </w:pPr>
-      <w:r>
-        <w:rPr>
-          <w:rFonts w:ascii="Arial" w:cs="Arial" w:eastAsia="Arial" w:hAnsi="Arial"/>
-          <w:sz w:val="22"/>
-          <w:szCs w:val="22"/>
-        </w:rPr>
-        <w:t xml:space="preserve">Select the products and enter the quantity</w:t>
-      </w:r>
-    </w:p>
-    <w:p>
-      <w:pPr>
-        <w:pStyle w:val="ListParagraph"/>
-        <w:numPr>
-          <w:ilvl w:val="0"/>
-          <w:numId w:val="3"/>
-        </w:numPr>
-        <w:spacing w:after="80"/>
-      </w:pPr>
-      <w:r>
-        <w:rPr>
-          <w:rFonts w:ascii="Arial" w:cs="Arial" w:eastAsia="Arial" w:hAnsi="Arial"/>
-          <w:sz w:val="22"/>
-          <w:szCs w:val="22"/>
-        </w:rPr>
-        <w:t xml:space="preserve">The total amount is calculated automatically</w:t>
-      </w:r>
-    </w:p>
-    <w:p>
-      <w:pPr>
-        <w:pStyle w:val="ListParagraph"/>
-        <w:numPr>
-          <w:ilvl w:val="0"/>
-          <w:numId w:val="3"/>
-        </w:numPr>
-        <w:spacing w:after="80"/>
-      </w:pPr>
-      <w:r>
-        <w:rPr>
-          <w:rFonts w:ascii="Arial" w:cs="Arial" w:eastAsia="Arial" w:hAnsi="Arial"/>
-          <w:sz w:val="22"/>
-          <w:szCs w:val="22"/>
-        </w:rPr>
-        <w:t xml:space="preserve">Submit the quotation for your manager's approval</w:t>
-      </w:r>
-    </w:p>
-    <w:p>
-      <w:pPr>
-        <w:pStyle w:val="Heading3"/>
-        <w:spacing w:after="80" w:before="220"/>
-      </w:pPr>
-      <w:r>
-        <w:rPr>
-          <w:rFonts w:ascii="Arial" w:cs="Arial" w:eastAsia="Arial" w:hAnsi="Arial"/>
-          <w:b/>
-          <w:bCs/>
-          <w:color w:val="374151"/>
-          <w:sz w:val="24"/>
-          <w:szCs w:val="24"/>
-        </w:rPr>
-        <w:t xml:space="preserve">Offers</w:t>
-      </w:r>
-    </w:p>
-    <w:p>
-      <w:pPr>
-        <w:spacing w:after="160" w:before="80"/>
-      </w:pPr>
-      <w:r>
-        <w:drawing>
-          <wp:inline distT="0" distB="0" distL="0" distR="0">
-            <wp:extent cx="5905500" cy="3333750"/>
-            <wp:effectExtent t="0" r="0" b="0" l="0"/>
-            <wp:docPr id="1" name="06-offers" descr="06-offers" title="06-offers"/>
-            <wp:cNvGraphicFramePr>
-              <a:graphicFrameLocks xmlns:a="http://schemas.openxmlformats.org/drawingml/2006/main" noChangeAspect="1"/>
-            </wp:cNvGraphicFramePr>
-            <a:graphic xmlns:a="http://schemas.openxmlformats.org/drawingml/2006/main">
-              <a:graphicData uri="http://schemas.openxmlformats.org/drawingml/2006/picture">
-                <pic:pic xmlns:pic="http://schemas.openxmlformats.org/drawingml/2006/picture">
-                  <pic:nvPicPr>
-                    <pic:cNvPr id="0" name="" descr=""/>
-                    <pic:cNvPicPr>
-                      <a:picLocks noChangeAspect="1" noChangeArrowheads="1"/>
-                    </pic:cNvPicPr>
-                  </pic:nvPicPr>
-                  <pic:blipFill>
-                    <a:blip r:embed="rId9" cstate="none"/>
-                    <a:srcRect/>
-                    <a:stretch>
-                      <a:fillRect/>
-                    </a:stretch>
-                  </pic:blipFill>
-                  <pic:spPr bwMode="auto">
-                    <a:xfrm>
-                      <a:off x="0" y="0"/>
-                      <a:ext cx="5905500" cy="3333750"/>
-                    </a:xfrm>
-                    <a:prstGeom prst="rect">
-                      <a:avLst/>
-                    </a:prstGeom>
-                  </pic:spPr>
-                </pic:pic>
-              </a:graphicData>
-            </a:graphic>
-          </wp:inline>
-        </w:drawing>
-      </w:r>
-    </w:p>
-    <w:p>
-      <w:pPr>
-        <w:spacing w:after="80"/>
-      </w:pPr>
-    </w:p>
-    <w:p>
-      <w:pPr>
-        <w:spacing w:after="120" w:line="276"/>
-      </w:pPr>
-      <w:r>
-        <w:rPr>
-          <w:rFonts w:ascii="Arial" w:cs="Arial" w:eastAsia="Arial" w:hAnsi="Arial"/>
-          <w:sz w:val="22"/>
-          <w:szCs w:val="22"/>
-        </w:rPr>
-        <w:t xml:space="preserve">View quotations that have been approved and finalised. These are the official price offers sent to customers.</w:t>
-      </w:r>
-    </w:p>
-    <w:p>
-      <w:pPr>
-        <w:pStyle w:val="Heading3"/>
-        <w:spacing w:after="80" w:before="220"/>
-      </w:pPr>
-      <w:r>
-        <w:rPr>
-          <w:rFonts w:ascii="Arial" w:cs="Arial" w:eastAsia="Arial" w:hAnsi="Arial"/>
-          <w:b/>
-          <w:bCs/>
-          <w:color w:val="374151"/>
-          <w:sz w:val="24"/>
-          <w:szCs w:val="24"/>
-        </w:rPr>
-        <w:t xml:space="preserve">My Payslips</w:t>
-      </w:r>
-    </w:p>
-    <w:p>
-      <w:pPr>
-        <w:spacing w:after="160" w:before="80"/>
-      </w:pPr>
-      <w:r>
-        <w:drawing>
-          <wp:inline distT="0" distB="0" distL="0" distR="0">
-            <wp:extent cx="5905500" cy="3333750"/>
-            <wp:effectExtent t="0" r="0" b="0" l="0"/>
-            <wp:docPr id="1" name="20-employee-payslips" descr="20-employee-payslips" title="20-employee-payslips"/>
-            <wp:cNvGraphicFramePr>
-              <a:graphicFrameLocks xmlns:a="http://schemas.openxmlformats.org/drawingml/2006/main" noChangeAspect="1"/>
-            </wp:cNvGraphicFramePr>
-            <a:graphic xmlns:a="http://schemas.openxmlformats.org/drawingml/2006/main">
-              <a:graphicData uri="http://schemas.openxmlformats.org/drawingml/2006/picture">
-                <pic:pic xmlns:pic="http://schemas.openxmlformats.org/drawingml/2006/picture">
-                  <pic:nvPicPr>
-                    <pic:cNvPr id="0" name="" descr=""/>
-                    <pic:cNvPicPr>
-                      <a:picLocks noChangeAspect="1" noChangeArrowheads="1"/>
-                    </pic:cNvPicPr>
-                  </pic:nvPicPr>
-                  <pic:blipFill>
-                    <a:blip r:embed="rId9" cstate="none"/>
-                    <a:srcRect/>
-                    <a:stretch>
-                      <a:fillRect/>
-                    </a:stretch>
-                  </pic:blipFill>
-                  <pic:spPr bwMode="auto">
-                    <a:xfrm>
-                      <a:off x="0" y="0"/>
-                      <a:ext cx="5905500" cy="3333750"/>
-                    </a:xfrm>
-                    <a:prstGeom prst="rect">
-                      <a:avLst/>
-                    </a:prstGeom>
-                  </pic:spPr>
-                </pic:pic>
-              </a:graphicData>
-            </a:graphic>
-          </wp:inline>
-        </w:drawing>
-      </w:r>
-    </w:p>
-    <w:p>
-      <w:pPr>
-        <w:spacing w:after="80"/>
-      </w:pPr>
-    </w:p>
-    <w:p>
-      <w:pPr>
-        <w:spacing w:after="120" w:line="276"/>
-      </w:pPr>
-      <w:r>
-        <w:rPr>
-          <w:rFonts w:ascii="Arial" w:cs="Arial" w:eastAsia="Arial" w:hAnsi="Arial"/>
-          <w:sz w:val="22"/>
-          <w:szCs w:val="22"/>
-        </w:rPr>
-        <w:t xml:space="preserve">View your monthly salary slips. Each slip shows your basic salary, any deductions (like leave without pay), and the final amount paid.</w:t>
-      </w:r>
-    </w:p>
-    <w:p>
-      <w:pPr>
-        <w:pBdr>
-          <w:bottom w:val="single" w:color="E5E7EB" w:sz="4"/>
-        </w:pBdr>
-        <w:spacing w:after="160" w:before="160"/>
-      </w:pPr>
-    </w:p>
-    <w:p>
-      <w:pPr>
-        <w:pStyle w:val="Heading1"/>
-        <w:spacing w:after="160" w:before="400"/>
-      </w:pPr>
-      <w:r>
-        <w:rPr>
-          <w:rFonts w:ascii="Arial" w:cs="Arial" w:eastAsia="Arial" w:hAnsi="Arial"/>
-          <w:b/>
-          <w:bCs/>
-          <w:color w:val="1a1f2e"/>
-          <w:sz w:val="32"/>
-          <w:szCs w:val="32"/>
-        </w:rPr>
-        <w:t xml:space="preserve">4. Manager — What You Can Do</w:t>
-      </w:r>
-    </w:p>
-    <w:p>
-      <w:pPr>
-        <w:spacing w:after="120" w:line="276"/>
-      </w:pPr>
-      <w:r>
-        <w:rPr>
-          <w:rFonts w:ascii="Arial" w:cs="Arial" w:eastAsia="Arial" w:hAnsi="Arial"/>
-          <w:sz w:val="22"/>
-          <w:szCs w:val="22"/>
-        </w:rPr>
-        <w:t xml:space="preserve">Use SE_5001, SE_5002, or SE_5003 with password Soumya@2024</w:t>
-      </w:r>
-    </w:p>
-    <w:p>
-      <w:pPr>
-        <w:spacing w:after="120" w:line="276"/>
-      </w:pPr>
-      <w:r>
-        <w:rPr>
-          <w:rFonts w:ascii="Arial" w:cs="Arial" w:eastAsia="Arial" w:hAnsi="Arial"/>
-          <w:sz w:val="22"/>
-          <w:szCs w:val="22"/>
-        </w:rPr>
-        <w:t xml:space="preserve">As a Manager, you have all the features of an Employee plus the ability to approve or reject your team's requests.</w:t>
-      </w:r>
-    </w:p>
-    <w:p>
-      <w:pPr>
-        <w:spacing w:after="80"/>
-      </w:pPr>
-    </w:p>
-    <w:p>
-      <w:pPr>
-        <w:pStyle w:val="Heading3"/>
-        <w:spacing w:after="80" w:before="220"/>
-      </w:pPr>
-      <w:r>
-        <w:rPr>
-          <w:rFonts w:ascii="Arial" w:cs="Arial" w:eastAsia="Arial" w:hAnsi="Arial"/>
-          <w:b/>
-          <w:bCs/>
-          <w:color w:val="374151"/>
-          <w:sz w:val="24"/>
-          <w:szCs w:val="24"/>
-        </w:rPr>
-        <w:t xml:space="preserve">Timecard Approvals</w:t>
-      </w:r>
-    </w:p>
-    <w:p>
-      <w:pPr>
-        <w:spacing w:after="160" w:before="80"/>
-      </w:pPr>
-      <w:r>
-        <w:drawing>
-          <wp:inline distT="0" distB="0" distL="0" distR="0">
-            <wp:extent cx="5905500" cy="3333750"/>
-            <wp:effectExtent t="0" r="0" b="0" l="0"/>
-            <wp:docPr id="1" name="17-manager-timecard-approvals" descr="17-manager-timecard-approvals" title="17-manager-timecard-approvals"/>
-            <wp:cNvGraphicFramePr>
-              <a:graphicFrameLocks xmlns:a="http://schemas.openxmlformats.org/drawingml/2006/main" noChangeAspect="1"/>
-            </wp:cNvGraphicFramePr>
-            <a:graphic xmlns:a="http://schemas.openxmlformats.org/drawingml/2006/main">
-              <a:graphicData uri="http://schemas.openxmlformats.org/drawingml/2006/picture">
-                <pic:pic xmlns:pic="http://schemas.openxmlformats.org/drawingml/2006/picture">
-                  <pic:nvPicPr>
-                    <pic:cNvPr id="0" name="" descr=""/>
-                    <pic:cNvPicPr>
-                      <a:picLocks noChangeAspect="1" noChangeArrowheads="1"/>
-                    </pic:cNvPicPr>
-                  </pic:nvPicPr>
-                  <pic:blipFill>
-                    <a:blip r:embed="rId9" cstate="none"/>
-                    <a:srcRect/>
-                    <a:stretch>
-                      <a:fillRect/>
-                    </a:stretch>
-                  </pic:blipFill>
-                  <pic:spPr bwMode="auto">
-                    <a:xfrm>
-                      <a:off x="0" y="0"/>
-                      <a:ext cx="5905500" cy="3333750"/>
-                    </a:xfrm>
-                    <a:prstGeom prst="rect">
-                      <a:avLst/>
-                    </a:prstGeom>
-                  </pic:spPr>
-                </pic:pic>
-              </a:graphicData>
-            </a:graphic>
-          </wp:inline>
-        </w:drawing>
-      </w:r>
-    </w:p>
-    <w:p>
-      <w:pPr>
-        <w:spacing w:after="80"/>
-      </w:pPr>
-    </w:p>
-    <w:p>
-      <w:pPr>
-        <w:spacing w:after="120" w:line="276"/>
-      </w:pPr>
-      <w:r>
-        <w:rPr>
-          <w:rFonts w:ascii="Arial" w:cs="Arial" w:eastAsia="Arial" w:hAnsi="Arial"/>
-          <w:sz w:val="22"/>
-          <w:szCs w:val="22"/>
-        </w:rPr>
-        <w:t xml:space="preserve">Review and approve daily attendance submitted by your team members.</w:t>
-      </w:r>
-    </w:p>
-    <w:p>
-      <w:pPr>
-        <w:pStyle w:val="ListParagraph"/>
-        <w:numPr>
-          <w:ilvl w:val="0"/>
-          <w:numId w:val="3"/>
-        </w:numPr>
-        <w:spacing w:after="80"/>
-      </w:pPr>
-      <w:r>
-        <w:rPr>
-          <w:rFonts w:ascii="Arial" w:cs="Arial" w:eastAsia="Arial" w:hAnsi="Arial"/>
-          <w:sz w:val="22"/>
-          <w:szCs w:val="22"/>
-        </w:rPr>
-        <w:t xml:space="preserve">You will see a list of pending timecards from your team</w:t>
-      </w:r>
-    </w:p>
-    <w:p>
-      <w:pPr>
-        <w:pStyle w:val="ListParagraph"/>
-        <w:numPr>
-          <w:ilvl w:val="0"/>
-          <w:numId w:val="3"/>
-        </w:numPr>
-        <w:spacing w:after="80"/>
-      </w:pPr>
-      <w:r>
-        <w:rPr>
-          <w:rFonts w:ascii="Arial" w:cs="Arial" w:eastAsia="Arial" w:hAnsi="Arial"/>
-          <w:sz w:val="22"/>
-          <w:szCs w:val="22"/>
-        </w:rPr>
-        <w:t xml:space="preserve">Click Approve to accept a timecard, or Reject to send it back</w:t>
-      </w:r>
-    </w:p>
-    <w:p>
-      <w:pPr>
-        <w:pStyle w:val="ListParagraph"/>
-        <w:numPr>
-          <w:ilvl w:val="0"/>
-          <w:numId w:val="3"/>
-        </w:numPr>
-        <w:spacing w:after="80"/>
-      </w:pPr>
-      <w:r>
-        <w:rPr>
-          <w:rFonts w:ascii="Arial" w:cs="Arial" w:eastAsia="Arial" w:hAnsi="Arial"/>
-          <w:sz w:val="22"/>
-          <w:szCs w:val="22"/>
-        </w:rPr>
-        <w:t xml:space="preserve">Once approved, the timecard is locked and cannot be edited by the employee</w:t>
-      </w:r>
-    </w:p>
-    <w:p>
-      <w:pPr>
-        <w:pStyle w:val="Heading3"/>
-        <w:spacing w:after="80" w:before="220"/>
-      </w:pPr>
-      <w:r>
-        <w:rPr>
-          <w:rFonts w:ascii="Arial" w:cs="Arial" w:eastAsia="Arial" w:hAnsi="Arial"/>
-          <w:b/>
-          <w:bCs/>
-          <w:color w:val="374151"/>
-          <w:sz w:val="24"/>
-          <w:szCs w:val="24"/>
-        </w:rPr>
-        <w:t xml:space="preserve">Leave Approvals</w:t>
-      </w:r>
-    </w:p>
-    <w:p>
-      <w:pPr>
-        <w:spacing w:after="160" w:before="80"/>
-      </w:pPr>
-      <w:r>
-        <w:drawing>
-          <wp:inline distT="0" distB="0" distL="0" distR="0">
-            <wp:extent cx="5905500" cy="3333750"/>
-            <wp:effectExtent t="0" r="0" b="0" l="0"/>
-            <wp:docPr id="1" name="18-manager-leave-approvals" descr="18-manager-leave-approvals" title="18-manager-leave-approvals"/>
-            <wp:cNvGraphicFramePr>
-              <a:graphicFrameLocks xmlns:a="http://schemas.openxmlformats.org/drawingml/2006/main" noChangeAspect="1"/>
-            </wp:cNvGraphicFramePr>
-            <a:graphic xmlns:a="http://schemas.openxmlformats.org/drawingml/2006/main">
-              <a:graphicData uri="http://schemas.openxmlformats.org/drawingml/2006/picture">
-                <pic:pic xmlns:pic="http://schemas.openxmlformats.org/drawingml/2006/picture">
-                  <pic:nvPicPr>
-                    <pic:cNvPr id="0" name="" descr=""/>
-                    <pic:cNvPicPr>
-                      <a:picLocks noChangeAspect="1" noChangeArrowheads="1"/>
-                    </pic:cNvPicPr>
-                  </pic:nvPicPr>
-                  <pic:blipFill>
-                    <a:blip r:embed="rId9" cstate="none"/>
-                    <a:srcRect/>
-                    <a:stretch>
-                      <a:fillRect/>
-                    </a:stretch>
-                  </pic:blipFill>
-                  <pic:spPr bwMode="auto">
-                    <a:xfrm>
-                      <a:off x="0" y="0"/>
-                      <a:ext cx="5905500" cy="3333750"/>
-                    </a:xfrm>
-                    <a:prstGeom prst="rect">
-                      <a:avLst/>
-                    </a:prstGeom>
-                  </pic:spPr>
-                </pic:pic>
-              </a:graphicData>
-            </a:graphic>
-          </wp:inline>
-        </w:drawing>
-      </w:r>
-    </w:p>
-    <w:p>
-      <w:pPr>
-        <w:spacing w:after="80"/>
-      </w:pPr>
-    </w:p>
-    <w:p>
-      <w:pPr>
-        <w:spacing w:after="120" w:line="276"/>
-      </w:pPr>
-      <w:r>
-        <w:rPr>
-          <w:rFonts w:ascii="Arial" w:cs="Arial" w:eastAsia="Arial" w:hAnsi="Arial"/>
-          <w:sz w:val="22"/>
-          <w:szCs w:val="22"/>
-        </w:rPr>
-        <w:t xml:space="preserve">Review and approve leave requests from your team.</w:t>
-      </w:r>
-    </w:p>
-    <w:p>
-      <w:pPr>
-        <w:pStyle w:val="ListParagraph"/>
-        <w:numPr>
-          <w:ilvl w:val="0"/>
-          <w:numId w:val="3"/>
-        </w:numPr>
-        <w:spacing w:after="80"/>
-      </w:pPr>
-      <w:r>
-        <w:rPr>
-          <w:rFonts w:ascii="Arial" w:cs="Arial" w:eastAsia="Arial" w:hAnsi="Arial"/>
-          <w:sz w:val="22"/>
-          <w:szCs w:val="22"/>
-        </w:rPr>
-        <w:t xml:space="preserve">Click Approve to grant the leave, or Reject to decline it</w:t>
-      </w:r>
-    </w:p>
-    <w:p>
-      <w:pPr>
-        <w:pStyle w:val="ListParagraph"/>
-        <w:numPr>
-          <w:ilvl w:val="0"/>
-          <w:numId w:val="3"/>
-        </w:numPr>
-        <w:spacing w:after="80"/>
-      </w:pPr>
-      <w:r>
-        <w:rPr>
-          <w:rFonts w:ascii="Arial" w:cs="Arial" w:eastAsia="Arial" w:hAnsi="Arial"/>
-          <w:sz w:val="22"/>
-          <w:szCs w:val="22"/>
-        </w:rPr>
-        <w:t xml:space="preserve">If you reject a leave, the employee's leave balance is automatically restored</w:t>
-      </w:r>
-    </w:p>
-    <w:p>
-      <w:pPr>
-        <w:pStyle w:val="Heading3"/>
-        <w:spacing w:after="80" w:before="220"/>
-      </w:pPr>
-      <w:r>
-        <w:rPr>
-          <w:rFonts w:ascii="Arial" w:cs="Arial" w:eastAsia="Arial" w:hAnsi="Arial"/>
-          <w:b/>
-          <w:bCs/>
-          <w:color w:val="374151"/>
-          <w:sz w:val="24"/>
-          <w:szCs w:val="24"/>
-        </w:rPr>
-        <w:t xml:space="preserve">Payroll</w:t>
-      </w:r>
-    </w:p>
-    <w:p>
-      <w:pPr>
-        <w:spacing w:after="160" w:before="80"/>
-      </w:pPr>
-      <w:r>
-        <w:drawing>
-          <wp:inline distT="0" distB="0" distL="0" distR="0">
-            <wp:extent cx="5905500" cy="3333750"/>
-            <wp:effectExtent t="0" r="0" b="0" l="0"/>
-            <wp:docPr id="1" name="08-payroll" descr="08-payroll" title="08-payroll"/>
-            <wp:cNvGraphicFramePr>
-              <a:graphicFrameLocks xmlns:a="http://schemas.openxmlformats.org/drawingml/2006/main" noChangeAspect="1"/>
-            </wp:cNvGraphicFramePr>
-            <a:graphic xmlns:a="http://schemas.openxmlformats.org/drawingml/2006/main">
-              <a:graphicData uri="http://schemas.openxmlformats.org/drawingml/2006/picture">
-                <pic:pic xmlns:pic="http://schemas.openxmlformats.org/drawingml/2006/picture">
-                  <pic:nvPicPr>
-                    <pic:cNvPr id="0" name="" descr=""/>
-                    <pic:cNvPicPr>
-                      <a:picLocks noChangeAspect="1" noChangeArrowheads="1"/>
-                    </pic:cNvPicPr>
-                  </pic:nvPicPr>
-                  <pic:blipFill>
-                    <a:blip r:embed="rId9" cstate="none"/>
-                    <a:srcRect/>
-                    <a:stretch>
-                      <a:fillRect/>
-                    </a:stretch>
-                  </pic:blipFill>
-                  <pic:spPr bwMode="auto">
-                    <a:xfrm>
-                      <a:off x="0" y="0"/>
-                      <a:ext cx="5905500" cy="3333750"/>
-                    </a:xfrm>
-                    <a:prstGeom prst="rect">
-                      <a:avLst/>
-                    </a:prstGeom>
-                  </pic:spPr>
-                </pic:pic>
-              </a:graphicData>
-            </a:graphic>
-          </wp:inline>
-        </w:drawing>
-      </w:r>
-    </w:p>
-    <w:p>
-      <w:pPr>
-        <w:spacing w:after="80"/>
-      </w:pPr>
-    </w:p>
-    <w:p>
-      <w:pPr>
-        <w:spacing w:after="120" w:line="276"/>
-      </w:pPr>
-      <w:r>
-        <w:rPr>
-          <w:rFonts w:ascii="Arial" w:cs="Arial" w:eastAsia="Arial" w:hAnsi="Arial"/>
-          <w:sz w:val="22"/>
-          <w:szCs w:val="22"/>
-        </w:rPr>
-        <w:t xml:space="preserve">View and generate monthly salary slips for your team members.</w:t>
-      </w:r>
-    </w:p>
-    <w:p>
-      <w:pPr>
-        <w:pStyle w:val="ListParagraph"/>
-        <w:numPr>
-          <w:ilvl w:val="0"/>
-          <w:numId w:val="3"/>
-        </w:numPr>
-        <w:spacing w:after="80"/>
-      </w:pPr>
-      <w:r>
-        <w:rPr>
-          <w:rFonts w:ascii="Arial" w:cs="Arial" w:eastAsia="Arial" w:hAnsi="Arial"/>
-          <w:sz w:val="22"/>
-          <w:szCs w:val="22"/>
-        </w:rPr>
-        <w:t xml:space="preserve">Select the month and click Generate to create payslips</w:t>
-      </w:r>
-    </w:p>
-    <w:p>
-      <w:pPr>
-        <w:pStyle w:val="ListParagraph"/>
-        <w:numPr>
-          <w:ilvl w:val="0"/>
-          <w:numId w:val="3"/>
-        </w:numPr>
-        <w:spacing w:after="80"/>
-      </w:pPr>
-      <w:r>
-        <w:rPr>
-          <w:rFonts w:ascii="Arial" w:cs="Arial" w:eastAsia="Arial" w:hAnsi="Arial"/>
-          <w:sz w:val="22"/>
-          <w:szCs w:val="22"/>
-        </w:rPr>
-        <w:t xml:space="preserve">Each payslip is based on the number of approved attendance days</w:t>
-      </w:r>
-    </w:p>
-    <w:p>
-      <w:pPr>
-        <w:pBdr>
-          <w:bottom w:val="single" w:color="E5E7EB" w:sz="4"/>
-        </w:pBdr>
-        <w:spacing w:after="160" w:before="160"/>
-      </w:pPr>
-    </w:p>
-    <w:p>
-      <w:pPr>
-        <w:pStyle w:val="Heading1"/>
-        <w:spacing w:after="160" w:before="400"/>
-      </w:pPr>
-      <w:r>
-        <w:rPr>
-          <w:rFonts w:ascii="Arial" w:cs="Arial" w:eastAsia="Arial" w:hAnsi="Arial"/>
-          <w:b/>
-          <w:bCs/>
-          <w:color w:val="1a1f2e"/>
-          <w:sz w:val="32"/>
-          <w:szCs w:val="32"/>
-        </w:rPr>
-        <w:t xml:space="preserve">5. Owner — What You Can Do</w:t>
-      </w:r>
-    </w:p>
-    <w:p>
-      <w:pPr>
-        <w:spacing w:after="120" w:line="276"/>
-      </w:pPr>
-      <w:r>
-        <w:rPr>
-          <w:rFonts w:ascii="Arial" w:cs="Arial" w:eastAsia="Arial" w:hAnsi="Arial"/>
-          <w:sz w:val="22"/>
-          <w:szCs w:val="22"/>
-        </w:rPr>
-        <w:t xml:space="preserve">Use SE_5000 with password 87654321</w:t>
-      </w:r>
-    </w:p>
-    <w:p>
-      <w:pPr>
-        <w:spacing w:after="120" w:line="276"/>
-      </w:pPr>
-      <w:r>
-        <w:rPr>
-          <w:rFonts w:ascii="Arial" w:cs="Arial" w:eastAsia="Arial" w:hAnsi="Arial"/>
-          <w:sz w:val="22"/>
-          <w:szCs w:val="22"/>
-        </w:rPr>
-        <w:t xml:space="preserve">As the Owner, you have full access to all features across the entire organisation.</w:t>
-      </w:r>
-    </w:p>
-    <w:p>
-      <w:pPr>
-        <w:spacing w:after="80"/>
-      </w:pPr>
-    </w:p>
-    <w:p>
-      <w:pPr>
-        <w:pStyle w:val="Heading3"/>
-        <w:spacing w:after="80" w:before="220"/>
-      </w:pPr>
-      <w:r>
-        <w:rPr>
-          <w:rFonts w:ascii="Arial" w:cs="Arial" w:eastAsia="Arial" w:hAnsi="Arial"/>
-          <w:b/>
-          <w:bCs/>
-          <w:color w:val="374151"/>
-          <w:sz w:val="24"/>
-          <w:szCs w:val="24"/>
-        </w:rPr>
-        <w:t xml:space="preserve">Dashboard</w:t>
-      </w:r>
-    </w:p>
-    <w:p>
-      <w:pPr>
-        <w:spacing w:after="160" w:before="80"/>
-      </w:pPr>
-      <w:r>
-        <w:drawing>
-          <wp:inline distT="0" distB="0" distL="0" distR="0">
-            <wp:extent cx="5905500" cy="3333750"/>
-            <wp:effectExtent t="0" r="0" b="0" l="0"/>
-            <wp:docPr id="1" name="02-owner-dashboard" descr="02-owner-dashboard" title="02-owner-dashboard"/>
-            <wp:cNvGraphicFramePr>
-              <a:graphicFrameLocks xmlns:a="http://schemas.openxmlformats.org/drawingml/2006/main" noChangeAspect="1"/>
-            </wp:cNvGraphicFramePr>
-            <a:graphic xmlns:a="http://schemas.openxmlformats.org/drawingml/2006/main">
-              <a:graphicData uri="http://schemas.openxmlformats.org/drawingml/2006/picture">
-                <pic:pic xmlns:pic="http://schemas.openxmlformats.org/drawingml/2006/picture">
-                  <pic:nvPicPr>
-                    <pic:cNvPr id="0" name="" descr=""/>
-                    <pic:cNvPicPr>
-                      <a:picLocks noChangeAspect="1" noChangeArrowheads="1"/>
-                    </pic:cNvPicPr>
-                  </pic:nvPicPr>
-                  <pic:blipFill>
                     <a:blip r:embed="rId10" cstate="none"/>
                     <a:srcRect/>
                     <a:stretch>
@@ -4197,7 +2639,7 @@
           <w:sz w:val="22"/>
           <w:szCs w:val="22"/>
         </w:rPr>
-        <w:t xml:space="preserve">Shows company-wide pending approvals — how many manager timecards and leaves are waiting for your review. Click any tile to go directly to the approvals page.</w:t>
+        <w:t xml:space="preserve">Your home screen. Shows how many timecards you have logged this month, how many leave days you have used, and your remaining leave balance. Use this to get a quick overview of your activity.</w:t>
       </w:r>
     </w:p>
     <w:p>
@@ -4214,7 +2656,7 @@
           <w:sz w:val="24"/>
           <w:szCs w:val="24"/>
         </w:rPr>
-        <w:t xml:space="preserve">Products</w:t>
+        <w:t xml:space="preserve">My Timecard</w:t>
       </w:r>
     </w:p>
     <w:p>
@@ -4226,7 +2668,7 @@
           <wp:inline distT="0" distB="0" distL="0" distR="0">
             <wp:extent cx="5905500" cy="3333750"/>
             <wp:effectExtent t="0" r="0" b="0" l="0"/>
-            <wp:docPr id="1" name="03-owner-products" descr="03-owner-products" title="03-owner-products"/>
+            <wp:docPr id="1" name="14-my-timecard" descr="14-my-timecard" title="14-my-timecard"/>
             <wp:cNvGraphicFramePr>
               <a:graphicFrameLocks xmlns:a="http://schemas.openxmlformats.org/drawingml/2006/main" noChangeAspect="1"/>
             </wp:cNvGraphicFramePr>
@@ -4240,7 +2682,7 @@
                     </pic:cNvPicPr>
                   </pic:nvPicPr>
                   <pic:blipFill>
-                    <a:blip r:embed="rId9" cstate="none"/>
+                    <a:blip r:embed="rId11" cstate="none"/>
                     <a:srcRect/>
                     <a:stretch>
                       <a:fillRect/>
@@ -4277,7 +2719,7 @@
           <w:sz w:val="22"/>
           <w:szCs w:val="22"/>
         </w:rPr>
-        <w:t xml:space="preserve">Manage the company's product catalogue.</w:t>
+        <w:t xml:space="preserve">This is where you record your daily attendance.</w:t>
       </w:r>
     </w:p>
     <w:p>
@@ -4295,7 +2737,7 @@
           <w:sz w:val="22"/>
           <w:szCs w:val="22"/>
         </w:rPr>
-        <w:t xml:space="preserve">Click "+ Add Product" to add a new product with its name, description, category, and pricing</w:t>
+        <w:t xml:space="preserve">Click "+ Add Timecard" to log attendance for a single day</w:t>
       </w:r>
     </w:p>
     <w:p>
@@ -4313,7 +2755,7 @@
           <w:sz w:val="22"/>
           <w:szCs w:val="22"/>
         </w:rPr>
-        <w:t xml:space="preserve">Edit existing products to update prices or mark them as inactive</w:t>
+        <w:t xml:space="preserve">Select the date, write a short note about your work for the day, and click Save</w:t>
       </w:r>
     </w:p>
     <w:p>
@@ -4331,7 +2773,25 @@
           <w:sz w:val="22"/>
           <w:szCs w:val="22"/>
         </w:rPr>
-        <w:t xml:space="preserve">Inactive products will not appear when creating quotations</w:t>
+        <w:t xml:space="preserve">Use "Bulk Add Timecard" to log attendance for a range of dates at once — the system will automatically skip Sundays and public holidays</w:t>
+      </w:r>
+    </w:p>
+    <w:p>
+      <w:pPr>
+        <w:pStyle w:val="ListParagraph"/>
+        <w:numPr>
+          <w:ilvl w:val="0"/>
+          <w:numId w:val="3"/>
+        </w:numPr>
+        <w:spacing w:after="80"/>
+      </w:pPr>
+      <w:r>
+        <w:rPr>
+          <w:rFonts w:ascii="Arial" w:cs="Arial" w:eastAsia="Arial" w:hAnsi="Arial"/>
+          <w:sz w:val="22"/>
+          <w:szCs w:val="22"/>
+        </w:rPr>
+        <w:t xml:space="preserve">You can edit or delete a timecard as long as it has not been approved yet</w:t>
       </w:r>
     </w:p>
     <w:p>
@@ -4348,7 +2808,7 @@
           <w:sz w:val="24"/>
           <w:szCs w:val="24"/>
         </w:rPr>
-        <w:t xml:space="preserve">Inventory</w:t>
+        <w:t xml:space="preserve">Overtime</w:t>
       </w:r>
     </w:p>
     <w:p>
@@ -4360,7 +2820,7 @@
           <wp:inline distT="0" distB="0" distL="0" distR="0">
             <wp:extent cx="5905500" cy="3333750"/>
             <wp:effectExtent t="0" r="0" b="0" l="0"/>
-            <wp:docPr id="1" name="04-inventory" descr="04-inventory" title="04-inventory"/>
+            <wp:docPr id="1" name="14-my-timecard" descr="14-my-timecard" title="14-my-timecard"/>
             <wp:cNvGraphicFramePr>
               <a:graphicFrameLocks xmlns:a="http://schemas.openxmlformats.org/drawingml/2006/main" noChangeAspect="1"/>
             </wp:cNvGraphicFramePr>
@@ -4374,7 +2834,7 @@
                     </pic:cNvPicPr>
                   </pic:nvPicPr>
                   <pic:blipFill>
-                    <a:blip r:embed="rId9" cstate="none"/>
+                    <a:blip r:embed="rId11" cstate="none"/>
                     <a:srcRect/>
                     <a:stretch>
                       <a:fillRect/>
@@ -4411,7 +2871,7 @@
           <w:sz w:val="22"/>
           <w:szCs w:val="22"/>
         </w:rPr>
-        <w:t xml:space="preserve">View and update stock levels for all products.</w:t>
+        <w:t xml:space="preserve">Log extra hours you have worked beyond your regular shift.</w:t>
       </w:r>
     </w:p>
     <w:p>
@@ -4429,7 +2889,7 @@
           <w:sz w:val="22"/>
           <w:szCs w:val="22"/>
         </w:rPr>
-        <w:t xml:space="preserve">The table shows 8 upcoming weeks of stock forecast</w:t>
+        <w:t xml:space="preserve">Click "+ Add Overtime", pick the date, enter the number of hours, and save</w:t>
       </w:r>
     </w:p>
     <w:p>
@@ -4447,43 +2907,7 @@
           <w:sz w:val="22"/>
           <w:szCs w:val="22"/>
         </w:rPr>
-        <w:t xml:space="preserve">Enter quantities in the weekly cells to plan incoming stock</w:t>
-      </w:r>
-    </w:p>
-    <w:p>
-      <w:pPr>
-        <w:pStyle w:val="ListParagraph"/>
-        <w:numPr>
-          <w:ilvl w:val="0"/>
-          <w:numId w:val="3"/>
-        </w:numPr>
-        <w:spacing w:after="80"/>
-      </w:pPr>
-      <w:r>
-        <w:rPr>
-          <w:rFonts w:ascii="Arial" w:cs="Arial" w:eastAsia="Arial" w:hAnsi="Arial"/>
-          <w:sz w:val="22"/>
-          <w:szCs w:val="22"/>
-        </w:rPr>
-        <w:t xml:space="preserve">Click Save to update the forecast</w:t>
-      </w:r>
-    </w:p>
-    <w:p>
-      <w:pPr>
-        <w:pStyle w:val="ListParagraph"/>
-        <w:numPr>
-          <w:ilvl w:val="0"/>
-          <w:numId w:val="3"/>
-        </w:numPr>
-        <w:spacing w:after="80"/>
-      </w:pPr>
-      <w:r>
-        <w:rPr>
-          <w:rFonts w:ascii="Arial" w:cs="Arial" w:eastAsia="Arial" w:hAnsi="Arial"/>
-          <w:sz w:val="22"/>
-          <w:szCs w:val="22"/>
-        </w:rPr>
-        <w:t xml:space="preserve">Total Quantity, Available, Reserved, and Consumed columns update automatically</w:t>
+        <w:t xml:space="preserve">Your overtime payout is calculated automatically based on the company rate</w:t>
       </w:r>
     </w:p>
     <w:p>
@@ -4500,7 +2924,7 @@
           <w:sz w:val="24"/>
           <w:szCs w:val="24"/>
         </w:rPr>
-        <w:t xml:space="preserve">Users</w:t>
+        <w:t xml:space="preserve">My Leave</w:t>
       </w:r>
     </w:p>
     <w:p>
@@ -4512,7 +2936,7 @@
           <wp:inline distT="0" distB="0" distL="0" distR="0">
             <wp:extent cx="5905500" cy="3333750"/>
             <wp:effectExtent t="0" r="0" b="0" l="0"/>
-            <wp:docPr id="1" name="07-owner-users" descr="07-owner-users" title="07-owner-users"/>
+            <wp:docPr id="1" name="15-my-leave" descr="15-my-leave" title="15-my-leave"/>
             <wp:cNvGraphicFramePr>
               <a:graphicFrameLocks xmlns:a="http://schemas.openxmlformats.org/drawingml/2006/main" noChangeAspect="1"/>
             </wp:cNvGraphicFramePr>
@@ -4526,7 +2950,7 @@
                     </pic:cNvPicPr>
                   </pic:nvPicPr>
                   <pic:blipFill>
-                    <a:blip r:embed="rId9" cstate="none"/>
+                    <a:blip r:embed="rId12" cstate="none"/>
                     <a:srcRect/>
                     <a:stretch>
                       <a:fillRect/>
@@ -4563,7 +2987,7 @@
           <w:sz w:val="22"/>
           <w:szCs w:val="22"/>
         </w:rPr>
-        <w:t xml:space="preserve">Add and manage all employees and managers in the system.</w:t>
+        <w:t xml:space="preserve">Apply for planned leave (day off).</w:t>
       </w:r>
     </w:p>
     <w:p>
@@ -4581,7 +3005,7 @@
           <w:sz w:val="22"/>
           <w:szCs w:val="22"/>
         </w:rPr>
-        <w:t xml:space="preserve">Click "+ Add User" to create a new account — an Employee ID is generated automatically</w:t>
+        <w:t xml:space="preserve">Click "Apply Leave", pick the date and write a reason, then submit</w:t>
       </w:r>
     </w:p>
     <w:p>
@@ -4599,7 +3023,7 @@
           <w:sz w:val="22"/>
           <w:szCs w:val="22"/>
         </w:rPr>
-        <w:t xml:space="preserve">Edit a user to update their details, change their manager, or deactivate their account</w:t>
+        <w:t xml:space="preserve">Your leave balance shows how many days you have remaining</w:t>
       </w:r>
     </w:p>
     <w:p>
@@ -4617,7 +3041,25 @@
           <w:sz w:val="22"/>
           <w:szCs w:val="22"/>
         </w:rPr>
-        <w:t xml:space="preserve">Deactivated users cannot log in</w:t>
+        <w:t xml:space="preserve">You can apply for multiple days at once using the date range option</w:t>
+      </w:r>
+    </w:p>
+    <w:p>
+      <w:pPr>
+        <w:pStyle w:val="ListParagraph"/>
+        <w:numPr>
+          <w:ilvl w:val="0"/>
+          <w:numId w:val="3"/>
+        </w:numPr>
+        <w:spacing w:after="80"/>
+      </w:pPr>
+      <w:r>
+        <w:rPr>
+          <w:rFonts w:ascii="Arial" w:cs="Arial" w:eastAsia="Arial" w:hAnsi="Arial"/>
+          <w:sz w:val="22"/>
+          <w:szCs w:val="22"/>
+        </w:rPr>
+        <w:t xml:space="preserve">Once a leave is approved by your manager, it cannot be cancelled — contact your manager if needed</w:t>
       </w:r>
     </w:p>
     <w:p>
@@ -4634,7 +3076,7 @@
           <w:sz w:val="24"/>
           <w:szCs w:val="24"/>
         </w:rPr>
-        <w:t xml:space="preserve">Timecard Approvals</w:t>
+        <w:t xml:space="preserve">My Calendar</w:t>
       </w:r>
     </w:p>
     <w:p>
@@ -4646,7 +3088,7 @@
           <wp:inline distT="0" distB="0" distL="0" distR="0">
             <wp:extent cx="5905500" cy="3333750"/>
             <wp:effectExtent t="0" r="0" b="0" l="0"/>
-            <wp:docPr id="1" name="09-owner-timecard-approvals" descr="09-owner-timecard-approvals" title="09-owner-timecard-approvals"/>
+            <wp:docPr id="1" name="16-my-calendar" descr="16-my-calendar" title="16-my-calendar"/>
             <wp:cNvGraphicFramePr>
               <a:graphicFrameLocks xmlns:a="http://schemas.openxmlformats.org/drawingml/2006/main" noChangeAspect="1"/>
             </wp:cNvGraphicFramePr>
@@ -4660,7 +3102,7 @@
                     </pic:cNvPicPr>
                   </pic:nvPicPr>
                   <pic:blipFill>
-                    <a:blip r:embed="rId9" cstate="none"/>
+                    <a:blip r:embed="rId13" cstate="none"/>
                     <a:srcRect/>
                     <a:stretch>
                       <a:fillRect/>
@@ -4697,7 +3139,97 @@
           <w:sz w:val="22"/>
           <w:szCs w:val="22"/>
         </w:rPr>
-        <w:t xml:space="preserve">Approve or reject timecards submitted by your managers (not employees — managers handle their own teams).</w:t>
+        <w:t xml:space="preserve">A monthly calendar view of your attendance.</w:t>
+      </w:r>
+    </w:p>
+    <w:p>
+      <w:pPr>
+        <w:pStyle w:val="ListParagraph"/>
+        <w:numPr>
+          <w:ilvl w:val="0"/>
+          <w:numId w:val="3"/>
+        </w:numPr>
+        <w:spacing w:after="80"/>
+      </w:pPr>
+      <w:r>
+        <w:rPr>
+          <w:rFonts w:ascii="Arial" w:cs="Arial" w:eastAsia="Arial" w:hAnsi="Arial"/>
+          <w:sz w:val="22"/>
+          <w:szCs w:val="22"/>
+        </w:rPr>
+        <w:t xml:space="preserve">Green days = attendance approved</w:t>
+      </w:r>
+    </w:p>
+    <w:p>
+      <w:pPr>
+        <w:pStyle w:val="ListParagraph"/>
+        <w:numPr>
+          <w:ilvl w:val="0"/>
+          <w:numId w:val="3"/>
+        </w:numPr>
+        <w:spacing w:after="80"/>
+      </w:pPr>
+      <w:r>
+        <w:rPr>
+          <w:rFonts w:ascii="Arial" w:cs="Arial" w:eastAsia="Arial" w:hAnsi="Arial"/>
+          <w:sz w:val="22"/>
+          <w:szCs w:val="22"/>
+        </w:rPr>
+        <w:t xml:space="preserve">Yellow days = attendance submitted, waiting for approval</w:t>
+      </w:r>
+    </w:p>
+    <w:p>
+      <w:pPr>
+        <w:pStyle w:val="ListParagraph"/>
+        <w:numPr>
+          <w:ilvl w:val="0"/>
+          <w:numId w:val="3"/>
+        </w:numPr>
+        <w:spacing w:after="80"/>
+      </w:pPr>
+      <w:r>
+        <w:rPr>
+          <w:rFonts w:ascii="Arial" w:cs="Arial" w:eastAsia="Arial" w:hAnsi="Arial"/>
+          <w:sz w:val="22"/>
+          <w:szCs w:val="22"/>
+        </w:rPr>
+        <w:t xml:space="preserve">Blue days = leave</w:t>
+      </w:r>
+    </w:p>
+    <w:p>
+      <w:pPr>
+        <w:pStyle w:val="ListParagraph"/>
+        <w:numPr>
+          <w:ilvl w:val="0"/>
+          <w:numId w:val="3"/>
+        </w:numPr>
+        <w:spacing w:after="80"/>
+      </w:pPr>
+      <w:r>
+        <w:rPr>
+          <w:rFonts w:ascii="Arial" w:cs="Arial" w:eastAsia="Arial" w:hAnsi="Arial"/>
+          <w:sz w:val="22"/>
+          <w:szCs w:val="22"/>
+        </w:rPr>
+        <w:t xml:space="preserve">Grey days = public holiday</w:t>
+      </w:r>
+    </w:p>
+    <w:p>
+      <w:pPr>
+        <w:pStyle w:val="ListParagraph"/>
+        <w:numPr>
+          <w:ilvl w:val="0"/>
+          <w:numId w:val="3"/>
+        </w:numPr>
+        <w:spacing w:after="80"/>
+      </w:pPr>
+      <w:r>
+        <w:rPr>
+          <w:rFonts w:ascii="Arial" w:cs="Arial" w:eastAsia="Arial" w:hAnsi="Arial"/>
+          <w:sz w:val="22"/>
+          <w:szCs w:val="22"/>
+        </w:rPr>
+        <w:t xml:space="preserve">Navigate between months using the arrows at the top</w:t>
       </w:r>
     </w:p>
     <w:p>
@@ -4714,7 +3246,7 @@
           <w:sz w:val="24"/>
           <w:szCs w:val="24"/>
         </w:rPr>
-        <w:t xml:space="preserve">Leave Approvals</w:t>
+        <w:t xml:space="preserve">Inventory</w:t>
       </w:r>
     </w:p>
     <w:p>
@@ -4726,7 +3258,7 @@
           <wp:inline distT="0" distB="0" distL="0" distR="0">
             <wp:extent cx="5905500" cy="3333750"/>
             <wp:effectExtent t="0" r="0" b="0" l="0"/>
-            <wp:docPr id="1" name="10-owner-leave-approvals" descr="10-owner-leave-approvals" title="10-owner-leave-approvals"/>
+            <wp:docPr id="1" name="04-inventory" descr="04-inventory" title="04-inventory"/>
             <wp:cNvGraphicFramePr>
               <a:graphicFrameLocks xmlns:a="http://schemas.openxmlformats.org/drawingml/2006/main" noChangeAspect="1"/>
             </wp:cNvGraphicFramePr>
@@ -4740,7 +3272,7 @@
                     </pic:cNvPicPr>
                   </pic:nvPicPr>
                   <pic:blipFill>
-                    <a:blip r:embed="rId9" cstate="none"/>
+                    <a:blip r:embed="rId14" cstate="none"/>
                     <a:srcRect/>
                     <a:stretch>
                       <a:fillRect/>
@@ -4777,7 +3309,7 @@
           <w:sz w:val="22"/>
           <w:szCs w:val="22"/>
         </w:rPr>
-        <w:t xml:space="preserve">Approve or reject leave requests submitted by your managers.</w:t>
+        <w:t xml:space="preserve">View the current stock levels of all products. You can see how many units are available, reserved, and consumed. This is a read-only view — you cannot make changes here.</w:t>
       </w:r>
     </w:p>
     <w:p>
@@ -4794,7 +3326,7 @@
           <w:sz w:val="24"/>
           <w:szCs w:val="24"/>
         </w:rPr>
-        <w:t xml:space="preserve">Team Calendar</w:t>
+        <w:t xml:space="preserve">Quotations</w:t>
       </w:r>
     </w:p>
     <w:p>
@@ -4806,7 +3338,7 @@
           <wp:inline distT="0" distB="0" distL="0" distR="0">
             <wp:extent cx="5905500" cy="3333750"/>
             <wp:effectExtent t="0" r="0" b="0" l="0"/>
-            <wp:docPr id="1" name="11-owner-team-calendar" descr="11-owner-team-calendar" title="11-owner-team-calendar"/>
+            <wp:docPr id="1" name="05-quotations" descr="05-quotations" title="05-quotations"/>
             <wp:cNvGraphicFramePr>
               <a:graphicFrameLocks xmlns:a="http://schemas.openxmlformats.org/drawingml/2006/main" noChangeAspect="1"/>
             </wp:cNvGraphicFramePr>
@@ -4820,7 +3352,7 @@
                     </pic:cNvPicPr>
                   </pic:nvPicPr>
                   <pic:blipFill>
-                    <a:blip r:embed="rId9" cstate="none"/>
+                    <a:blip r:embed="rId15" cstate="none"/>
                     <a:srcRect/>
                     <a:stretch>
                       <a:fillRect/>
@@ -4857,7 +3389,7 @@
           <w:sz w:val="22"/>
           <w:szCs w:val="22"/>
         </w:rPr>
-        <w:t xml:space="preserve">View the monthly attendance calendar for any employee or manager.</w:t>
+        <w:t xml:space="preserve">Create a price quotation to send to a customer.</w:t>
       </w:r>
     </w:p>
     <w:p>
@@ -4875,7 +3407,7 @@
           <w:sz w:val="22"/>
           <w:szCs w:val="22"/>
         </w:rPr>
-        <w:t xml:space="preserve">Select a person from the dropdown at the top</w:t>
+        <w:t xml:space="preserve">Click "New Quotation" to start</w:t>
       </w:r>
     </w:p>
     <w:p>
@@ -4893,7 +3425,7 @@
           <w:sz w:val="22"/>
           <w:szCs w:val="22"/>
         </w:rPr>
-        <w:t xml:space="preserve">Navigate months using the arrows</w:t>
+        <w:t xml:space="preserve">Fill in the customer's name, phone, email, and address</w:t>
       </w:r>
     </w:p>
     <w:p>
@@ -4911,7 +3443,43 @@
           <w:sz w:val="22"/>
           <w:szCs w:val="22"/>
         </w:rPr>
-        <w:t xml:space="preserve">Colour coding is the same as the personal calendar</w:t>
+        <w:t xml:space="preserve">Select the products and enter the quantity</w:t>
+      </w:r>
+    </w:p>
+    <w:p>
+      <w:pPr>
+        <w:pStyle w:val="ListParagraph"/>
+        <w:numPr>
+          <w:ilvl w:val="0"/>
+          <w:numId w:val="3"/>
+        </w:numPr>
+        <w:spacing w:after="80"/>
+      </w:pPr>
+      <w:r>
+        <w:rPr>
+          <w:rFonts w:ascii="Arial" w:cs="Arial" w:eastAsia="Arial" w:hAnsi="Arial"/>
+          <w:sz w:val="22"/>
+          <w:szCs w:val="22"/>
+        </w:rPr>
+        <w:t xml:space="preserve">The total amount is calculated automatically</w:t>
+      </w:r>
+    </w:p>
+    <w:p>
+      <w:pPr>
+        <w:pStyle w:val="ListParagraph"/>
+        <w:numPr>
+          <w:ilvl w:val="0"/>
+          <w:numId w:val="3"/>
+        </w:numPr>
+        <w:spacing w:after="80"/>
+      </w:pPr>
+      <w:r>
+        <w:rPr>
+          <w:rFonts w:ascii="Arial" w:cs="Arial" w:eastAsia="Arial" w:hAnsi="Arial"/>
+          <w:sz w:val="22"/>
+          <w:szCs w:val="22"/>
+        </w:rPr>
+        <w:t xml:space="preserve">Submit the quotation for your manager's approval</w:t>
       </w:r>
     </w:p>
     <w:p>
@@ -4928,7 +3496,7 @@
           <w:sz w:val="24"/>
           <w:szCs w:val="24"/>
         </w:rPr>
-        <w:t xml:space="preserve">System Config</w:t>
+        <w:t xml:space="preserve">Offers</w:t>
       </w:r>
     </w:p>
     <w:p>
@@ -4940,7 +3508,7 @@
           <wp:inline distT="0" distB="0" distL="0" distR="0">
             <wp:extent cx="5905500" cy="3333750"/>
             <wp:effectExtent t="0" r="0" b="0" l="0"/>
-            <wp:docPr id="1" name="12-owner-config" descr="12-owner-config" title="12-owner-config"/>
+            <wp:docPr id="1" name="06-offers" descr="06-offers" title="06-offers"/>
             <wp:cNvGraphicFramePr>
               <a:graphicFrameLocks xmlns:a="http://schemas.openxmlformats.org/drawingml/2006/main" noChangeAspect="1"/>
             </wp:cNvGraphicFramePr>
@@ -4954,7 +3522,7 @@
                     </pic:cNvPicPr>
                   </pic:nvPicPr>
                   <pic:blipFill>
-                    <a:blip r:embed="rId9" cstate="none"/>
+                    <a:blip r:embed="rId16" cstate="none"/>
                     <a:srcRect/>
                     <a:stretch>
                       <a:fillRect/>
@@ -4991,7 +3559,223 @@
           <w:sz w:val="22"/>
           <w:szCs w:val="22"/>
         </w:rPr>
-        <w:t xml:space="preserve">Configure company-wide settings.</w:t>
+        <w:t xml:space="preserve">View quotations that have been approved and finalised. These are the official price offers sent to customers.</w:t>
+      </w:r>
+    </w:p>
+    <w:p>
+      <w:pPr>
+        <w:pStyle w:val="Heading3"/>
+        <w:spacing w:after="80" w:before="220"/>
+      </w:pPr>
+      <w:r>
+        <w:rPr>
+          <w:rFonts w:ascii="Arial" w:cs="Arial" w:eastAsia="Arial" w:hAnsi="Arial"/>
+          <w:b/>
+          <w:bCs/>
+          <w:color w:val="374151"/>
+          <w:sz w:val="24"/>
+          <w:szCs w:val="24"/>
+        </w:rPr>
+        <w:t xml:space="preserve">My Payslips</w:t>
+      </w:r>
+    </w:p>
+    <w:p>
+      <w:pPr>
+        <w:spacing w:after="160" w:before="80"/>
+      </w:pPr>
+      <w:r>
+        <w:drawing>
+          <wp:inline distT="0" distB="0" distL="0" distR="0">
+            <wp:extent cx="5905500" cy="3333750"/>
+            <wp:effectExtent t="0" r="0" b="0" l="0"/>
+            <wp:docPr id="1" name="20-employee-payslips" descr="20-employee-payslips" title="20-employee-payslips"/>
+            <wp:cNvGraphicFramePr>
+              <a:graphicFrameLocks xmlns:a="http://schemas.openxmlformats.org/drawingml/2006/main" noChangeAspect="1"/>
+            </wp:cNvGraphicFramePr>
+            <a:graphic xmlns:a="http://schemas.openxmlformats.org/drawingml/2006/main">
+              <a:graphicData uri="http://schemas.openxmlformats.org/drawingml/2006/picture">
+                <pic:pic xmlns:pic="http://schemas.openxmlformats.org/drawingml/2006/picture">
+                  <pic:nvPicPr>
+                    <pic:cNvPr id="0" name="" descr=""/>
+                    <pic:cNvPicPr>
+                      <a:picLocks noChangeAspect="1" noChangeArrowheads="1"/>
+                    </pic:cNvPicPr>
+                  </pic:nvPicPr>
+                  <pic:blipFill>
+                    <a:blip r:embed="rId17" cstate="none"/>
+                    <a:srcRect/>
+                    <a:stretch>
+                      <a:fillRect/>
+                    </a:stretch>
+                  </pic:blipFill>
+                  <pic:spPr bwMode="auto">
+                    <a:xfrm>
+                      <a:off x="0" y="0"/>
+                      <a:ext cx="5905500" cy="3333750"/>
+                    </a:xfrm>
+                    <a:prstGeom prst="rect">
+                      <a:avLst/>
+                    </a:prstGeom>
+                  </pic:spPr>
+                </pic:pic>
+              </a:graphicData>
+            </a:graphic>
+          </wp:inline>
+        </w:drawing>
+      </w:r>
+    </w:p>
+    <w:p>
+      <w:pPr>
+        <w:spacing w:after="80"/>
+      </w:pPr>
+    </w:p>
+    <w:p>
+      <w:pPr>
+        <w:spacing w:after="120" w:line="276"/>
+      </w:pPr>
+      <w:r>
+        <w:rPr>
+          <w:rFonts w:ascii="Arial" w:cs="Arial" w:eastAsia="Arial" w:hAnsi="Arial"/>
+          <w:sz w:val="22"/>
+          <w:szCs w:val="22"/>
+        </w:rPr>
+        <w:t xml:space="preserve">View your monthly salary slips. Each slip shows your basic salary, any deductions (like leave without pay), and the final amount paid.</w:t>
+      </w:r>
+    </w:p>
+    <w:p>
+      <w:pPr>
+        <w:pBdr>
+          <w:bottom w:val="single" w:color="E5E7EB" w:sz="4"/>
+        </w:pBdr>
+        <w:spacing w:after="160" w:before="160"/>
+      </w:pPr>
+    </w:p>
+    <w:p>
+      <w:pPr>
+        <w:pStyle w:val="Heading1"/>
+        <w:spacing w:after="160" w:before="400"/>
+      </w:pPr>
+      <w:r>
+        <w:rPr>
+          <w:rFonts w:ascii="Arial" w:cs="Arial" w:eastAsia="Arial" w:hAnsi="Arial"/>
+          <w:b/>
+          <w:bCs/>
+          <w:color w:val="1a1f2e"/>
+          <w:sz w:val="32"/>
+          <w:szCs w:val="32"/>
+        </w:rPr>
+        <w:t xml:space="preserve">4. Manager — What You Can Do</w:t>
+      </w:r>
+    </w:p>
+    <w:p>
+      <w:pPr>
+        <w:spacing w:after="120" w:line="276"/>
+      </w:pPr>
+      <w:r>
+        <w:rPr>
+          <w:rFonts w:ascii="Arial" w:cs="Arial" w:eastAsia="Arial" w:hAnsi="Arial"/>
+          <w:sz w:val="22"/>
+          <w:szCs w:val="22"/>
+        </w:rPr>
+        <w:t xml:space="preserve">Use SE_5001, SE_5002, or SE_5003 with password Soumya@2024</w:t>
+      </w:r>
+    </w:p>
+    <w:p>
+      <w:pPr>
+        <w:spacing w:after="120" w:line="276"/>
+      </w:pPr>
+      <w:r>
+        <w:rPr>
+          <w:rFonts w:ascii="Arial" w:cs="Arial" w:eastAsia="Arial" w:hAnsi="Arial"/>
+          <w:sz w:val="22"/>
+          <w:szCs w:val="22"/>
+        </w:rPr>
+        <w:t xml:space="preserve">As a Manager, you have all the features of an Employee plus the ability to approve or reject your team's requests.</w:t>
+      </w:r>
+    </w:p>
+    <w:p>
+      <w:pPr>
+        <w:spacing w:after="80"/>
+      </w:pPr>
+    </w:p>
+    <w:p>
+      <w:pPr>
+        <w:pStyle w:val="Heading3"/>
+        <w:spacing w:after="80" w:before="220"/>
+      </w:pPr>
+      <w:r>
+        <w:rPr>
+          <w:rFonts w:ascii="Arial" w:cs="Arial" w:eastAsia="Arial" w:hAnsi="Arial"/>
+          <w:b/>
+          <w:bCs/>
+          <w:color w:val="374151"/>
+          <w:sz w:val="24"/>
+          <w:szCs w:val="24"/>
+        </w:rPr>
+        <w:t xml:space="preserve">Timecard Approvals</w:t>
+      </w:r>
+    </w:p>
+    <w:p>
+      <w:pPr>
+        <w:spacing w:after="160" w:before="80"/>
+      </w:pPr>
+      <w:r>
+        <w:drawing>
+          <wp:inline distT="0" distB="0" distL="0" distR="0">
+            <wp:extent cx="5905500" cy="3333750"/>
+            <wp:effectExtent t="0" r="0" b="0" l="0"/>
+            <wp:docPr id="1" name="17-manager-timecard-approvals" descr="17-manager-timecard-approvals" title="17-manager-timecard-approvals"/>
+            <wp:cNvGraphicFramePr>
+              <a:graphicFrameLocks xmlns:a="http://schemas.openxmlformats.org/drawingml/2006/main" noChangeAspect="1"/>
+            </wp:cNvGraphicFramePr>
+            <a:graphic xmlns:a="http://schemas.openxmlformats.org/drawingml/2006/main">
+              <a:graphicData uri="http://schemas.openxmlformats.org/drawingml/2006/picture">
+                <pic:pic xmlns:pic="http://schemas.openxmlformats.org/drawingml/2006/picture">
+                  <pic:nvPicPr>
+                    <pic:cNvPr id="0" name="" descr=""/>
+                    <pic:cNvPicPr>
+                      <a:picLocks noChangeAspect="1" noChangeArrowheads="1"/>
+                    </pic:cNvPicPr>
+                  </pic:nvPicPr>
+                  <pic:blipFill>
+                    <a:blip r:embed="rId18" cstate="none"/>
+                    <a:srcRect/>
+                    <a:stretch>
+                      <a:fillRect/>
+                    </a:stretch>
+                  </pic:blipFill>
+                  <pic:spPr bwMode="auto">
+                    <a:xfrm>
+                      <a:off x="0" y="0"/>
+                      <a:ext cx="5905500" cy="3333750"/>
+                    </a:xfrm>
+                    <a:prstGeom prst="rect">
+                      <a:avLst/>
+                    </a:prstGeom>
+                  </pic:spPr>
+                </pic:pic>
+              </a:graphicData>
+            </a:graphic>
+          </wp:inline>
+        </w:drawing>
+      </w:r>
+    </w:p>
+    <w:p>
+      <w:pPr>
+        <w:spacing w:after="80"/>
+      </w:pPr>
+    </w:p>
+    <w:p>
+      <w:pPr>
+        <w:spacing w:after="120" w:line="276"/>
+      </w:pPr>
+      <w:r>
+        <w:rPr>
+          <w:rFonts w:ascii="Arial" w:cs="Arial" w:eastAsia="Arial" w:hAnsi="Arial"/>
+          <w:sz w:val="22"/>
+          <w:szCs w:val="22"/>
+        </w:rPr>
+        <w:t xml:space="preserve">Review and approve daily attendance submitted by your team members.</w:t>
       </w:r>
     </w:p>
     <w:p>
@@ -5009,7 +3793,7 @@
           <w:sz w:val="22"/>
           <w:szCs w:val="22"/>
         </w:rPr>
-        <w:t xml:space="preserve">Annual Leave Days: how many leave days each employee gets per year</w:t>
+        <w:t xml:space="preserve">You will see a list of pending timecards from your team</w:t>
       </w:r>
     </w:p>
     <w:p>
@@ -5027,7 +3811,7 @@
           <w:sz w:val="22"/>
           <w:szCs w:val="22"/>
         </w:rPr>
-        <w:t xml:space="preserve">Employee Overtime Rate: hourly payout rate for employee overtime</w:t>
+        <w:t xml:space="preserve">Click Approve to accept a timecard, or Reject to send it back</w:t>
       </w:r>
     </w:p>
     <w:p>
@@ -5045,7 +3829,87 @@
           <w:sz w:val="22"/>
           <w:szCs w:val="22"/>
         </w:rPr>
-        <w:t xml:space="preserve">Manager Overtime Rate: hourly payout rate for manager overtime</w:t>
+        <w:t xml:space="preserve">Once approved, the timecard is locked and cannot be edited by the employee</w:t>
+      </w:r>
+    </w:p>
+    <w:p>
+      <w:pPr>
+        <w:pStyle w:val="Heading3"/>
+        <w:spacing w:after="80" w:before="220"/>
+      </w:pPr>
+      <w:r>
+        <w:rPr>
+          <w:rFonts w:ascii="Arial" w:cs="Arial" w:eastAsia="Arial" w:hAnsi="Arial"/>
+          <w:b/>
+          <w:bCs/>
+          <w:color w:val="374151"/>
+          <w:sz w:val="24"/>
+          <w:szCs w:val="24"/>
+        </w:rPr>
+        <w:t xml:space="preserve">Leave Approvals</w:t>
+      </w:r>
+    </w:p>
+    <w:p>
+      <w:pPr>
+        <w:spacing w:after="160" w:before="80"/>
+      </w:pPr>
+      <w:r>
+        <w:drawing>
+          <wp:inline distT="0" distB="0" distL="0" distR="0">
+            <wp:extent cx="5905500" cy="3333750"/>
+            <wp:effectExtent t="0" r="0" b="0" l="0"/>
+            <wp:docPr id="1" name="18-manager-leave-approvals" descr="18-manager-leave-approvals" title="18-manager-leave-approvals"/>
+            <wp:cNvGraphicFramePr>
+              <a:graphicFrameLocks xmlns:a="http://schemas.openxmlformats.org/drawingml/2006/main" noChangeAspect="1"/>
+            </wp:cNvGraphicFramePr>
+            <a:graphic xmlns:a="http://schemas.openxmlformats.org/drawingml/2006/main">
+              <a:graphicData uri="http://schemas.openxmlformats.org/drawingml/2006/picture">
+                <pic:pic xmlns:pic="http://schemas.openxmlformats.org/drawingml/2006/picture">
+                  <pic:nvPicPr>
+                    <pic:cNvPr id="0" name="" descr=""/>
+                    <pic:cNvPicPr>
+                      <a:picLocks noChangeAspect="1" noChangeArrowheads="1"/>
+                    </pic:cNvPicPr>
+                  </pic:nvPicPr>
+                  <pic:blipFill>
+                    <a:blip r:embed="rId19" cstate="none"/>
+                    <a:srcRect/>
+                    <a:stretch>
+                      <a:fillRect/>
+                    </a:stretch>
+                  </pic:blipFill>
+                  <pic:spPr bwMode="auto">
+                    <a:xfrm>
+                      <a:off x="0" y="0"/>
+                      <a:ext cx="5905500" cy="3333750"/>
+                    </a:xfrm>
+                    <a:prstGeom prst="rect">
+                      <a:avLst/>
+                    </a:prstGeom>
+                  </pic:spPr>
+                </pic:pic>
+              </a:graphicData>
+            </a:graphic>
+          </wp:inline>
+        </w:drawing>
+      </w:r>
+    </w:p>
+    <w:p>
+      <w:pPr>
+        <w:spacing w:after="80"/>
+      </w:pPr>
+    </w:p>
+    <w:p>
+      <w:pPr>
+        <w:spacing w:after="120" w:line="276"/>
+      </w:pPr>
+      <w:r>
+        <w:rPr>
+          <w:rFonts w:ascii="Arial" w:cs="Arial" w:eastAsia="Arial" w:hAnsi="Arial"/>
+          <w:sz w:val="22"/>
+          <w:szCs w:val="22"/>
+        </w:rPr>
+        <w:t xml:space="preserve">Review and approve leave requests from your team.</w:t>
       </w:r>
     </w:p>
     <w:p>
@@ -5063,7 +3927,7 @@
           <w:sz w:val="22"/>
           <w:szCs w:val="22"/>
         </w:rPr>
-        <w:t xml:space="preserve">Holidays: add or remove public holidays — these dates are automatically blocked for timecards and leaves</w:t>
+        <w:t xml:space="preserve">Click Approve to grant the leave, or Reject to decline it</w:t>
       </w:r>
     </w:p>
     <w:p>
@@ -5081,7 +3945,7 @@
           <w:sz w:val="22"/>
           <w:szCs w:val="22"/>
         </w:rPr>
-        <w:t xml:space="preserve">Click Save after making changes</w:t>
+        <w:t xml:space="preserve">If you reject a leave, the employee's leave balance is automatically restored</w:t>
       </w:r>
     </w:p>
     <w:p>
@@ -5124,7 +3988,1143 @@
                     </pic:cNvPicPr>
                   </pic:nvPicPr>
                   <pic:blipFill>
-                    <a:blip r:embed="rId9" cstate="none"/>
+                    <a:blip r:embed="rId20" cstate="none"/>
+                    <a:srcRect/>
+                    <a:stretch>
+                      <a:fillRect/>
+                    </a:stretch>
+                  </pic:blipFill>
+                  <pic:spPr bwMode="auto">
+                    <a:xfrm>
+                      <a:off x="0" y="0"/>
+                      <a:ext cx="5905500" cy="3333750"/>
+                    </a:xfrm>
+                    <a:prstGeom prst="rect">
+                      <a:avLst/>
+                    </a:prstGeom>
+                  </pic:spPr>
+                </pic:pic>
+              </a:graphicData>
+            </a:graphic>
+          </wp:inline>
+        </w:drawing>
+      </w:r>
+    </w:p>
+    <w:p>
+      <w:pPr>
+        <w:spacing w:after="80"/>
+      </w:pPr>
+    </w:p>
+    <w:p>
+      <w:pPr>
+        <w:spacing w:after="120" w:line="276"/>
+      </w:pPr>
+      <w:r>
+        <w:rPr>
+          <w:rFonts w:ascii="Arial" w:cs="Arial" w:eastAsia="Arial" w:hAnsi="Arial"/>
+          <w:sz w:val="22"/>
+          <w:szCs w:val="22"/>
+        </w:rPr>
+        <w:t xml:space="preserve">View and generate monthly salary slips for your team members.</w:t>
+      </w:r>
+    </w:p>
+    <w:p>
+      <w:pPr>
+        <w:pStyle w:val="ListParagraph"/>
+        <w:numPr>
+          <w:ilvl w:val="0"/>
+          <w:numId w:val="3"/>
+        </w:numPr>
+        <w:spacing w:after="80"/>
+      </w:pPr>
+      <w:r>
+        <w:rPr>
+          <w:rFonts w:ascii="Arial" w:cs="Arial" w:eastAsia="Arial" w:hAnsi="Arial"/>
+          <w:sz w:val="22"/>
+          <w:szCs w:val="22"/>
+        </w:rPr>
+        <w:t xml:space="preserve">Select the month and click Generate to create payslips</w:t>
+      </w:r>
+    </w:p>
+    <w:p>
+      <w:pPr>
+        <w:pStyle w:val="ListParagraph"/>
+        <w:numPr>
+          <w:ilvl w:val="0"/>
+          <w:numId w:val="3"/>
+        </w:numPr>
+        <w:spacing w:after="80"/>
+      </w:pPr>
+      <w:r>
+        <w:rPr>
+          <w:rFonts w:ascii="Arial" w:cs="Arial" w:eastAsia="Arial" w:hAnsi="Arial"/>
+          <w:sz w:val="22"/>
+          <w:szCs w:val="22"/>
+        </w:rPr>
+        <w:t xml:space="preserve">Each payslip is based on the number of approved attendance days</w:t>
+      </w:r>
+    </w:p>
+    <w:p>
+      <w:pPr>
+        <w:pBdr>
+          <w:bottom w:val="single" w:color="E5E7EB" w:sz="4"/>
+        </w:pBdr>
+        <w:spacing w:after="160" w:before="160"/>
+      </w:pPr>
+    </w:p>
+    <w:p>
+      <w:pPr>
+        <w:pStyle w:val="Heading1"/>
+        <w:spacing w:after="160" w:before="400"/>
+      </w:pPr>
+      <w:r>
+        <w:rPr>
+          <w:rFonts w:ascii="Arial" w:cs="Arial" w:eastAsia="Arial" w:hAnsi="Arial"/>
+          <w:b/>
+          <w:bCs/>
+          <w:color w:val="1a1f2e"/>
+          <w:sz w:val="32"/>
+          <w:szCs w:val="32"/>
+        </w:rPr>
+        <w:t xml:space="preserve">5. Owner — What You Can Do</w:t>
+      </w:r>
+    </w:p>
+    <w:p>
+      <w:pPr>
+        <w:spacing w:after="120" w:line="276"/>
+      </w:pPr>
+      <w:r>
+        <w:rPr>
+          <w:rFonts w:ascii="Arial" w:cs="Arial" w:eastAsia="Arial" w:hAnsi="Arial"/>
+          <w:sz w:val="22"/>
+          <w:szCs w:val="22"/>
+        </w:rPr>
+        <w:t xml:space="preserve">Use SE_5000 with password 87654321</w:t>
+      </w:r>
+    </w:p>
+    <w:p>
+      <w:pPr>
+        <w:spacing w:after="120" w:line="276"/>
+      </w:pPr>
+      <w:r>
+        <w:rPr>
+          <w:rFonts w:ascii="Arial" w:cs="Arial" w:eastAsia="Arial" w:hAnsi="Arial"/>
+          <w:sz w:val="22"/>
+          <w:szCs w:val="22"/>
+        </w:rPr>
+        <w:t xml:space="preserve">As the Owner, you have full access to all features across the entire organisation.</w:t>
+      </w:r>
+    </w:p>
+    <w:p>
+      <w:pPr>
+        <w:spacing w:after="80"/>
+      </w:pPr>
+    </w:p>
+    <w:p>
+      <w:pPr>
+        <w:pStyle w:val="Heading3"/>
+        <w:spacing w:after="80" w:before="220"/>
+      </w:pPr>
+      <w:r>
+        <w:rPr>
+          <w:rFonts w:ascii="Arial" w:cs="Arial" w:eastAsia="Arial" w:hAnsi="Arial"/>
+          <w:b/>
+          <w:bCs/>
+          <w:color w:val="374151"/>
+          <w:sz w:val="24"/>
+          <w:szCs w:val="24"/>
+        </w:rPr>
+        <w:t xml:space="preserve">Dashboard</w:t>
+      </w:r>
+    </w:p>
+    <w:p>
+      <w:pPr>
+        <w:spacing w:after="160" w:before="80"/>
+      </w:pPr>
+      <w:r>
+        <w:drawing>
+          <wp:inline distT="0" distB="0" distL="0" distR="0">
+            <wp:extent cx="5905500" cy="3333750"/>
+            <wp:effectExtent t="0" r="0" b="0" l="0"/>
+            <wp:docPr id="1" name="02-owner-dashboard" descr="02-owner-dashboard" title="02-owner-dashboard"/>
+            <wp:cNvGraphicFramePr>
+              <a:graphicFrameLocks xmlns:a="http://schemas.openxmlformats.org/drawingml/2006/main" noChangeAspect="1"/>
+            </wp:cNvGraphicFramePr>
+            <a:graphic xmlns:a="http://schemas.openxmlformats.org/drawingml/2006/main">
+              <a:graphicData uri="http://schemas.openxmlformats.org/drawingml/2006/picture">
+                <pic:pic xmlns:pic="http://schemas.openxmlformats.org/drawingml/2006/picture">
+                  <pic:nvPicPr>
+                    <pic:cNvPr id="0" name="" descr=""/>
+                    <pic:cNvPicPr>
+                      <a:picLocks noChangeAspect="1" noChangeArrowheads="1"/>
+                    </pic:cNvPicPr>
+                  </pic:nvPicPr>
+                  <pic:blipFill>
+                    <a:blip r:embed="rId21" cstate="none"/>
+                    <a:srcRect/>
+                    <a:stretch>
+                      <a:fillRect/>
+                    </a:stretch>
+                  </pic:blipFill>
+                  <pic:spPr bwMode="auto">
+                    <a:xfrm>
+                      <a:off x="0" y="0"/>
+                      <a:ext cx="5905500" cy="3333750"/>
+                    </a:xfrm>
+                    <a:prstGeom prst="rect">
+                      <a:avLst/>
+                    </a:prstGeom>
+                  </pic:spPr>
+                </pic:pic>
+              </a:graphicData>
+            </a:graphic>
+          </wp:inline>
+        </w:drawing>
+      </w:r>
+    </w:p>
+    <w:p>
+      <w:pPr>
+        <w:spacing w:after="80"/>
+      </w:pPr>
+    </w:p>
+    <w:p>
+      <w:pPr>
+        <w:spacing w:after="120" w:line="276"/>
+      </w:pPr>
+      <w:r>
+        <w:rPr>
+          <w:rFonts w:ascii="Arial" w:cs="Arial" w:eastAsia="Arial" w:hAnsi="Arial"/>
+          <w:sz w:val="22"/>
+          <w:szCs w:val="22"/>
+        </w:rPr>
+        <w:t xml:space="preserve">Shows company-wide pending approvals — how many manager timecards and leaves are waiting for your review. Click any tile to go directly to the approvals page.</w:t>
+      </w:r>
+    </w:p>
+    <w:p>
+      <w:pPr>
+        <w:pStyle w:val="Heading3"/>
+        <w:spacing w:after="80" w:before="220"/>
+      </w:pPr>
+      <w:r>
+        <w:rPr>
+          <w:rFonts w:ascii="Arial" w:cs="Arial" w:eastAsia="Arial" w:hAnsi="Arial"/>
+          <w:b/>
+          <w:bCs/>
+          <w:color w:val="374151"/>
+          <w:sz w:val="24"/>
+          <w:szCs w:val="24"/>
+        </w:rPr>
+        <w:t xml:space="preserve">Products</w:t>
+      </w:r>
+    </w:p>
+    <w:p>
+      <w:pPr>
+        <w:spacing w:after="160" w:before="80"/>
+      </w:pPr>
+      <w:r>
+        <w:drawing>
+          <wp:inline distT="0" distB="0" distL="0" distR="0">
+            <wp:extent cx="5905500" cy="3333750"/>
+            <wp:effectExtent t="0" r="0" b="0" l="0"/>
+            <wp:docPr id="1" name="03-owner-products" descr="03-owner-products" title="03-owner-products"/>
+            <wp:cNvGraphicFramePr>
+              <a:graphicFrameLocks xmlns:a="http://schemas.openxmlformats.org/drawingml/2006/main" noChangeAspect="1"/>
+            </wp:cNvGraphicFramePr>
+            <a:graphic xmlns:a="http://schemas.openxmlformats.org/drawingml/2006/main">
+              <a:graphicData uri="http://schemas.openxmlformats.org/drawingml/2006/picture">
+                <pic:pic xmlns:pic="http://schemas.openxmlformats.org/drawingml/2006/picture">
+                  <pic:nvPicPr>
+                    <pic:cNvPr id="0" name="" descr=""/>
+                    <pic:cNvPicPr>
+                      <a:picLocks noChangeAspect="1" noChangeArrowheads="1"/>
+                    </pic:cNvPicPr>
+                  </pic:nvPicPr>
+                  <pic:blipFill>
+                    <a:blip r:embed="rId22" cstate="none"/>
+                    <a:srcRect/>
+                    <a:stretch>
+                      <a:fillRect/>
+                    </a:stretch>
+                  </pic:blipFill>
+                  <pic:spPr bwMode="auto">
+                    <a:xfrm>
+                      <a:off x="0" y="0"/>
+                      <a:ext cx="5905500" cy="3333750"/>
+                    </a:xfrm>
+                    <a:prstGeom prst="rect">
+                      <a:avLst/>
+                    </a:prstGeom>
+                  </pic:spPr>
+                </pic:pic>
+              </a:graphicData>
+            </a:graphic>
+          </wp:inline>
+        </w:drawing>
+      </w:r>
+    </w:p>
+    <w:p>
+      <w:pPr>
+        <w:spacing w:after="80"/>
+      </w:pPr>
+    </w:p>
+    <w:p>
+      <w:pPr>
+        <w:spacing w:after="120" w:line="276"/>
+      </w:pPr>
+      <w:r>
+        <w:rPr>
+          <w:rFonts w:ascii="Arial" w:cs="Arial" w:eastAsia="Arial" w:hAnsi="Arial"/>
+          <w:sz w:val="22"/>
+          <w:szCs w:val="22"/>
+        </w:rPr>
+        <w:t xml:space="preserve">Manage the company's product catalogue.</w:t>
+      </w:r>
+    </w:p>
+    <w:p>
+      <w:pPr>
+        <w:pStyle w:val="ListParagraph"/>
+        <w:numPr>
+          <w:ilvl w:val="0"/>
+          <w:numId w:val="3"/>
+        </w:numPr>
+        <w:spacing w:after="80"/>
+      </w:pPr>
+      <w:r>
+        <w:rPr>
+          <w:rFonts w:ascii="Arial" w:cs="Arial" w:eastAsia="Arial" w:hAnsi="Arial"/>
+          <w:sz w:val="22"/>
+          <w:szCs w:val="22"/>
+        </w:rPr>
+        <w:t xml:space="preserve">Click "+ Add Product" to add a new product with its name, description, category, and pricing</w:t>
+      </w:r>
+    </w:p>
+    <w:p>
+      <w:pPr>
+        <w:pStyle w:val="ListParagraph"/>
+        <w:numPr>
+          <w:ilvl w:val="0"/>
+          <w:numId w:val="3"/>
+        </w:numPr>
+        <w:spacing w:after="80"/>
+      </w:pPr>
+      <w:r>
+        <w:rPr>
+          <w:rFonts w:ascii="Arial" w:cs="Arial" w:eastAsia="Arial" w:hAnsi="Arial"/>
+          <w:sz w:val="22"/>
+          <w:szCs w:val="22"/>
+        </w:rPr>
+        <w:t xml:space="preserve">Edit existing products to update prices or mark them as inactive</w:t>
+      </w:r>
+    </w:p>
+    <w:p>
+      <w:pPr>
+        <w:pStyle w:val="ListParagraph"/>
+        <w:numPr>
+          <w:ilvl w:val="0"/>
+          <w:numId w:val="3"/>
+        </w:numPr>
+        <w:spacing w:after="80"/>
+      </w:pPr>
+      <w:r>
+        <w:rPr>
+          <w:rFonts w:ascii="Arial" w:cs="Arial" w:eastAsia="Arial" w:hAnsi="Arial"/>
+          <w:sz w:val="22"/>
+          <w:szCs w:val="22"/>
+        </w:rPr>
+        <w:t xml:space="preserve">Inactive products will not appear when creating quotations</w:t>
+      </w:r>
+    </w:p>
+    <w:p>
+      <w:pPr>
+        <w:pStyle w:val="Heading3"/>
+        <w:spacing w:after="80" w:before="220"/>
+      </w:pPr>
+      <w:r>
+        <w:rPr>
+          <w:rFonts w:ascii="Arial" w:cs="Arial" w:eastAsia="Arial" w:hAnsi="Arial"/>
+          <w:b/>
+          <w:bCs/>
+          <w:color w:val="374151"/>
+          <w:sz w:val="24"/>
+          <w:szCs w:val="24"/>
+        </w:rPr>
+        <w:t xml:space="preserve">Inventory</w:t>
+      </w:r>
+    </w:p>
+    <w:p>
+      <w:pPr>
+        <w:spacing w:after="160" w:before="80"/>
+      </w:pPr>
+      <w:r>
+        <w:drawing>
+          <wp:inline distT="0" distB="0" distL="0" distR="0">
+            <wp:extent cx="5905500" cy="3333750"/>
+            <wp:effectExtent t="0" r="0" b="0" l="0"/>
+            <wp:docPr id="1" name="04-inventory" descr="04-inventory" title="04-inventory"/>
+            <wp:cNvGraphicFramePr>
+              <a:graphicFrameLocks xmlns:a="http://schemas.openxmlformats.org/drawingml/2006/main" noChangeAspect="1"/>
+            </wp:cNvGraphicFramePr>
+            <a:graphic xmlns:a="http://schemas.openxmlformats.org/drawingml/2006/main">
+              <a:graphicData uri="http://schemas.openxmlformats.org/drawingml/2006/picture">
+                <pic:pic xmlns:pic="http://schemas.openxmlformats.org/drawingml/2006/picture">
+                  <pic:nvPicPr>
+                    <pic:cNvPr id="0" name="" descr=""/>
+                    <pic:cNvPicPr>
+                      <a:picLocks noChangeAspect="1" noChangeArrowheads="1"/>
+                    </pic:cNvPicPr>
+                  </pic:nvPicPr>
+                  <pic:blipFill>
+                    <a:blip r:embed="rId14" cstate="none"/>
+                    <a:srcRect/>
+                    <a:stretch>
+                      <a:fillRect/>
+                    </a:stretch>
+                  </pic:blipFill>
+                  <pic:spPr bwMode="auto">
+                    <a:xfrm>
+                      <a:off x="0" y="0"/>
+                      <a:ext cx="5905500" cy="3333750"/>
+                    </a:xfrm>
+                    <a:prstGeom prst="rect">
+                      <a:avLst/>
+                    </a:prstGeom>
+                  </pic:spPr>
+                </pic:pic>
+              </a:graphicData>
+            </a:graphic>
+          </wp:inline>
+        </w:drawing>
+      </w:r>
+    </w:p>
+    <w:p>
+      <w:pPr>
+        <w:spacing w:after="80"/>
+      </w:pPr>
+    </w:p>
+    <w:p>
+      <w:pPr>
+        <w:spacing w:after="120" w:line="276"/>
+      </w:pPr>
+      <w:r>
+        <w:rPr>
+          <w:rFonts w:ascii="Arial" w:cs="Arial" w:eastAsia="Arial" w:hAnsi="Arial"/>
+          <w:sz w:val="22"/>
+          <w:szCs w:val="22"/>
+        </w:rPr>
+        <w:t xml:space="preserve">View and update stock levels for all products.</w:t>
+      </w:r>
+    </w:p>
+    <w:p>
+      <w:pPr>
+        <w:pStyle w:val="ListParagraph"/>
+        <w:numPr>
+          <w:ilvl w:val="0"/>
+          <w:numId w:val="3"/>
+        </w:numPr>
+        <w:spacing w:after="80"/>
+      </w:pPr>
+      <w:r>
+        <w:rPr>
+          <w:rFonts w:ascii="Arial" w:cs="Arial" w:eastAsia="Arial" w:hAnsi="Arial"/>
+          <w:sz w:val="22"/>
+          <w:szCs w:val="22"/>
+        </w:rPr>
+        <w:t xml:space="preserve">The table shows 8 upcoming weeks of stock forecast</w:t>
+      </w:r>
+    </w:p>
+    <w:p>
+      <w:pPr>
+        <w:pStyle w:val="ListParagraph"/>
+        <w:numPr>
+          <w:ilvl w:val="0"/>
+          <w:numId w:val="3"/>
+        </w:numPr>
+        <w:spacing w:after="80"/>
+      </w:pPr>
+      <w:r>
+        <w:rPr>
+          <w:rFonts w:ascii="Arial" w:cs="Arial" w:eastAsia="Arial" w:hAnsi="Arial"/>
+          <w:sz w:val="22"/>
+          <w:szCs w:val="22"/>
+        </w:rPr>
+        <w:t xml:space="preserve">Enter quantities in the weekly cells to plan incoming stock</w:t>
+      </w:r>
+    </w:p>
+    <w:p>
+      <w:pPr>
+        <w:pStyle w:val="ListParagraph"/>
+        <w:numPr>
+          <w:ilvl w:val="0"/>
+          <w:numId w:val="3"/>
+        </w:numPr>
+        <w:spacing w:after="80"/>
+      </w:pPr>
+      <w:r>
+        <w:rPr>
+          <w:rFonts w:ascii="Arial" w:cs="Arial" w:eastAsia="Arial" w:hAnsi="Arial"/>
+          <w:sz w:val="22"/>
+          <w:szCs w:val="22"/>
+        </w:rPr>
+        <w:t xml:space="preserve">Click Save to update the forecast</w:t>
+      </w:r>
+    </w:p>
+    <w:p>
+      <w:pPr>
+        <w:pStyle w:val="ListParagraph"/>
+        <w:numPr>
+          <w:ilvl w:val="0"/>
+          <w:numId w:val="3"/>
+        </w:numPr>
+        <w:spacing w:after="80"/>
+      </w:pPr>
+      <w:r>
+        <w:rPr>
+          <w:rFonts w:ascii="Arial" w:cs="Arial" w:eastAsia="Arial" w:hAnsi="Arial"/>
+          <w:sz w:val="22"/>
+          <w:szCs w:val="22"/>
+        </w:rPr>
+        <w:t xml:space="preserve">Total Quantity, Available, Reserved, and Consumed columns update automatically</w:t>
+      </w:r>
+    </w:p>
+    <w:p>
+      <w:pPr>
+        <w:pStyle w:val="Heading3"/>
+        <w:spacing w:after="80" w:before="220"/>
+      </w:pPr>
+      <w:r>
+        <w:rPr>
+          <w:rFonts w:ascii="Arial" w:cs="Arial" w:eastAsia="Arial" w:hAnsi="Arial"/>
+          <w:b/>
+          <w:bCs/>
+          <w:color w:val="374151"/>
+          <w:sz w:val="24"/>
+          <w:szCs w:val="24"/>
+        </w:rPr>
+        <w:t xml:space="preserve">Users</w:t>
+      </w:r>
+    </w:p>
+    <w:p>
+      <w:pPr>
+        <w:spacing w:after="160" w:before="80"/>
+      </w:pPr>
+      <w:r>
+        <w:drawing>
+          <wp:inline distT="0" distB="0" distL="0" distR="0">
+            <wp:extent cx="5905500" cy="3333750"/>
+            <wp:effectExtent t="0" r="0" b="0" l="0"/>
+            <wp:docPr id="1" name="07-owner-users" descr="07-owner-users" title="07-owner-users"/>
+            <wp:cNvGraphicFramePr>
+              <a:graphicFrameLocks xmlns:a="http://schemas.openxmlformats.org/drawingml/2006/main" noChangeAspect="1"/>
+            </wp:cNvGraphicFramePr>
+            <a:graphic xmlns:a="http://schemas.openxmlformats.org/drawingml/2006/main">
+              <a:graphicData uri="http://schemas.openxmlformats.org/drawingml/2006/picture">
+                <pic:pic xmlns:pic="http://schemas.openxmlformats.org/drawingml/2006/picture">
+                  <pic:nvPicPr>
+                    <pic:cNvPr id="0" name="" descr=""/>
+                    <pic:cNvPicPr>
+                      <a:picLocks noChangeAspect="1" noChangeArrowheads="1"/>
+                    </pic:cNvPicPr>
+                  </pic:nvPicPr>
+                  <pic:blipFill>
+                    <a:blip r:embed="rId23" cstate="none"/>
+                    <a:srcRect/>
+                    <a:stretch>
+                      <a:fillRect/>
+                    </a:stretch>
+                  </pic:blipFill>
+                  <pic:spPr bwMode="auto">
+                    <a:xfrm>
+                      <a:off x="0" y="0"/>
+                      <a:ext cx="5905500" cy="3333750"/>
+                    </a:xfrm>
+                    <a:prstGeom prst="rect">
+                      <a:avLst/>
+                    </a:prstGeom>
+                  </pic:spPr>
+                </pic:pic>
+              </a:graphicData>
+            </a:graphic>
+          </wp:inline>
+        </w:drawing>
+      </w:r>
+    </w:p>
+    <w:p>
+      <w:pPr>
+        <w:spacing w:after="80"/>
+      </w:pPr>
+    </w:p>
+    <w:p>
+      <w:pPr>
+        <w:spacing w:after="120" w:line="276"/>
+      </w:pPr>
+      <w:r>
+        <w:rPr>
+          <w:rFonts w:ascii="Arial" w:cs="Arial" w:eastAsia="Arial" w:hAnsi="Arial"/>
+          <w:sz w:val="22"/>
+          <w:szCs w:val="22"/>
+        </w:rPr>
+        <w:t xml:space="preserve">Add and manage all employees and managers in the system.</w:t>
+      </w:r>
+    </w:p>
+    <w:p>
+      <w:pPr>
+        <w:pStyle w:val="ListParagraph"/>
+        <w:numPr>
+          <w:ilvl w:val="0"/>
+          <w:numId w:val="3"/>
+        </w:numPr>
+        <w:spacing w:after="80"/>
+      </w:pPr>
+      <w:r>
+        <w:rPr>
+          <w:rFonts w:ascii="Arial" w:cs="Arial" w:eastAsia="Arial" w:hAnsi="Arial"/>
+          <w:sz w:val="22"/>
+          <w:szCs w:val="22"/>
+        </w:rPr>
+        <w:t xml:space="preserve">Click "+ Add User" to create a new account — an Employee ID is generated automatically</w:t>
+      </w:r>
+    </w:p>
+    <w:p>
+      <w:pPr>
+        <w:pStyle w:val="ListParagraph"/>
+        <w:numPr>
+          <w:ilvl w:val="0"/>
+          <w:numId w:val="3"/>
+        </w:numPr>
+        <w:spacing w:after="80"/>
+      </w:pPr>
+      <w:r>
+        <w:rPr>
+          <w:rFonts w:ascii="Arial" w:cs="Arial" w:eastAsia="Arial" w:hAnsi="Arial"/>
+          <w:sz w:val="22"/>
+          <w:szCs w:val="22"/>
+        </w:rPr>
+        <w:t xml:space="preserve">Edit a user to update their details, change their manager, or deactivate their account</w:t>
+      </w:r>
+    </w:p>
+    <w:p>
+      <w:pPr>
+        <w:pStyle w:val="ListParagraph"/>
+        <w:numPr>
+          <w:ilvl w:val="0"/>
+          <w:numId w:val="3"/>
+        </w:numPr>
+        <w:spacing w:after="80"/>
+      </w:pPr>
+      <w:r>
+        <w:rPr>
+          <w:rFonts w:ascii="Arial" w:cs="Arial" w:eastAsia="Arial" w:hAnsi="Arial"/>
+          <w:sz w:val="22"/>
+          <w:szCs w:val="22"/>
+        </w:rPr>
+        <w:t xml:space="preserve">Deactivated users cannot log in</w:t>
+      </w:r>
+    </w:p>
+    <w:p>
+      <w:pPr>
+        <w:pStyle w:val="Heading3"/>
+        <w:spacing w:after="80" w:before="220"/>
+      </w:pPr>
+      <w:r>
+        <w:rPr>
+          <w:rFonts w:ascii="Arial" w:cs="Arial" w:eastAsia="Arial" w:hAnsi="Arial"/>
+          <w:b/>
+          <w:bCs/>
+          <w:color w:val="374151"/>
+          <w:sz w:val="24"/>
+          <w:szCs w:val="24"/>
+        </w:rPr>
+        <w:t xml:space="preserve">Timecard Approvals</w:t>
+      </w:r>
+    </w:p>
+    <w:p>
+      <w:pPr>
+        <w:spacing w:after="160" w:before="80"/>
+      </w:pPr>
+      <w:r>
+        <w:drawing>
+          <wp:inline distT="0" distB="0" distL="0" distR="0">
+            <wp:extent cx="5905500" cy="3333750"/>
+            <wp:effectExtent t="0" r="0" b="0" l="0"/>
+            <wp:docPr id="1" name="09-owner-timecard-approvals" descr="09-owner-timecard-approvals" title="09-owner-timecard-approvals"/>
+            <wp:cNvGraphicFramePr>
+              <a:graphicFrameLocks xmlns:a="http://schemas.openxmlformats.org/drawingml/2006/main" noChangeAspect="1"/>
+            </wp:cNvGraphicFramePr>
+            <a:graphic xmlns:a="http://schemas.openxmlformats.org/drawingml/2006/main">
+              <a:graphicData uri="http://schemas.openxmlformats.org/drawingml/2006/picture">
+                <pic:pic xmlns:pic="http://schemas.openxmlformats.org/drawingml/2006/picture">
+                  <pic:nvPicPr>
+                    <pic:cNvPr id="0" name="" descr=""/>
+                    <pic:cNvPicPr>
+                      <a:picLocks noChangeAspect="1" noChangeArrowheads="1"/>
+                    </pic:cNvPicPr>
+                  </pic:nvPicPr>
+                  <pic:blipFill>
+                    <a:blip r:embed="rId24" cstate="none"/>
+                    <a:srcRect/>
+                    <a:stretch>
+                      <a:fillRect/>
+                    </a:stretch>
+                  </pic:blipFill>
+                  <pic:spPr bwMode="auto">
+                    <a:xfrm>
+                      <a:off x="0" y="0"/>
+                      <a:ext cx="5905500" cy="3333750"/>
+                    </a:xfrm>
+                    <a:prstGeom prst="rect">
+                      <a:avLst/>
+                    </a:prstGeom>
+                  </pic:spPr>
+                </pic:pic>
+              </a:graphicData>
+            </a:graphic>
+          </wp:inline>
+        </w:drawing>
+      </w:r>
+    </w:p>
+    <w:p>
+      <w:pPr>
+        <w:spacing w:after="80"/>
+      </w:pPr>
+    </w:p>
+    <w:p>
+      <w:pPr>
+        <w:spacing w:after="120" w:line="276"/>
+      </w:pPr>
+      <w:r>
+        <w:rPr>
+          <w:rFonts w:ascii="Arial" w:cs="Arial" w:eastAsia="Arial" w:hAnsi="Arial"/>
+          <w:sz w:val="22"/>
+          <w:szCs w:val="22"/>
+        </w:rPr>
+        <w:t xml:space="preserve">Approve or reject timecards submitted by your managers (not employees — managers handle their own teams).</w:t>
+      </w:r>
+    </w:p>
+    <w:p>
+      <w:pPr>
+        <w:pStyle w:val="Heading3"/>
+        <w:spacing w:after="80" w:before="220"/>
+      </w:pPr>
+      <w:r>
+        <w:rPr>
+          <w:rFonts w:ascii="Arial" w:cs="Arial" w:eastAsia="Arial" w:hAnsi="Arial"/>
+          <w:b/>
+          <w:bCs/>
+          <w:color w:val="374151"/>
+          <w:sz w:val="24"/>
+          <w:szCs w:val="24"/>
+        </w:rPr>
+        <w:t xml:space="preserve">Leave Approvals</w:t>
+      </w:r>
+    </w:p>
+    <w:p>
+      <w:pPr>
+        <w:spacing w:after="160" w:before="80"/>
+      </w:pPr>
+      <w:r>
+        <w:drawing>
+          <wp:inline distT="0" distB="0" distL="0" distR="0">
+            <wp:extent cx="5905500" cy="3333750"/>
+            <wp:effectExtent t="0" r="0" b="0" l="0"/>
+            <wp:docPr id="1" name="10-owner-leave-approvals" descr="10-owner-leave-approvals" title="10-owner-leave-approvals"/>
+            <wp:cNvGraphicFramePr>
+              <a:graphicFrameLocks xmlns:a="http://schemas.openxmlformats.org/drawingml/2006/main" noChangeAspect="1"/>
+            </wp:cNvGraphicFramePr>
+            <a:graphic xmlns:a="http://schemas.openxmlformats.org/drawingml/2006/main">
+              <a:graphicData uri="http://schemas.openxmlformats.org/drawingml/2006/picture">
+                <pic:pic xmlns:pic="http://schemas.openxmlformats.org/drawingml/2006/picture">
+                  <pic:nvPicPr>
+                    <pic:cNvPr id="0" name="" descr=""/>
+                    <pic:cNvPicPr>
+                      <a:picLocks noChangeAspect="1" noChangeArrowheads="1"/>
+                    </pic:cNvPicPr>
+                  </pic:nvPicPr>
+                  <pic:blipFill>
+                    <a:blip r:embed="rId25" cstate="none"/>
+                    <a:srcRect/>
+                    <a:stretch>
+                      <a:fillRect/>
+                    </a:stretch>
+                  </pic:blipFill>
+                  <pic:spPr bwMode="auto">
+                    <a:xfrm>
+                      <a:off x="0" y="0"/>
+                      <a:ext cx="5905500" cy="3333750"/>
+                    </a:xfrm>
+                    <a:prstGeom prst="rect">
+                      <a:avLst/>
+                    </a:prstGeom>
+                  </pic:spPr>
+                </pic:pic>
+              </a:graphicData>
+            </a:graphic>
+          </wp:inline>
+        </w:drawing>
+      </w:r>
+    </w:p>
+    <w:p>
+      <w:pPr>
+        <w:spacing w:after="80"/>
+      </w:pPr>
+    </w:p>
+    <w:p>
+      <w:pPr>
+        <w:spacing w:after="120" w:line="276"/>
+      </w:pPr>
+      <w:r>
+        <w:rPr>
+          <w:rFonts w:ascii="Arial" w:cs="Arial" w:eastAsia="Arial" w:hAnsi="Arial"/>
+          <w:sz w:val="22"/>
+          <w:szCs w:val="22"/>
+        </w:rPr>
+        <w:t xml:space="preserve">Approve or reject leave requests submitted by your managers.</w:t>
+      </w:r>
+    </w:p>
+    <w:p>
+      <w:pPr>
+        <w:pStyle w:val="Heading3"/>
+        <w:spacing w:after="80" w:before="220"/>
+      </w:pPr>
+      <w:r>
+        <w:rPr>
+          <w:rFonts w:ascii="Arial" w:cs="Arial" w:eastAsia="Arial" w:hAnsi="Arial"/>
+          <w:b/>
+          <w:bCs/>
+          <w:color w:val="374151"/>
+          <w:sz w:val="24"/>
+          <w:szCs w:val="24"/>
+        </w:rPr>
+        <w:t xml:space="preserve">Team Calendar</w:t>
+      </w:r>
+    </w:p>
+    <w:p>
+      <w:pPr>
+        <w:spacing w:after="160" w:before="80"/>
+      </w:pPr>
+      <w:r>
+        <w:drawing>
+          <wp:inline distT="0" distB="0" distL="0" distR="0">
+            <wp:extent cx="5905500" cy="3333750"/>
+            <wp:effectExtent t="0" r="0" b="0" l="0"/>
+            <wp:docPr id="1" name="11-owner-team-calendar" descr="11-owner-team-calendar" title="11-owner-team-calendar"/>
+            <wp:cNvGraphicFramePr>
+              <a:graphicFrameLocks xmlns:a="http://schemas.openxmlformats.org/drawingml/2006/main" noChangeAspect="1"/>
+            </wp:cNvGraphicFramePr>
+            <a:graphic xmlns:a="http://schemas.openxmlformats.org/drawingml/2006/main">
+              <a:graphicData uri="http://schemas.openxmlformats.org/drawingml/2006/picture">
+                <pic:pic xmlns:pic="http://schemas.openxmlformats.org/drawingml/2006/picture">
+                  <pic:nvPicPr>
+                    <pic:cNvPr id="0" name="" descr=""/>
+                    <pic:cNvPicPr>
+                      <a:picLocks noChangeAspect="1" noChangeArrowheads="1"/>
+                    </pic:cNvPicPr>
+                  </pic:nvPicPr>
+                  <pic:blipFill>
+                    <a:blip r:embed="rId26" cstate="none"/>
+                    <a:srcRect/>
+                    <a:stretch>
+                      <a:fillRect/>
+                    </a:stretch>
+                  </pic:blipFill>
+                  <pic:spPr bwMode="auto">
+                    <a:xfrm>
+                      <a:off x="0" y="0"/>
+                      <a:ext cx="5905500" cy="3333750"/>
+                    </a:xfrm>
+                    <a:prstGeom prst="rect">
+                      <a:avLst/>
+                    </a:prstGeom>
+                  </pic:spPr>
+                </pic:pic>
+              </a:graphicData>
+            </a:graphic>
+          </wp:inline>
+        </w:drawing>
+      </w:r>
+    </w:p>
+    <w:p>
+      <w:pPr>
+        <w:spacing w:after="80"/>
+      </w:pPr>
+    </w:p>
+    <w:p>
+      <w:pPr>
+        <w:spacing w:after="120" w:line="276"/>
+      </w:pPr>
+      <w:r>
+        <w:rPr>
+          <w:rFonts w:ascii="Arial" w:cs="Arial" w:eastAsia="Arial" w:hAnsi="Arial"/>
+          <w:sz w:val="22"/>
+          <w:szCs w:val="22"/>
+        </w:rPr>
+        <w:t xml:space="preserve">View the monthly attendance calendar for any employee or manager.</w:t>
+      </w:r>
+    </w:p>
+    <w:p>
+      <w:pPr>
+        <w:pStyle w:val="ListParagraph"/>
+        <w:numPr>
+          <w:ilvl w:val="0"/>
+          <w:numId w:val="3"/>
+        </w:numPr>
+        <w:spacing w:after="80"/>
+      </w:pPr>
+      <w:r>
+        <w:rPr>
+          <w:rFonts w:ascii="Arial" w:cs="Arial" w:eastAsia="Arial" w:hAnsi="Arial"/>
+          <w:sz w:val="22"/>
+          <w:szCs w:val="22"/>
+        </w:rPr>
+        <w:t xml:space="preserve">Select a person from the dropdown at the top</w:t>
+      </w:r>
+    </w:p>
+    <w:p>
+      <w:pPr>
+        <w:pStyle w:val="ListParagraph"/>
+        <w:numPr>
+          <w:ilvl w:val="0"/>
+          <w:numId w:val="3"/>
+        </w:numPr>
+        <w:spacing w:after="80"/>
+      </w:pPr>
+      <w:r>
+        <w:rPr>
+          <w:rFonts w:ascii="Arial" w:cs="Arial" w:eastAsia="Arial" w:hAnsi="Arial"/>
+          <w:sz w:val="22"/>
+          <w:szCs w:val="22"/>
+        </w:rPr>
+        <w:t xml:space="preserve">Navigate months using the arrows</w:t>
+      </w:r>
+    </w:p>
+    <w:p>
+      <w:pPr>
+        <w:pStyle w:val="ListParagraph"/>
+        <w:numPr>
+          <w:ilvl w:val="0"/>
+          <w:numId w:val="3"/>
+        </w:numPr>
+        <w:spacing w:after="80"/>
+      </w:pPr>
+      <w:r>
+        <w:rPr>
+          <w:rFonts w:ascii="Arial" w:cs="Arial" w:eastAsia="Arial" w:hAnsi="Arial"/>
+          <w:sz w:val="22"/>
+          <w:szCs w:val="22"/>
+        </w:rPr>
+        <w:t xml:space="preserve">Colour coding is the same as the personal calendar</w:t>
+      </w:r>
+    </w:p>
+    <w:p>
+      <w:pPr>
+        <w:pStyle w:val="Heading3"/>
+        <w:spacing w:after="80" w:before="220"/>
+      </w:pPr>
+      <w:r>
+        <w:rPr>
+          <w:rFonts w:ascii="Arial" w:cs="Arial" w:eastAsia="Arial" w:hAnsi="Arial"/>
+          <w:b/>
+          <w:bCs/>
+          <w:color w:val="374151"/>
+          <w:sz w:val="24"/>
+          <w:szCs w:val="24"/>
+        </w:rPr>
+        <w:t xml:space="preserve">System Config</w:t>
+      </w:r>
+    </w:p>
+    <w:p>
+      <w:pPr>
+        <w:spacing w:after="160" w:before="80"/>
+      </w:pPr>
+      <w:r>
+        <w:drawing>
+          <wp:inline distT="0" distB="0" distL="0" distR="0">
+            <wp:extent cx="5905500" cy="3333750"/>
+            <wp:effectExtent t="0" r="0" b="0" l="0"/>
+            <wp:docPr id="1" name="12-owner-config" descr="12-owner-config" title="12-owner-config"/>
+            <wp:cNvGraphicFramePr>
+              <a:graphicFrameLocks xmlns:a="http://schemas.openxmlformats.org/drawingml/2006/main" noChangeAspect="1"/>
+            </wp:cNvGraphicFramePr>
+            <a:graphic xmlns:a="http://schemas.openxmlformats.org/drawingml/2006/main">
+              <a:graphicData uri="http://schemas.openxmlformats.org/drawingml/2006/picture">
+                <pic:pic xmlns:pic="http://schemas.openxmlformats.org/drawingml/2006/picture">
+                  <pic:nvPicPr>
+                    <pic:cNvPr id="0" name="" descr=""/>
+                    <pic:cNvPicPr>
+                      <a:picLocks noChangeAspect="1" noChangeArrowheads="1"/>
+                    </pic:cNvPicPr>
+                  </pic:nvPicPr>
+                  <pic:blipFill>
+                    <a:blip r:embed="rId27" cstate="none"/>
+                    <a:srcRect/>
+                    <a:stretch>
+                      <a:fillRect/>
+                    </a:stretch>
+                  </pic:blipFill>
+                  <pic:spPr bwMode="auto">
+                    <a:xfrm>
+                      <a:off x="0" y="0"/>
+                      <a:ext cx="5905500" cy="3333750"/>
+                    </a:xfrm>
+                    <a:prstGeom prst="rect">
+                      <a:avLst/>
+                    </a:prstGeom>
+                  </pic:spPr>
+                </pic:pic>
+              </a:graphicData>
+            </a:graphic>
+          </wp:inline>
+        </w:drawing>
+      </w:r>
+    </w:p>
+    <w:p>
+      <w:pPr>
+        <w:spacing w:after="80"/>
+      </w:pPr>
+    </w:p>
+    <w:p>
+      <w:pPr>
+        <w:spacing w:after="120" w:line="276"/>
+      </w:pPr>
+      <w:r>
+        <w:rPr>
+          <w:rFonts w:ascii="Arial" w:cs="Arial" w:eastAsia="Arial" w:hAnsi="Arial"/>
+          <w:sz w:val="22"/>
+          <w:szCs w:val="22"/>
+        </w:rPr>
+        <w:t xml:space="preserve">Configure company-wide settings.</w:t>
+      </w:r>
+    </w:p>
+    <w:p>
+      <w:pPr>
+        <w:pStyle w:val="ListParagraph"/>
+        <w:numPr>
+          <w:ilvl w:val="0"/>
+          <w:numId w:val="3"/>
+        </w:numPr>
+        <w:spacing w:after="80"/>
+      </w:pPr>
+      <w:r>
+        <w:rPr>
+          <w:rFonts w:ascii="Arial" w:cs="Arial" w:eastAsia="Arial" w:hAnsi="Arial"/>
+          <w:sz w:val="22"/>
+          <w:szCs w:val="22"/>
+        </w:rPr>
+        <w:t xml:space="preserve">Annual Leave Days: how many leave days each employee gets per year</w:t>
+      </w:r>
+    </w:p>
+    <w:p>
+      <w:pPr>
+        <w:pStyle w:val="ListParagraph"/>
+        <w:numPr>
+          <w:ilvl w:val="0"/>
+          <w:numId w:val="3"/>
+        </w:numPr>
+        <w:spacing w:after="80"/>
+      </w:pPr>
+      <w:r>
+        <w:rPr>
+          <w:rFonts w:ascii="Arial" w:cs="Arial" w:eastAsia="Arial" w:hAnsi="Arial"/>
+          <w:sz w:val="22"/>
+          <w:szCs w:val="22"/>
+        </w:rPr>
+        <w:t xml:space="preserve">Employee Overtime Rate: hourly payout rate for employee overtime</w:t>
+      </w:r>
+    </w:p>
+    <w:p>
+      <w:pPr>
+        <w:pStyle w:val="ListParagraph"/>
+        <w:numPr>
+          <w:ilvl w:val="0"/>
+          <w:numId w:val="3"/>
+        </w:numPr>
+        <w:spacing w:after="80"/>
+      </w:pPr>
+      <w:r>
+        <w:rPr>
+          <w:rFonts w:ascii="Arial" w:cs="Arial" w:eastAsia="Arial" w:hAnsi="Arial"/>
+          <w:sz w:val="22"/>
+          <w:szCs w:val="22"/>
+        </w:rPr>
+        <w:t xml:space="preserve">Manager Overtime Rate: hourly payout rate for manager overtime</w:t>
+      </w:r>
+    </w:p>
+    <w:p>
+      <w:pPr>
+        <w:pStyle w:val="ListParagraph"/>
+        <w:numPr>
+          <w:ilvl w:val="0"/>
+          <w:numId w:val="3"/>
+        </w:numPr>
+        <w:spacing w:after="80"/>
+      </w:pPr>
+      <w:r>
+        <w:rPr>
+          <w:rFonts w:ascii="Arial" w:cs="Arial" w:eastAsia="Arial" w:hAnsi="Arial"/>
+          <w:sz w:val="22"/>
+          <w:szCs w:val="22"/>
+        </w:rPr>
+        <w:t xml:space="preserve">Holidays: add or remove public holidays — these dates are automatically blocked for timecards and leaves</w:t>
+      </w:r>
+    </w:p>
+    <w:p>
+      <w:pPr>
+        <w:pStyle w:val="ListParagraph"/>
+        <w:numPr>
+          <w:ilvl w:val="0"/>
+          <w:numId w:val="3"/>
+        </w:numPr>
+        <w:spacing w:after="80"/>
+      </w:pPr>
+      <w:r>
+        <w:rPr>
+          <w:rFonts w:ascii="Arial" w:cs="Arial" w:eastAsia="Arial" w:hAnsi="Arial"/>
+          <w:sz w:val="22"/>
+          <w:szCs w:val="22"/>
+        </w:rPr>
+        <w:t xml:space="preserve">Click Save after making changes</w:t>
+      </w:r>
+    </w:p>
+    <w:p>
+      <w:pPr>
+        <w:pStyle w:val="Heading3"/>
+        <w:spacing w:after="80" w:before="220"/>
+      </w:pPr>
+      <w:r>
+        <w:rPr>
+          <w:rFonts w:ascii="Arial" w:cs="Arial" w:eastAsia="Arial" w:hAnsi="Arial"/>
+          <w:b/>
+          <w:bCs/>
+          <w:color w:val="374151"/>
+          <w:sz w:val="24"/>
+          <w:szCs w:val="24"/>
+        </w:rPr>
+        <w:t xml:space="preserve">Payroll</w:t>
+      </w:r>
+    </w:p>
+    <w:p>
+      <w:pPr>
+        <w:spacing w:after="160" w:before="80"/>
+      </w:pPr>
+      <w:r>
+        <w:drawing>
+          <wp:inline distT="0" distB="0" distL="0" distR="0">
+            <wp:extent cx="5905500" cy="3333750"/>
+            <wp:effectExtent t="0" r="0" b="0" l="0"/>
+            <wp:docPr id="1" name="08-payroll" descr="08-payroll" title="08-payroll"/>
+            <wp:cNvGraphicFramePr>
+              <a:graphicFrameLocks xmlns:a="http://schemas.openxmlformats.org/drawingml/2006/main" noChangeAspect="1"/>
+            </wp:cNvGraphicFramePr>
+            <a:graphic xmlns:a="http://schemas.openxmlformats.org/drawingml/2006/main">
+              <a:graphicData uri="http://schemas.openxmlformats.org/drawingml/2006/picture">
+                <pic:pic xmlns:pic="http://schemas.openxmlformats.org/drawingml/2006/picture">
+                  <pic:nvPicPr>
+                    <pic:cNvPr id="0" name="" descr=""/>
+                    <pic:cNvPicPr>
+                      <a:picLocks noChangeAspect="1" noChangeArrowheads="1"/>
+                    </pic:cNvPicPr>
+                  </pic:nvPicPr>
+                  <pic:blipFill>
+                    <a:blip r:embed="rId20" cstate="none"/>
                     <a:srcRect/>
                     <a:stretch>
                       <a:fillRect/>

</xml_diff>